<commit_message>
docs: ticket-CRF, nuova interfaccia, pulsante di conferma, audit, guida di allineamento della produzione
Porting da irccs-docker (nessuna config di produzione toccata).

Co-Authored-By: Claude Sonnet 5.5 <noreply@anthropic.com>
Claude-Session: https://claude.ai/code/session_01W5dnSnBCBBsCVaL4WkEJHL
</commit_message>
<xml_diff>
--- a/docs/superpowers/specs/2026-10-25-ticket-crf-documento-funzionale-cliente.docx
+++ b/docs/superpowers/specs/2026-10-25-ticket-crf-documento-funzionale-cliente.docx
@@ -1487,13 +1487,111 @@
       </w:r>
     </w:p>
     <w:bookmarkEnd w:id="15"/>
-    <w:bookmarkStart w:id="16" w:name="il-blocco-della-conferma-e-la-deroga"/>
+    <w:bookmarkStart w:id="19" w:name="chiudere-un-ticket-e-confermare-una-crf"/>
     <w:p>
       <w:pPr>
         <w:pStyle w:val="Heading1"/>
       </w:pPr>
       <w:r>
-        <w:t xml:space="preserve">6. Il blocco della conferma e la deroga</w:t>
+        <w:t xml:space="preserve">6. Chiudere un ticket e confermare una CRF</w:t>
+      </w:r>
+    </w:p>
+    <w:p>
+      <w:pPr>
+        <w:pStyle w:val="FirstParagraph"/>
+      </w:pPr>
+      <w:r>
+        <w:t xml:space="preserve">Sono</w:t>
+      </w:r>
+      <w:r>
+        <w:t xml:space="preserve"> </w:t>
+      </w:r>
+      <w:r>
+        <w:rPr>
+          <w:b/>
+          <w:bCs/>
+        </w:rPr>
+        <w:t xml:space="preserve">due azioni distinte</w:t>
+      </w:r>
+      <w:r>
+        <w:t xml:space="preserve">, con regole proprie, che possono essere fatte da persone diverse: prima si chiude il ticket, poi si conferma la CRF.</w:t>
+      </w:r>
+    </w:p>
+    <w:p>
+      <w:pPr>
+        <w:pStyle w:val="SourceCode"/>
+      </w:pPr>
+      <w:r>
+        <w:rPr>
+          <w:rStyle w:val="VerbatimChar"/>
+        </w:rPr>
+        <w:t xml:space="preserve">ticket aperto  →  risposta del gruppo  →  chiusura del ticket</w:t>
+      </w:r>
+      <w:r>
+        <w:br/>
+      </w:r>
+      <w:r>
+        <w:rPr>
+          <w:rStyle w:val="VerbatimChar"/>
+        </w:rPr>
+        <w:t xml:space="preserve">                                               ↓</w:t>
+      </w:r>
+      <w:r>
+        <w:br/>
+      </w:r>
+      <w:r>
+        <w:rPr>
+          <w:rStyle w:val="VerbatimChar"/>
+        </w:rPr>
+        <w:t xml:space="preserve">                         ticket chiuso con il segno firmato della piattaforma</w:t>
+      </w:r>
+      <w:r>
+        <w:br/>
+      </w:r>
+      <w:r>
+        <w:rPr>
+          <w:rStyle w:val="VerbatimChar"/>
+        </w:rPr>
+        <w:t xml:space="preserve">                                               ↓</w:t>
+      </w:r>
+      <w:r>
+        <w:br/>
+      </w:r>
+      <w:r>
+        <w:rPr>
+          <w:rStyle w:val="VerbatimChar"/>
+        </w:rPr>
+        <w:t xml:space="preserve">                              conferma della CRF</w:t>
+      </w:r>
+    </w:p>
+    <w:bookmarkStart w:id="16" w:name="chiudere-un-ticket"/>
+    <w:p>
+      <w:pPr>
+        <w:pStyle w:val="Heading2"/>
+      </w:pPr>
+      <w:r>
+        <w:t xml:space="preserve">6.1 Chiudere un ticket</w:t>
+      </w:r>
+    </w:p>
+    <w:p>
+      <w:pPr>
+        <w:pStyle w:val="FirstParagraph"/>
+      </w:pPr>
+      <w:r>
+        <w:t xml:space="preserve">Servono</w:t>
+      </w:r>
+      <w:r>
+        <w:t xml:space="preserve"> </w:t>
+      </w:r>
+      <w:r>
+        <w:rPr>
+          <w:b/>
+          <w:bCs/>
+        </w:rPr>
+        <w:t xml:space="preserve">tre condizioni insieme</w:t>
+      </w:r>
+      <w:r>
+        <w:t xml:space="preserve">:</w:t>
       </w:r>
     </w:p>
     <w:p>
@@ -1505,23 +1603,17 @@
         </w:numPr>
       </w:pPr>
       <w:r>
-        <w:t xml:space="preserve">Con il blocco attivo, il pulsante</w:t>
-      </w:r>
-      <w:r>
-        <w:t xml:space="preserve"> </w:t>
-      </w:r>
-      <w:r>
-        <w:rPr>
-          <w:b/>
-          <w:bCs/>
-        </w:rPr>
-        <w:t xml:space="preserve">Conferma CRF</w:t>
-      </w:r>
-      <w:r>
-        <w:t xml:space="preserve"> </w:t>
-      </w:r>
-      <w:r>
-        <w:t xml:space="preserve">non funziona se la CRF ha ticket non chiusi: il sistema spiega quanti sono.</w:t>
+        <w:rPr>
+          <w:b/>
+          <w:bCs/>
+        </w:rPr>
+        <w:t xml:space="preserve">Il diritto di chiusura</w:t>
+      </w:r>
+      <w:r>
+        <w:t xml:space="preserve"> </w:t>
+      </w:r>
+      <w:r>
+        <w:t xml:space="preserve">nel proprio gruppo (assegnato ai gruppi autorizzati; su staging: Admins del centro e Farmacovigilanza).</w:t>
       </w:r>
     </w:p>
     <w:p>
@@ -1533,20 +1625,14 @@
         </w:numPr>
       </w:pPr>
       <w:r>
-        <w:t xml:space="preserve">Se il sistema di ticketing</w:t>
-      </w:r>
-      <w:r>
-        <w:t xml:space="preserve"> </w:t>
-      </w:r>
-      <w:r>
-        <w:rPr>
-          <w:b/>
-          <w:bCs/>
-        </w:rPr>
-        <w:t xml:space="preserve">non risponde</w:t>
-      </w:r>
-      <w:r>
-        <w:t xml:space="preserve">, la conferma è impossibile (per prudenza), salvo diversa scelta di configurazione.</w:t>
+        <w:rPr>
+          <w:b/>
+          <w:bCs/>
+        </w:rPr>
+        <w:t xml:space="preserve">Poter intervenire sul ticket</w:t>
+      </w:r>
+      <w:r>
+        <w:t xml:space="preserve">: averlo aperto, oppure appartenere al gruppo a cui è assegnato con diritto di modifica, oppure essere admin del centro. Chi può solo leggere il ticket non può chiuderlo.</w:t>
       </w:r>
     </w:p>
     <w:p>
@@ -1558,87 +1644,48 @@
         </w:numPr>
       </w:pPr>
       <w:r>
-        <w:t xml:space="preserve">La</w:t>
-      </w:r>
-      <w:r>
-        <w:t xml:space="preserve"> </w:t>
-      </w:r>
-      <w:r>
-        <w:rPr>
-          <w:b/>
-          <w:bCs/>
-        </w:rPr>
-        <w:t xml:space="preserve">deroga</w:t>
-      </w:r>
-      <w:r>
-        <w:t xml:space="preserve"> </w:t>
-      </w:r>
-      <w:r>
-        <w:t xml:space="preserve">consente a pochi responsabili di confermare comunque, con una</w:t>
-      </w:r>
-      <w:r>
-        <w:t xml:space="preserve"> </w:t>
-      </w:r>
-      <w:r>
-        <w:rPr>
-          <w:b/>
-          <w:bCs/>
-        </w:rPr>
-        <w:t xml:space="preserve">motivazione obbligatoria (10–500 caratteri)</w:t>
-      </w:r>
-      <w:r>
-        <w:t xml:space="preserve">. Ogni deroga è registrata in audit con motivazione, utente e ticket coinvolti; se l’audit non si registra, la deroga viene rifiutata. La motivazione non deve contenere dati identificativi del paziente.</w:t>
-      </w:r>
-    </w:p>
-    <w:p>
-      <w:pPr>
-        <w:pStyle w:val="Compact"/>
-        <w:numPr>
-          <w:ilvl w:val="0"/>
-          <w:numId w:val="1006"/>
-        </w:numPr>
-      </w:pPr>
-      <w:r>
-        <w:t xml:space="preserve">Il blocco vale anche per il completamento di una CRF da</w:t>
-      </w:r>
-      <w:r>
-        <w:t xml:space="preserve"> </w:t>
-      </w:r>
-      <w:r>
-        <w:rPr>
-          <w:b/>
-          <w:bCs/>
-        </w:rPr>
-        <w:t xml:space="preserve">link di compilazione</w:t>
-      </w:r>
-      <w:r>
-        <w:t xml:space="preserve"> </w:t>
-      </w:r>
-      <w:r>
-        <w:t xml:space="preserve">e per l’</w:t>
-      </w:r>
-      <w:r>
-        <w:rPr>
-          <w:b/>
-          <w:bCs/>
-        </w:rPr>
-        <w:t xml:space="preserve">import</w:t>
-      </w:r>
-      <w:r>
-        <w:t xml:space="preserve"> </w:t>
-      </w:r>
-      <w:r>
-        <w:t xml:space="preserve">di CRF già completate (queste ultime richiedono il diritto di conferma).</w:t>
+        <w:rPr>
+          <w:b/>
+          <w:bCs/>
+        </w:rPr>
+        <w:t xml:space="preserve">Una motivazione</w:t>
+      </w:r>
+      <w:r>
+        <w:t xml:space="preserve"> </w:t>
+      </w:r>
+      <w:r>
+        <w:t xml:space="preserve">di almeno 5 caratteri, che resta nella conversazione.</w:t>
+      </w:r>
+    </w:p>
+    <w:p>
+      <w:pPr>
+        <w:pStyle w:val="FirstParagraph"/>
+      </w:pPr>
+      <w:r>
+        <w:t xml:space="preserve">Chi non ha il diritto di chiusura (per esempio uno sperimentatore, anche se ha aperto lui il ticket) riceve un rifiuto. La chiusura vale per la CRF</w:t>
+      </w:r>
+      <w:r>
+        <w:t xml:space="preserve"> </w:t>
+      </w:r>
+      <w:r>
+        <w:rPr>
+          <w:b/>
+          <w:bCs/>
+        </w:rPr>
+        <w:t xml:space="preserve">solo se passa dalla piattaforma</w:t>
+      </w:r>
+      <w:r>
+        <w:t xml:space="preserve">: viene scritto sul ticket un segno di chiusura firmato. Una chiusura fatta direttamente nel sistema di ticketing non basta (vedi paragrafo 5).</w:t>
       </w:r>
     </w:p>
     <w:bookmarkEnd w:id="16"/>
-    <w:bookmarkStart w:id="17" w:name="esempi-provati-su-staging"/>
-    <w:p>
-      <w:pPr>
-        <w:pStyle w:val="Heading1"/>
-      </w:pPr>
-      <w:r>
-        <w:t xml:space="preserve">7. Esempi (provati su staging)</w:t>
+    <w:bookmarkStart w:id="17" w:name="confermare-una-crf"/>
+    <w:p>
+      <w:pPr>
+        <w:pStyle w:val="Heading2"/>
+      </w:pPr>
+      <w:r>
+        <w:t xml:space="preserve">6.2 Confermare una CRF</w:t>
       </w:r>
     </w:p>
     <w:p>
@@ -1646,81 +1693,20 @@
         <w:pStyle w:val="FirstParagraph"/>
       </w:pPr>
       <w:r>
-        <w:rPr>
-          <w:b/>
-          <w:bCs/>
-        </w:rPr>
-        <w:t xml:space="preserve">Esempio A — lo sperimentatore apre a Farmacovigilanza, che chiude.</w:t>
-      </w:r>
-      <w:r>
-        <w:t xml:space="preserve"> </w:t>
-      </w:r>
-      <w:r>
-        <w:t xml:space="preserve">Lo sperimentatore apre un ticket sulla CRF assegnandolo a Farmacovigilanza. La CRF è subito bloccata. Farmacovigilanza lo vede, risponde e lo chiude con una motivazione. Lo sperimentatore legge l’intera conversazione, non può chiudere il ticket lui stesso. A ticket chiuso la CRF si conferma.</w:t>
-      </w:r>
-    </w:p>
-    <w:p>
-      <w:pPr>
-        <w:pStyle w:val="BodyText"/>
-      </w:pPr>
-      <w:r>
-        <w:rPr>
-          <w:b/>
-          <w:bCs/>
-        </w:rPr>
-        <w:t xml:space="preserve">Esempio B — risponde e chiude anche l’admin del centro.</w:t>
-      </w:r>
-      <w:r>
-        <w:t xml:space="preserve"> </w:t>
-      </w:r>
-      <w:r>
-        <w:t xml:space="preserve">Stesso inizio. Dopo la risposta di Farmacovigilanza, l’admin del centro (che vede tutti i ticket del centro) legge la conversazione, aggiunge una risposta e chiude il ticket. La conversazione completa è visibile a tutti i soggetti coinvolti; l’admin conferma la CRF.</w:t>
-      </w:r>
-    </w:p>
-    <w:p>
-      <w:pPr>
-        <w:pStyle w:val="BodyText"/>
-      </w:pPr>
-      <w:r>
-        <w:rPr>
-          <w:b/>
-          <w:bCs/>
-        </w:rPr>
-        <w:t xml:space="preserve">Esempio C — due gruppi sulla stessa CRF.</w:t>
-      </w:r>
-      <w:r>
-        <w:t xml:space="preserve"> </w:t>
-      </w:r>
-      <w:r>
-        <w:t xml:space="preserve">L’admin apre due ticket sulla stessa CRF, uno a Sperimentatori e uno a Farmacovigilanza. Ogni gruppo vede solo il proprio ticket; l’admin li vede entrambi; la conferma resta bloccata finché tutti e due non sono chiusi.</w:t>
-      </w:r>
-    </w:p>
-    <w:p>
-      <w:pPr>
-        <w:pStyle w:val="BodyText"/>
-      </w:pPr>
-      <w:r>
-        <w:rPr>
-          <w:b/>
-          <w:bCs/>
-        </w:rPr>
-        <w:t xml:space="preserve">Esempio D — un utente di un altro gruppo.</w:t>
-      </w:r>
-      <w:r>
-        <w:t xml:space="preserve"> </w:t>
-      </w:r>
-      <w:r>
-        <w:t xml:space="preserve">Un utente di Farmacovigilanza non vede un ticket assegnato a Sperimentatori (anche se vede lo stesso paziente) e non può rispondere. Vede però che la conferma della CRF è bloccata da un ticket aperto.</w:t>
-      </w:r>
-    </w:p>
-    <w:bookmarkEnd w:id="17"/>
-    <w:bookmarkStart w:id="18" w:name="tracciabilità-e-sicurezza"/>
-    <w:p>
-      <w:pPr>
-        <w:pStyle w:val="Heading1"/>
-      </w:pPr>
-      <w:r>
-        <w:t xml:space="preserve">8. Tracciabilità e sicurezza</w:t>
+        <w:t xml:space="preserve">Servono</w:t>
+      </w:r>
+      <w:r>
+        <w:t xml:space="preserve"> </w:t>
+      </w:r>
+      <w:r>
+        <w:rPr>
+          <w:b/>
+          <w:bCs/>
+        </w:rPr>
+        <w:t xml:space="preserve">due condizioni</w:t>
+      </w:r>
+      <w:r>
+        <w:t xml:space="preserve">, controllate in quest’ordine:</w:t>
       </w:r>
     </w:p>
     <w:p>
@@ -1732,20 +1718,17 @@
         </w:numPr>
       </w:pPr>
       <w:r>
-        <w:t xml:space="preserve">Ogni apertura, risposta, chiusura, riapertura, convalida e deroga è</w:t>
-      </w:r>
-      <w:r>
-        <w:t xml:space="preserve"> </w:t>
-      </w:r>
-      <w:r>
-        <w:rPr>
-          <w:b/>
-          <w:bCs/>
-        </w:rPr>
-        <w:t xml:space="preserve">registrata in audit</w:t>
-      </w:r>
-      <w:r>
-        <w:t xml:space="preserve">.</w:t>
+        <w:rPr>
+          <w:b/>
+          <w:bCs/>
+        </w:rPr>
+        <w:t xml:space="preserve">Il diritto di conferma</w:t>
+      </w:r>
+      <w:r>
+        <w:t xml:space="preserve"> </w:t>
+      </w:r>
+      <w:r>
+        <w:t xml:space="preserve">nel proprio gruppo. Se manca, la conferma è rifiutata (su staging il diritto ce l’hanno gli Admins del centro; Sperimentatori e Farmacovigilanza no).</w:t>
       </w:r>
     </w:p>
     <w:p>
@@ -1757,63 +1740,38 @@
         </w:numPr>
       </w:pPr>
       <w:r>
-        <w:t xml:space="preserve">Il testo dei ticket resta nel sistema di ticketing: la piattaforma non ne tiene copia e, per il blocco, scambia solo numero e stato dei ticket.</w:t>
-      </w:r>
-    </w:p>
-    <w:p>
-      <w:pPr>
-        <w:pStyle w:val="Compact"/>
-        <w:numPr>
-          <w:ilvl w:val="0"/>
-          <w:numId w:val="1007"/>
-        </w:numPr>
-      </w:pPr>
-      <w:r>
-        <w:t xml:space="preserve">Le conversazioni sono mostrate come solo testo (niente HTML, script o indirizzi e-mail).</w:t>
-      </w:r>
-    </w:p>
-    <w:p>
-      <w:pPr>
-        <w:pStyle w:val="Compact"/>
-        <w:numPr>
-          <w:ilvl w:val="0"/>
-          <w:numId w:val="1007"/>
-        </w:numPr>
-      </w:pPr>
-      <w:r>
-        <w:t xml:space="preserve">I diritti di visibilità sono verificati dal server a ogni richiesta; se un controllo non è possibile, l’accesso è negato.</w:t>
-      </w:r>
-    </w:p>
-    <w:p>
-      <w:pPr>
-        <w:pStyle w:val="Compact"/>
-        <w:numPr>
-          <w:ilvl w:val="0"/>
-          <w:numId w:val="1007"/>
-        </w:numPr>
-      </w:pPr>
-      <w:r>
-        <w:t xml:space="preserve">Gli allegati (solo news di studio) sono verificati per tipo, contenuto e dimensione.</w:t>
-      </w:r>
-      <w:r>
-        <w:t xml:space="preserve"> </w:t>
-      </w:r>
-      <w:r>
-        <w:rPr>
-          <w:b/>
-          <w:bCs/>
-        </w:rPr>
-        <w:t xml:space="preserve">Non è attivo un antivirus sugli allegati.</w:t>
-      </w:r>
-    </w:p>
-    <w:bookmarkEnd w:id="18"/>
-    <w:bookmarkStart w:id="19" w:name="X3e39e6f22f3c8c14cee439c9d9349ed4bc17387"/>
-    <w:p>
-      <w:pPr>
-        <w:pStyle w:val="Heading1"/>
-      </w:pPr>
-      <w:r>
-        <w:t xml:space="preserve">9. Esiti delle prove su staging (24–25 ottobre 2026)</w:t>
+        <w:rPr>
+          <w:b/>
+          <w:bCs/>
+        </w:rPr>
+        <w:t xml:space="preserve">Nessun ticket di CRF bloccante.</w:t>
+      </w:r>
+      <w:r>
+        <w:t xml:space="preserve"> </w:t>
+      </w:r>
+      <w:r>
+        <w:t xml:space="preserve">Se ce n’è almeno uno, la conferma è rifiutata e il sistema indica quanti sono.</w:t>
+      </w:r>
+    </w:p>
+    <w:p>
+      <w:pPr>
+        <w:pStyle w:val="FirstParagraph"/>
+      </w:pPr>
+      <w:r>
+        <w:t xml:space="preserve">Quali ticket</w:t>
+      </w:r>
+      <w:r>
+        <w:t xml:space="preserve"> </w:t>
+      </w:r>
+      <w:r>
+        <w:rPr>
+          <w:b/>
+          <w:bCs/>
+        </w:rPr>
+        <w:t xml:space="preserve">bloccano</w:t>
+      </w:r>
+      <w:r>
+        <w:t xml:space="preserve">:</w:t>
       </w:r>
     </w:p>
     <w:tbl>
@@ -1838,18 +1796,18 @@
               <w:pStyle w:val="Compact"/>
             </w:pPr>
             <w:r>
-              <w:t xml:space="preserve">Prova</w:t>
-            </w:r>
-          </w:p>
-        </w:tc>
-        <w:tc>
-          <w:tcPr/>
-          <w:p>
-            <w:pPr>
-              <w:pStyle w:val="Compact"/>
-            </w:pPr>
-            <w:r>
-              <w:t xml:space="preserve">Esito</w:t>
+              <w:t xml:space="preserve">Stato del ticket</w:t>
+            </w:r>
+          </w:p>
+        </w:tc>
+        <w:tc>
+          <w:tcPr/>
+          <w:p>
+            <w:pPr>
+              <w:pStyle w:val="Compact"/>
+            </w:pPr>
+            <w:r>
+              <w:t xml:space="preserve">Blocca la conferma?</w:t>
             </w:r>
           </w:p>
         </w:tc>
@@ -1862,18 +1820,22 @@
               <w:pStyle w:val="Compact"/>
             </w:pPr>
             <w:r>
-              <w:t xml:space="preserve">Admin apre → sperimentatore risponde e corregge la CRF → admin chiude → conferma della CRF</w:t>
-            </w:r>
-          </w:p>
-        </w:tc>
-        <w:tc>
-          <w:tcPr/>
-          <w:p>
-            <w:pPr>
-              <w:pStyle w:val="Compact"/>
-            </w:pPr>
-            <w:r>
-              <w:t xml:space="preserve">25/25 controlli superati</w:t>
+              <w:t xml:space="preserve">Nuovo, aperto, in attesa</w:t>
+            </w:r>
+          </w:p>
+        </w:tc>
+        <w:tc>
+          <w:tcPr/>
+          <w:p>
+            <w:pPr>
+              <w:pStyle w:val="Compact"/>
+            </w:pPr>
+            <w:r>
+              <w:rPr>
+                <w:b/>
+                <w:bCs/>
+              </w:rPr>
+              <w:t xml:space="preserve">Sì</w:t>
             </w:r>
           </w:p>
         </w:tc>
@@ -1886,18 +1848,18 @@
               <w:pStyle w:val="Compact"/>
             </w:pPr>
             <w:r>
-              <w:t xml:space="preserve">Visibilità per gruppo (admin, due sperimentatori, farmacovigilanza; tre scenari più chiusura da parte di admin del centro)</w:t>
-            </w:r>
-          </w:p>
-        </w:tc>
-        <w:tc>
-          <w:tcPr/>
-          <w:p>
-            <w:pPr>
-              <w:pStyle w:val="Compact"/>
-            </w:pPr>
-            <w:r>
-              <w:t xml:space="preserve">42/42 controlli superati</w:t>
+              <w:t xml:space="preserve">Chiuso dalla piattaforma (con il segno firmato)</w:t>
+            </w:r>
+          </w:p>
+        </w:tc>
+        <w:tc>
+          <w:tcPr/>
+          <w:p>
+            <w:pPr>
+              <w:pStyle w:val="Compact"/>
+            </w:pPr>
+            <w:r>
+              <w:t xml:space="preserve">No</w:t>
             </w:r>
           </w:p>
         </w:tc>
@@ -1910,31 +1872,343 @@
               <w:pStyle w:val="Compact"/>
             </w:pPr>
             <w:r>
-              <w:t xml:space="preserve">Sperimentatore → Farmacovigilanza che chiude; stesso caso con risposta e chiusura anche dell’admin</w:t>
-            </w:r>
-          </w:p>
-        </w:tc>
-        <w:tc>
-          <w:tcPr/>
-          <w:p>
-            <w:pPr>
-              <w:pStyle w:val="Compact"/>
-            </w:pPr>
-            <w:r>
-              <w:t xml:space="preserve">33/33 controlli superati</w:t>
+              <w:t xml:space="preserve">Chiuso direttamente nel sistema di ticketing, senza convalida</w:t>
+            </w:r>
+          </w:p>
+        </w:tc>
+        <w:tc>
+          <w:tcPr/>
+          <w:p>
+            <w:pPr>
+              <w:pStyle w:val="Compact"/>
+            </w:pPr>
+            <w:r>
+              <w:rPr>
+                <w:b/>
+                <w:bCs/>
+              </w:rPr>
+              <w:t xml:space="preserve">Sì</w:t>
+            </w:r>
+            <w:r>
+              <w:t xml:space="preserve">, finché non viene convalidato</w:t>
+            </w:r>
+          </w:p>
+        </w:tc>
+      </w:tr>
+      <w:tr>
+        <w:tc>
+          <w:tcPr/>
+          <w:p>
+            <w:pPr>
+              <w:pStyle w:val="Compact"/>
+            </w:pPr>
+            <w:r>
+              <w:t xml:space="preserve">Unito a un altro ticket</w:t>
+            </w:r>
+          </w:p>
+        </w:tc>
+        <w:tc>
+          <w:tcPr/>
+          <w:p>
+            <w:pPr>
+              <w:pStyle w:val="Compact"/>
+            </w:pPr>
+            <w:r>
+              <w:t xml:space="preserve">No</w:t>
+            </w:r>
+          </w:p>
+        </w:tc>
+      </w:tr>
+      <w:tr>
+        <w:tc>
+          <w:tcPr/>
+          <w:p>
+            <w:pPr>
+              <w:pStyle w:val="Compact"/>
+            </w:pPr>
+            <w:r>
+              <w:t xml:space="preserve">News di studio</w:t>
+            </w:r>
+          </w:p>
+        </w:tc>
+        <w:tc>
+          <w:tcPr/>
+          <w:p>
+            <w:pPr>
+              <w:pStyle w:val="Compact"/>
+            </w:pPr>
+            <w:r>
+              <w:t xml:space="preserve">No, mai</w:t>
             </w:r>
           </w:p>
         </w:tc>
       </w:tr>
     </w:tbl>
+    <w:p>
+      <w:pPr>
+        <w:pStyle w:val="BodyText"/>
+      </w:pPr>
+      <w:r>
+        <w:t xml:space="preserve">Il blocco</w:t>
+      </w:r>
+      <w:r>
+        <w:t xml:space="preserve"> </w:t>
+      </w:r>
+      <w:r>
+        <w:rPr>
+          <w:b/>
+          <w:bCs/>
+        </w:rPr>
+        <w:t xml:space="preserve">vale per tutti</w:t>
+      </w:r>
+      <w:r>
+        <w:t xml:space="preserve">, anche per chi non vede il ticket: lo decide il server. Se il sistema di ticketing non risponde, la conferma non è possibile (si preferisce fermarsi piuttosto che confermare alla cieca).</w:t>
+      </w:r>
+    </w:p>
+    <w:bookmarkEnd w:id="17"/>
+    <w:bookmarkStart w:id="18" w:name="riepilogo-per-gruppo-staging"/>
+    <w:p>
+      <w:pPr>
+        <w:pStyle w:val="Heading2"/>
+      </w:pPr>
+      <w:r>
+        <w:t xml:space="preserve">6.3 Riepilogo per gruppo (staging)</w:t>
+      </w:r>
+    </w:p>
+    <w:tbl>
+      <w:tblPr>
+        <w:tblStyle w:val="Table"/>
+        <w:tblW w:type="pct" w:w="5000"/>
+        <w:tblLayout w:type="fixed"/>
+        <w:tblLook w:firstRow="1" w:lastRow="0" w:firstColumn="0" w:lastColumn="0" w:noHBand="0" w:noVBand="0" w:val="0020"/>
+      </w:tblPr>
+      <w:tblGrid>
+        <w:gridCol w:w="1980"/>
+        <w:gridCol w:w="1980"/>
+        <w:gridCol w:w="1980"/>
+        <w:gridCol w:w="1980"/>
+      </w:tblGrid>
+      <w:tr>
+        <w:trPr>
+          <w:tblHeader w:val="on"/>
+        </w:trPr>
+        <w:tc>
+          <w:tcPr/>
+          <w:p>
+            <w:pPr>
+              <w:pStyle w:val="Compact"/>
+            </w:pPr>
+            <w:r>
+              <w:t xml:space="preserve">Gruppo</w:t>
+            </w:r>
+          </w:p>
+        </w:tc>
+        <w:tc>
+          <w:tcPr/>
+          <w:p>
+            <w:pPr>
+              <w:pStyle w:val="Compact"/>
+            </w:pPr>
+            <w:r>
+              <w:t xml:space="preserve">Può chiudere un ticket</w:t>
+            </w:r>
+          </w:p>
+        </w:tc>
+        <w:tc>
+          <w:tcPr/>
+          <w:p>
+            <w:pPr>
+              <w:pStyle w:val="Compact"/>
+            </w:pPr>
+            <w:r>
+              <w:t xml:space="preserve">Può confermare una CRF</w:t>
+            </w:r>
+          </w:p>
+        </w:tc>
+        <w:tc>
+          <w:tcPr/>
+          <w:p>
+            <w:pPr>
+              <w:pStyle w:val="Compact"/>
+            </w:pPr>
+            <w:r>
+              <w:t xml:space="preserve">Un ticket aperto blocca la conferma</w:t>
+            </w:r>
+          </w:p>
+        </w:tc>
+      </w:tr>
+      <w:tr>
+        <w:tc>
+          <w:tcPr/>
+          <w:p>
+            <w:pPr>
+              <w:pStyle w:val="Compact"/>
+            </w:pPr>
+            <w:r>
+              <w:t xml:space="preserve">Sperimentatori</w:t>
+            </w:r>
+          </w:p>
+        </w:tc>
+        <w:tc>
+          <w:tcPr/>
+          <w:p>
+            <w:pPr>
+              <w:pStyle w:val="Compact"/>
+            </w:pPr>
+            <w:r>
+              <w:t xml:space="preserve">No</w:t>
+            </w:r>
+          </w:p>
+        </w:tc>
+        <w:tc>
+          <w:tcPr/>
+          <w:p>
+            <w:pPr>
+              <w:pStyle w:val="Compact"/>
+            </w:pPr>
+            <w:r>
+              <w:t xml:space="preserve">No</w:t>
+            </w:r>
+          </w:p>
+        </w:tc>
+        <w:tc>
+          <w:tcPr/>
+          <w:p>
+            <w:pPr>
+              <w:pStyle w:val="Compact"/>
+            </w:pPr>
+            <w:r>
+              <w:t xml:space="preserve">Sì</w:t>
+            </w:r>
+          </w:p>
+        </w:tc>
+      </w:tr>
+      <w:tr>
+        <w:tc>
+          <w:tcPr/>
+          <w:p>
+            <w:pPr>
+              <w:pStyle w:val="Compact"/>
+            </w:pPr>
+            <w:r>
+              <w:t xml:space="preserve">Farmacovigilanza</w:t>
+            </w:r>
+          </w:p>
+        </w:tc>
+        <w:tc>
+          <w:tcPr/>
+          <w:p>
+            <w:pPr>
+              <w:pStyle w:val="Compact"/>
+            </w:pPr>
+            <w:r>
+              <w:t xml:space="preserve">Sì</w:t>
+            </w:r>
+          </w:p>
+        </w:tc>
+        <w:tc>
+          <w:tcPr/>
+          <w:p>
+            <w:pPr>
+              <w:pStyle w:val="Compact"/>
+            </w:pPr>
+            <w:r>
+              <w:t xml:space="preserve">No</w:t>
+            </w:r>
+          </w:p>
+        </w:tc>
+        <w:tc>
+          <w:tcPr/>
+          <w:p>
+            <w:pPr>
+              <w:pStyle w:val="Compact"/>
+            </w:pPr>
+            <w:r>
+              <w:t xml:space="preserve">Sì</w:t>
+            </w:r>
+          </w:p>
+        </w:tc>
+      </w:tr>
+      <w:tr>
+        <w:tc>
+          <w:tcPr/>
+          <w:p>
+            <w:pPr>
+              <w:pStyle w:val="Compact"/>
+            </w:pPr>
+            <w:r>
+              <w:t xml:space="preserve">Admin del centro</w:t>
+            </w:r>
+          </w:p>
+        </w:tc>
+        <w:tc>
+          <w:tcPr/>
+          <w:p>
+            <w:pPr>
+              <w:pStyle w:val="Compact"/>
+            </w:pPr>
+            <w:r>
+              <w:t xml:space="preserve">Sì</w:t>
+            </w:r>
+          </w:p>
+        </w:tc>
+        <w:tc>
+          <w:tcPr/>
+          <w:p>
+            <w:pPr>
+              <w:pStyle w:val="Compact"/>
+            </w:pPr>
+            <w:r>
+              <w:t xml:space="preserve">Sì</w:t>
+            </w:r>
+          </w:p>
+        </w:tc>
+        <w:tc>
+          <w:tcPr/>
+          <w:p>
+            <w:pPr>
+              <w:pStyle w:val="Compact"/>
+            </w:pPr>
+            <w:r>
+              <w:t xml:space="preserve">Sì</w:t>
+            </w:r>
+          </w:p>
+        </w:tc>
+      </w:tr>
+    </w:tbl>
+    <w:p>
+      <w:pPr>
+        <w:pStyle w:val="BodyText"/>
+      </w:pPr>
+      <w:r>
+        <w:t xml:space="preserve">Chi ha il diritto di</w:t>
+      </w:r>
+      <w:r>
+        <w:t xml:space="preserve"> </w:t>
+      </w:r>
+      <w:r>
+        <w:rPr>
+          <w:b/>
+          <w:bCs/>
+        </w:rPr>
+        <w:t xml:space="preserve">deroga</w:t>
+      </w:r>
+      <w:r>
+        <w:t xml:space="preserve"> </w:t>
+      </w:r>
+      <w:r>
+        <w:t xml:space="preserve">può confermare anche con ticket aperti (paragrafo 7).</w:t>
+      </w:r>
+    </w:p>
+    <w:bookmarkEnd w:id="18"/>
     <w:bookmarkEnd w:id="19"/>
-    <w:bookmarkStart w:id="20" w:name="scelte-concordate-e-punti-da-ricordare"/>
+    <w:bookmarkStart w:id="20" w:name="il-blocco-della-conferma-e-la-deroga"/>
     <w:p>
       <w:pPr>
         <w:pStyle w:val="Heading1"/>
       </w:pPr>
       <w:r>
-        <w:t xml:space="preserve">10. Scelte concordate e punti da ricordare</w:t>
+        <w:t xml:space="preserve">7. Il blocco della conferma e la deroga</w:t>
       </w:r>
     </w:p>
     <w:p>
@@ -1946,23 +2220,52 @@
         </w:numPr>
       </w:pPr>
       <w:r>
-        <w:t xml:space="preserve">Gli</w:t>
-      </w:r>
-      <w:r>
-        <w:t xml:space="preserve"> </w:t>
-      </w:r>
-      <w:r>
-        <w:rPr>
-          <w:b/>
-          <w:bCs/>
-        </w:rPr>
-        <w:t xml:space="preserve">admin del centro vedono e chiudono tutti i ticket del centro</w:t>
-      </w:r>
-      <w:r>
-        <w:t xml:space="preserve"> </w:t>
-      </w:r>
-      <w:r>
-        <w:t xml:space="preserve">(decisione del cliente). Il diritto si assegna ai gruppi Admins di ogni centro.</w:t>
+        <w:t xml:space="preserve">Il pulsante</w:t>
+      </w:r>
+      <w:r>
+        <w:t xml:space="preserve"> </w:t>
+      </w:r>
+      <w:r>
+        <w:rPr>
+          <w:b/>
+          <w:bCs/>
+        </w:rPr>
+        <w:t xml:space="preserve">Conferma CRF</w:t>
+      </w:r>
+      <w:r>
+        <w:t xml:space="preserve"> </w:t>
+      </w:r>
+      <w:r>
+        <w:t xml:space="preserve">è</w:t>
+      </w:r>
+      <w:r>
+        <w:t xml:space="preserve"> </w:t>
+      </w:r>
+      <w:r>
+        <w:rPr>
+          <w:b/>
+          <w:bCs/>
+        </w:rPr>
+        <w:t xml:space="preserve">disabilitato</w:t>
+      </w:r>
+      <w:r>
+        <w:t xml:space="preserve"> </w:t>
+      </w:r>
+      <w:r>
+        <w:t xml:space="preserve">ogni volta che la conferma non è possibile: ci sono ticket non chiusi, oppure il sistema di ticketing non risponde, oppure la CRF si sta ancora salvando o importando. Sopra i pulsanti un avviso giallo spiega quanti ticket bloccano e quali. Chi ha il diritto di deroga vede accanto un secondo pulsante,</w:t>
+      </w:r>
+      <w:r>
+        <w:t xml:space="preserve"> </w:t>
+      </w:r>
+      <w:r>
+        <w:rPr>
+          <w:b/>
+          <w:bCs/>
+        </w:rPr>
+        <w:t xml:space="preserve">«Conferma con deroga…»</w:t>
+      </w:r>
+      <w:r>
+        <w:t xml:space="preserve">.</w:t>
       </w:r>
     </w:p>
     <w:p>
@@ -1974,17 +2277,23 @@
         </w:numPr>
       </w:pPr>
       <w:r>
-        <w:rPr>
-          <w:b/>
-          <w:bCs/>
-        </w:rPr>
-        <w:t xml:space="preserve">Farmacovigilanza</w:t>
-      </w:r>
-      <w:r>
-        <w:t xml:space="preserve"> </w:t>
-      </w:r>
-      <w:r>
-        <w:t xml:space="preserve">può chiudere i ticket.</w:t>
+        <w:t xml:space="preserve">Le regole di chi può chiudere e confermare sono nel paragrafo 6. Con il blocco attivo, il pulsante</w:t>
+      </w:r>
+      <w:r>
+        <w:t xml:space="preserve"> </w:t>
+      </w:r>
+      <w:r>
+        <w:rPr>
+          <w:b/>
+          <w:bCs/>
+        </w:rPr>
+        <w:t xml:space="preserve">Conferma CRF</w:t>
+      </w:r>
+      <w:r>
+        <w:t xml:space="preserve"> </w:t>
+      </w:r>
+      <w:r>
+        <w:t xml:space="preserve">non funziona se la CRF ha ticket non chiusi: il sistema spiega quanti sono.</w:t>
       </w:r>
     </w:p>
     <w:p>
@@ -1996,23 +2305,20 @@
         </w:numPr>
       </w:pPr>
       <w:r>
-        <w:t xml:space="preserve">Un</w:t>
-      </w:r>
-      <w:r>
-        <w:t xml:space="preserve"> </w:t>
-      </w:r>
-      <w:r>
-        <w:rPr>
-          <w:b/>
-          <w:bCs/>
-        </w:rPr>
-        <w:t xml:space="preserve">ticket «in attesa»</w:t>
-      </w:r>
-      <w:r>
-        <w:t xml:space="preserve"> </w:t>
-      </w:r>
-      <w:r>
-        <w:t xml:space="preserve">continua a bloccare la conferma; le notifiche e-mail le gestisce il sistema di ticketing.</w:t>
+        <w:t xml:space="preserve">Se il sistema di ticketing</w:t>
+      </w:r>
+      <w:r>
+        <w:t xml:space="preserve"> </w:t>
+      </w:r>
+      <w:r>
+        <w:rPr>
+          <w:b/>
+          <w:bCs/>
+        </w:rPr>
+        <w:t xml:space="preserve">non risponde</w:t>
+      </w:r>
+      <w:r>
+        <w:t xml:space="preserve">, la conferma è impossibile (per prudenza), salvo diversa scelta di configurazione.</w:t>
       </w:r>
     </w:p>
     <w:p>
@@ -2024,23 +2330,36 @@
         </w:numPr>
       </w:pPr>
       <w:r>
-        <w:t xml:space="preserve">Il blocco è</w:t>
-      </w:r>
-      <w:r>
-        <w:t xml:space="preserve"> </w:t>
-      </w:r>
-      <w:r>
-        <w:rPr>
-          <w:b/>
-          <w:bCs/>
-        </w:rPr>
-        <w:t xml:space="preserve">globale</w:t>
-      </w:r>
-      <w:r>
-        <w:t xml:space="preserve"> </w:t>
-      </w:r>
-      <w:r>
-        <w:t xml:space="preserve">(non per singolo studio).</w:t>
+        <w:t xml:space="preserve">La</w:t>
+      </w:r>
+      <w:r>
+        <w:t xml:space="preserve"> </w:t>
+      </w:r>
+      <w:r>
+        <w:rPr>
+          <w:b/>
+          <w:bCs/>
+        </w:rPr>
+        <w:t xml:space="preserve">deroga</w:t>
+      </w:r>
+      <w:r>
+        <w:t xml:space="preserve"> </w:t>
+      </w:r>
+      <w:r>
+        <w:t xml:space="preserve">consente a pochi responsabili di confermare comunque, con una</w:t>
+      </w:r>
+      <w:r>
+        <w:t xml:space="preserve"> </w:t>
+      </w:r>
+      <w:r>
+        <w:rPr>
+          <w:b/>
+          <w:bCs/>
+        </w:rPr>
+        <w:t xml:space="preserve">motivazione obbligatoria (10–500 caratteri)</w:t>
+      </w:r>
+      <w:r>
+        <w:t xml:space="preserve">. Ogni deroga è registrata in audit con motivazione, utente e ticket coinvolti; se l’audit non si registra, la deroga viene rifiutata. La motivazione non deve contenere dati identificativi del paziente.</w:t>
       </w:r>
     </w:p>
     <w:p>
@@ -2052,23 +2371,136 @@
         </w:numPr>
       </w:pPr>
       <w:r>
-        <w:t xml:space="preserve">Un ticket aperto o riaperto</w:t>
-      </w:r>
-      <w:r>
-        <w:t xml:space="preserve"> </w:t>
-      </w:r>
-      <w:r>
-        <w:rPr>
-          <w:b/>
-          <w:bCs/>
-        </w:rPr>
-        <w:t xml:space="preserve">direttamente nel sistema di ticketing</w:t>
-      </w:r>
-      <w:r>
-        <w:t xml:space="preserve"> </w:t>
-      </w:r>
-      <w:r>
-        <w:t xml:space="preserve">non riporta da confermare una CRF già confermata, perché la piattaforma non se ne accorge; se fatto dalla piattaforma sì.</w:t>
+        <w:t xml:space="preserve">Il blocco vale anche per il completamento di una CRF da</w:t>
+      </w:r>
+      <w:r>
+        <w:t xml:space="preserve"> </w:t>
+      </w:r>
+      <w:r>
+        <w:rPr>
+          <w:b/>
+          <w:bCs/>
+        </w:rPr>
+        <w:t xml:space="preserve">link di compilazione</w:t>
+      </w:r>
+      <w:r>
+        <w:t xml:space="preserve"> </w:t>
+      </w:r>
+      <w:r>
+        <w:t xml:space="preserve">e per l’</w:t>
+      </w:r>
+      <w:r>
+        <w:rPr>
+          <w:b/>
+          <w:bCs/>
+        </w:rPr>
+        <w:t xml:space="preserve">import</w:t>
+      </w:r>
+      <w:r>
+        <w:t xml:space="preserve"> </w:t>
+      </w:r>
+      <w:r>
+        <w:t xml:space="preserve">di CRF già completate (queste ultime richiedono il diritto di conferma).</w:t>
+      </w:r>
+    </w:p>
+    <w:bookmarkEnd w:id="20"/>
+    <w:bookmarkStart w:id="21" w:name="esempi-provati-su-staging"/>
+    <w:p>
+      <w:pPr>
+        <w:pStyle w:val="Heading1"/>
+      </w:pPr>
+      <w:r>
+        <w:t xml:space="preserve">8. Esempi (provati su staging)</w:t>
+      </w:r>
+    </w:p>
+    <w:p>
+      <w:pPr>
+        <w:pStyle w:val="FirstParagraph"/>
+      </w:pPr>
+      <w:r>
+        <w:rPr>
+          <w:b/>
+          <w:bCs/>
+        </w:rPr>
+        <w:t xml:space="preserve">Esempio A — lo sperimentatore apre a Farmacovigilanza, che chiude.</w:t>
+      </w:r>
+      <w:r>
+        <w:t xml:space="preserve"> </w:t>
+      </w:r>
+      <w:r>
+        <w:t xml:space="preserve">Lo sperimentatore apre un ticket sulla CRF assegnandolo a Farmacovigilanza. La CRF è subito bloccata. Farmacovigilanza lo vede, risponde e lo chiude con una motivazione. Lo sperimentatore legge l’intera conversazione, non può chiudere il ticket lui stesso. A ticket chiuso la CRF si conferma.</w:t>
+      </w:r>
+    </w:p>
+    <w:p>
+      <w:pPr>
+        <w:pStyle w:val="BodyText"/>
+      </w:pPr>
+      <w:r>
+        <w:rPr>
+          <w:b/>
+          <w:bCs/>
+        </w:rPr>
+        <w:t xml:space="preserve">Esempio B — risponde e chiude anche l’admin del centro.</w:t>
+      </w:r>
+      <w:r>
+        <w:t xml:space="preserve"> </w:t>
+      </w:r>
+      <w:r>
+        <w:t xml:space="preserve">Stesso inizio. Dopo la risposta di Farmacovigilanza, l’admin del centro (che vede tutti i ticket del centro) legge la conversazione, aggiunge una risposta e chiude il ticket. La conversazione completa è visibile a tutti i soggetti coinvolti; l’admin conferma la CRF.</w:t>
+      </w:r>
+    </w:p>
+    <w:p>
+      <w:pPr>
+        <w:pStyle w:val="BodyText"/>
+      </w:pPr>
+      <w:r>
+        <w:rPr>
+          <w:b/>
+          <w:bCs/>
+        </w:rPr>
+        <w:t xml:space="preserve">Esempio C — due gruppi sulla stessa CRF.</w:t>
+      </w:r>
+      <w:r>
+        <w:t xml:space="preserve"> </w:t>
+      </w:r>
+      <w:r>
+        <w:t xml:space="preserve">L’admin apre due ticket sulla stessa CRF, uno a Sperimentatori e uno a Farmacovigilanza. Ogni gruppo vede solo il proprio ticket; l’admin li vede entrambi; la conferma resta bloccata finché tutti e due non sono chiusi.</w:t>
+      </w:r>
+    </w:p>
+    <w:p>
+      <w:pPr>
+        <w:pStyle w:val="BodyText"/>
+      </w:pPr>
+      <w:r>
+        <w:rPr>
+          <w:b/>
+          <w:bCs/>
+        </w:rPr>
+        <w:t xml:space="preserve">Esempio D — un utente di un altro gruppo.</w:t>
+      </w:r>
+      <w:r>
+        <w:t xml:space="preserve"> </w:t>
+      </w:r>
+      <w:r>
+        <w:t xml:space="preserve">Un utente di Farmacovigilanza non vede un ticket assegnato a Sperimentatori (anche se vede lo stesso paziente) e non può rispondere. Vede però che la conferma della CRF è bloccata da un ticket aperto.</w:t>
+      </w:r>
+    </w:p>
+    <w:bookmarkEnd w:id="21"/>
+    <w:bookmarkStart w:id="22" w:name="le-schermate"/>
+    <w:p>
+      <w:pPr>
+        <w:pStyle w:val="Heading1"/>
+      </w:pPr>
+      <w:r>
+        <w:t xml:space="preserve">9. Le schermate</w:t>
+      </w:r>
+    </w:p>
+    <w:p>
+      <w:pPr>
+        <w:pStyle w:val="FirstParagraph"/>
+      </w:pPr>
+      <w:r>
+        <w:t xml:space="preserve">L’interfaccia si adatta al dispositivo: computer, tablet e telefono.</w:t>
       </w:r>
     </w:p>
     <w:p>
@@ -2076,27 +2508,86 @@
         <w:pStyle w:val="Compact"/>
         <w:numPr>
           <w:ilvl w:val="0"/>
-          <w:numId w:val="1008"/>
+          <w:numId w:val="1009"/>
         </w:numPr>
       </w:pPr>
       <w:r>
-        <w:t xml:space="preserve">Un ticket creato</w:t>
-      </w:r>
-      <w:r>
-        <w:t xml:space="preserve"> </w:t>
-      </w:r>
-      <w:r>
-        <w:rPr>
-          <w:b/>
-          <w:bCs/>
-        </w:rPr>
-        <w:t xml:space="preserve">direttamente nel sistema di ticketing</w:t>
-      </w:r>
-      <w:r>
-        <w:t xml:space="preserve"> </w:t>
-      </w:r>
-      <w:r>
-        <w:t xml:space="preserve">senza i riferimenti a paziente, ciclo e CRF non è visto dal blocco.</w:t>
+        <w:rPr>
+          <w:b/>
+          <w:bCs/>
+        </w:rPr>
+        <w:t xml:space="preserve">Pannello ticket nella CRF.</w:t>
+      </w:r>
+      <w:r>
+        <w:t xml:space="preserve"> </w:t>
+      </w:r>
+      <w:r>
+        <w:t xml:space="preserve">Si apre dal pulsante</w:t>
+      </w:r>
+      <w:r>
+        <w:t xml:space="preserve"> </w:t>
+      </w:r>
+      <w:r>
+        <w:rPr>
+          <w:i/>
+          <w:iCs/>
+        </w:rPr>
+        <w:t xml:space="preserve">Ticket</w:t>
+      </w:r>
+      <w:r>
+        <w:t xml:space="preserve"> </w:t>
+      </w:r>
+      <w:r>
+        <w:t xml:space="preserve">e mostra a sinistra i filtri (</w:t>
+      </w:r>
+      <w:r>
+        <w:rPr>
+          <w:b/>
+          <w:bCs/>
+        </w:rPr>
+        <w:t xml:space="preserve">Aperti</w:t>
+      </w:r>
+      <w:r>
+        <w:t xml:space="preserve">,</w:t>
+      </w:r>
+      <w:r>
+        <w:t xml:space="preserve"> </w:t>
+      </w:r>
+      <w:r>
+        <w:rPr>
+          <w:b/>
+          <w:bCs/>
+        </w:rPr>
+        <w:t xml:space="preserve">Tutti</w:t>
+      </w:r>
+      <w:r>
+        <w:t xml:space="preserve">,</w:t>
+      </w:r>
+      <w:r>
+        <w:t xml:space="preserve"> </w:t>
+      </w:r>
+      <w:r>
+        <w:rPr>
+          <w:b/>
+          <w:bCs/>
+        </w:rPr>
+        <w:t xml:space="preserve">Da convalidare</w:t>
+      </w:r>
+      <w:r>
+        <w:t xml:space="preserve">) con i conteggi, e sotto la conversazione del ticket scelto. Un pallino segnala i ticket con messaggi nuovi. Per ogni ticket si vede a che punto è:</w:t>
+      </w:r>
+      <w:r>
+        <w:t xml:space="preserve"> </w:t>
+      </w:r>
+      <w:r>
+        <w:rPr>
+          <w:b/>
+          <w:bCs/>
+        </w:rPr>
+        <w:t xml:space="preserve">Aperto → Preso in carico → Chiuso</w:t>
+      </w:r>
+      <w:r>
+        <w:t xml:space="preserve">. In basso si scrive la risposta e, per chi ha il diritto, si chiude il ticket con una motivazione. Sul telefono elenco e conversazione sono due pagine, con la freccia per tornare indietro.</w:t>
       </w:r>
     </w:p>
     <w:p>
@@ -2104,27 +2595,21 @@
         <w:pStyle w:val="Compact"/>
         <w:numPr>
           <w:ilvl w:val="0"/>
-          <w:numId w:val="1008"/>
+          <w:numId w:val="1009"/>
         </w:numPr>
       </w:pPr>
       <w:r>
-        <w:t xml:space="preserve">I ticket chiusi</w:t>
-      </w:r>
-      <w:r>
-        <w:t xml:space="preserve"> </w:t>
-      </w:r>
-      <w:r>
-        <w:rPr>
-          <w:b/>
-          <w:bCs/>
-        </w:rPr>
-        <w:t xml:space="preserve">prima</w:t>
-      </w:r>
-      <w:r>
-        <w:t xml:space="preserve"> </w:t>
-      </w:r>
-      <w:r>
-        <w:t xml:space="preserve">del 24 ottobre 2026 risultano «chiusi senza convalida» e vanno convalidati dal pannello.</w:t>
+        <w:rPr>
+          <w:b/>
+          <w:bCs/>
+        </w:rPr>
+        <w:t xml:space="preserve">Avviso «Conferma bloccata».</w:t>
+      </w:r>
+      <w:r>
+        <w:t xml:space="preserve"> </w:t>
+      </w:r>
+      <w:r>
+        <w:t xml:space="preserve">Sopra i pulsanti della CRF un riquadro giallo dice quanti ticket aperti impediscono la conferma e quali sono.</w:t>
       </w:r>
     </w:p>
     <w:p>
@@ -2132,14 +2617,604 @@
         <w:pStyle w:val="Compact"/>
         <w:numPr>
           <w:ilvl w:val="0"/>
-          <w:numId w:val="1008"/>
+          <w:numId w:val="1009"/>
         </w:numPr>
       </w:pPr>
       <w:r>
+        <w:rPr>
+          <w:b/>
+          <w:bCs/>
+        </w:rPr>
+        <w:t xml:space="preserve">Nuovo ticket.</w:t>
+      </w:r>
+      <w:r>
+        <w:t xml:space="preserve"> </w:t>
+      </w:r>
+      <w:r>
+        <w:t xml:space="preserve">Una sola finestra in tre passi: a quale gruppo inviarlo, la priorità, e cosa succede (con scorciatoie come «Dato incongruente» o «Chiarimento»). Ricorda in testa paziente, ciclo e CRF, e avvisa che la CRF resta non confermabile finché il ticket non è chiuso.</w:t>
+      </w:r>
+    </w:p>
+    <w:p>
+      <w:pPr>
+        <w:pStyle w:val="Compact"/>
+        <w:numPr>
+          <w:ilvl w:val="0"/>
+          <w:numId w:val="1009"/>
+        </w:numPr>
+      </w:pPr>
+      <w:r>
+        <w:rPr>
+          <w:b/>
+          <w:bCs/>
+        </w:rPr>
+        <w:t xml:space="preserve">I miei ticket.</w:t>
+      </w:r>
+      <w:r>
+        <w:t xml:space="preserve"> </w:t>
+      </w:r>
+      <w:r>
+        <w:t xml:space="preserve">Elenco di tutti i ticket dell’utente con filtri (</w:t>
+      </w:r>
+      <w:r>
+        <w:rPr>
+          <w:b/>
+          <w:bCs/>
+        </w:rPr>
+        <w:t xml:space="preserve">Aperti</w:t>
+      </w:r>
+      <w:r>
+        <w:t xml:space="preserve">,</w:t>
+      </w:r>
+      <w:r>
+        <w:t xml:space="preserve"> </w:t>
+      </w:r>
+      <w:r>
+        <w:rPr>
+          <w:b/>
+          <w:bCs/>
+        </w:rPr>
+        <w:t xml:space="preserve">Assegnati a me</w:t>
+      </w:r>
+      <w:r>
+        <w:t xml:space="preserve">,</w:t>
+      </w:r>
+      <w:r>
+        <w:t xml:space="preserve"> </w:t>
+      </w:r>
+      <w:r>
+        <w:rPr>
+          <w:b/>
+          <w:bCs/>
+        </w:rPr>
+        <w:t xml:space="preserve">Aperti da me</w:t>
+      </w:r>
+      <w:r>
+        <w:t xml:space="preserve">,</w:t>
+      </w:r>
+      <w:r>
+        <w:t xml:space="preserve"> </w:t>
+      </w:r>
+      <w:r>
+        <w:rPr>
+          <w:b/>
+          <w:bCs/>
+        </w:rPr>
+        <w:t xml:space="preserve">Da convalidare</w:t>
+      </w:r>
+      <w:r>
+        <w:t xml:space="preserve">,</w:t>
+      </w:r>
+      <w:r>
+        <w:t xml:space="preserve"> </w:t>
+      </w:r>
+      <w:r>
+        <w:rPr>
+          <w:b/>
+          <w:bCs/>
+        </w:rPr>
+        <w:t xml:space="preserve">Chiusi</w:t>
+      </w:r>
+      <w:r>
+        <w:t xml:space="preserve">) e ricerca. Su schermi larghi a destra c’è l’anteprima con gli ultimi messaggi e il pulsante</w:t>
+      </w:r>
+      <w:r>
+        <w:t xml:space="preserve"> </w:t>
+      </w:r>
+      <w:r>
+        <w:rPr>
+          <w:b/>
+          <w:bCs/>
+        </w:rPr>
+        <w:t xml:space="preserve">Apri la CRF</w:t>
+      </w:r>
+      <w:r>
+        <w:t xml:space="preserve">.</w:t>
+      </w:r>
+    </w:p>
+    <w:p>
+      <w:pPr>
+        <w:pStyle w:val="Compact"/>
+        <w:numPr>
+          <w:ilvl w:val="0"/>
+          <w:numId w:val="1009"/>
+        </w:numPr>
+      </w:pPr>
+      <w:r>
+        <w:rPr>
+          <w:b/>
+          <w:bCs/>
+        </w:rPr>
+        <w:t xml:space="preserve">Home del paziente.</w:t>
+      </w:r>
+      <w:r>
+        <w:t xml:space="preserve"> </w:t>
+      </w:r>
+      <w:r>
+        <w:t xml:space="preserve">In alto la fascia</w:t>
+      </w:r>
+      <w:r>
+        <w:t xml:space="preserve"> </w:t>
+      </w:r>
+      <w:r>
+        <w:rPr>
+          <w:b/>
+          <w:bCs/>
+        </w:rPr>
+        <w:t xml:space="preserve">Ticket da seguire</w:t>
+      </w:r>
+      <w:r>
+        <w:t xml:space="preserve">, con una carta per ogni ticket aperto e il pulsante per andare alla CRF.</w:t>
+      </w:r>
+    </w:p>
+    <w:p>
+      <w:pPr>
+        <w:pStyle w:val="Compact"/>
+        <w:numPr>
+          <w:ilvl w:val="0"/>
+          <w:numId w:val="1009"/>
+        </w:numPr>
+      </w:pPr>
+      <w:r>
+        <w:rPr>
+          <w:b/>
+          <w:bCs/>
+        </w:rPr>
+        <w:t xml:space="preserve">News di studio.</w:t>
+      </w:r>
+      <w:r>
+        <w:t xml:space="preserve"> </w:t>
+      </w:r>
+      <w:r>
+        <w:t xml:space="preserve">Una finestra con la comunicazione più recente aperta, con scadenza, priorità ed eventuali allegati.</w:t>
+      </w:r>
+    </w:p>
+    <w:bookmarkEnd w:id="22"/>
+    <w:bookmarkStart w:id="23" w:name="tracciabilità-e-sicurezza"/>
+    <w:p>
+      <w:pPr>
+        <w:pStyle w:val="Heading1"/>
+      </w:pPr>
+      <w:r>
+        <w:t xml:space="preserve">10. Tracciabilità e sicurezza</w:t>
+      </w:r>
+    </w:p>
+    <w:p>
+      <w:pPr>
+        <w:pStyle w:val="Compact"/>
+        <w:numPr>
+          <w:ilvl w:val="0"/>
+          <w:numId w:val="1010"/>
+        </w:numPr>
+      </w:pPr>
+      <w:r>
+        <w:t xml:space="preserve">Ogni apertura, risposta, chiusura, riapertura, convalida e deroga è</w:t>
+      </w:r>
+      <w:r>
+        <w:t xml:space="preserve"> </w:t>
+      </w:r>
+      <w:r>
+        <w:rPr>
+          <w:b/>
+          <w:bCs/>
+        </w:rPr>
+        <w:t xml:space="preserve">registrata in audit</w:t>
+      </w:r>
+      <w:r>
+        <w:t xml:space="preserve">: chi l’ha fatta, quando, da quale indirizzo, su quale ticket e con quale esito, anche quando l’accesso viene negato. Per la deroga si registra anche la motivazione; il testo di una chiusura resta nella conversazione del ticket.</w:t>
+      </w:r>
+    </w:p>
+    <w:p>
+      <w:pPr>
+        <w:pStyle w:val="Compact"/>
+        <w:numPr>
+          <w:ilvl w:val="0"/>
+          <w:numId w:val="1010"/>
+        </w:numPr>
+      </w:pPr>
+      <w:r>
+        <w:t xml:space="preserve">Il testo dei ticket resta nel sistema di ticketing: la piattaforma non ne tiene copia e, per il blocco, scambia solo numero e stato dei ticket.</w:t>
+      </w:r>
+    </w:p>
+    <w:p>
+      <w:pPr>
+        <w:pStyle w:val="Compact"/>
+        <w:numPr>
+          <w:ilvl w:val="0"/>
+          <w:numId w:val="1010"/>
+        </w:numPr>
+      </w:pPr>
+      <w:r>
+        <w:t xml:space="preserve">Le conversazioni sono mostrate come solo testo (niente HTML, script o indirizzi e-mail).</w:t>
+      </w:r>
+    </w:p>
+    <w:p>
+      <w:pPr>
+        <w:pStyle w:val="Compact"/>
+        <w:numPr>
+          <w:ilvl w:val="0"/>
+          <w:numId w:val="1010"/>
+        </w:numPr>
+      </w:pPr>
+      <w:r>
+        <w:t xml:space="preserve">I diritti di visibilità sono verificati dal server a ogni richiesta; se un controllo non è possibile, l’accesso è negato.</w:t>
+      </w:r>
+    </w:p>
+    <w:p>
+      <w:pPr>
+        <w:pStyle w:val="Compact"/>
+        <w:numPr>
+          <w:ilvl w:val="0"/>
+          <w:numId w:val="1010"/>
+        </w:numPr>
+      </w:pPr>
+      <w:r>
+        <w:t xml:space="preserve">Gli allegati (solo news di studio) sono verificati per tipo, contenuto e dimensione.</w:t>
+      </w:r>
+      <w:r>
+        <w:t xml:space="preserve"> </w:t>
+      </w:r>
+      <w:r>
+        <w:rPr>
+          <w:b/>
+          <w:bCs/>
+        </w:rPr>
+        <w:t xml:space="preserve">Non è attivo un antivirus sugli allegati.</w:t>
+      </w:r>
+    </w:p>
+    <w:bookmarkEnd w:id="23"/>
+    <w:bookmarkStart w:id="24" w:name="X3e39e6f22f3c8c14cee439c9d9349ed4bc17387"/>
+    <w:p>
+      <w:pPr>
+        <w:pStyle w:val="Heading1"/>
+      </w:pPr>
+      <w:r>
+        <w:t xml:space="preserve">11. Esiti delle prove su staging (24–25 ottobre 2026)</w:t>
+      </w:r>
+    </w:p>
+    <w:tbl>
+      <w:tblPr>
+        <w:tblStyle w:val="Table"/>
+        <w:tblW w:type="pct" w:w="5000"/>
+        <w:tblLayout w:type="fixed"/>
+        <w:tblLook w:firstRow="1" w:lastRow="0" w:firstColumn="0" w:lastColumn="0" w:noHBand="0" w:noVBand="0" w:val="0020"/>
+      </w:tblPr>
+      <w:tblGrid>
+        <w:gridCol w:w="3960"/>
+        <w:gridCol w:w="3960"/>
+      </w:tblGrid>
+      <w:tr>
+        <w:trPr>
+          <w:tblHeader w:val="on"/>
+        </w:trPr>
+        <w:tc>
+          <w:tcPr/>
+          <w:p>
+            <w:pPr>
+              <w:pStyle w:val="Compact"/>
+            </w:pPr>
+            <w:r>
+              <w:t xml:space="preserve">Prova</w:t>
+            </w:r>
+          </w:p>
+        </w:tc>
+        <w:tc>
+          <w:tcPr/>
+          <w:p>
+            <w:pPr>
+              <w:pStyle w:val="Compact"/>
+            </w:pPr>
+            <w:r>
+              <w:t xml:space="preserve">Esito</w:t>
+            </w:r>
+          </w:p>
+        </w:tc>
+      </w:tr>
+      <w:tr>
+        <w:tc>
+          <w:tcPr/>
+          <w:p>
+            <w:pPr>
+              <w:pStyle w:val="Compact"/>
+            </w:pPr>
+            <w:r>
+              <w:t xml:space="preserve">Admin apre → sperimentatore risponde e corregge la CRF → admin chiude → conferma della CRF</w:t>
+            </w:r>
+          </w:p>
+        </w:tc>
+        <w:tc>
+          <w:tcPr/>
+          <w:p>
+            <w:pPr>
+              <w:pStyle w:val="Compact"/>
+            </w:pPr>
+            <w:r>
+              <w:t xml:space="preserve">25/25 controlli superati</w:t>
+            </w:r>
+          </w:p>
+        </w:tc>
+      </w:tr>
+      <w:tr>
+        <w:tc>
+          <w:tcPr/>
+          <w:p>
+            <w:pPr>
+              <w:pStyle w:val="Compact"/>
+            </w:pPr>
+            <w:r>
+              <w:t xml:space="preserve">Visibilità per gruppo (admin, due sperimentatori, farmacovigilanza; tre scenari più chiusura da parte di admin del centro)</w:t>
+            </w:r>
+          </w:p>
+        </w:tc>
+        <w:tc>
+          <w:tcPr/>
+          <w:p>
+            <w:pPr>
+              <w:pStyle w:val="Compact"/>
+            </w:pPr>
+            <w:r>
+              <w:t xml:space="preserve">42/42 controlli superati</w:t>
+            </w:r>
+          </w:p>
+        </w:tc>
+      </w:tr>
+      <w:tr>
+        <w:tc>
+          <w:tcPr/>
+          <w:p>
+            <w:pPr>
+              <w:pStyle w:val="Compact"/>
+            </w:pPr>
+            <w:r>
+              <w:t xml:space="preserve">Sperimentatore → Farmacovigilanza che chiude; stesso caso con risposta e chiusura anche dell’admin</w:t>
+            </w:r>
+          </w:p>
+        </w:tc>
+        <w:tc>
+          <w:tcPr/>
+          <w:p>
+            <w:pPr>
+              <w:pStyle w:val="Compact"/>
+            </w:pPr>
+            <w:r>
+              <w:t xml:space="preserve">33/33 controlli superati</w:t>
+            </w:r>
+          </w:p>
+        </w:tc>
+      </w:tr>
+    </w:tbl>
+    <w:bookmarkEnd w:id="24"/>
+    <w:bookmarkStart w:id="25" w:name="scelte-concordate-e-punti-da-ricordare"/>
+    <w:p>
+      <w:pPr>
+        <w:pStyle w:val="Heading1"/>
+      </w:pPr>
+      <w:r>
+        <w:t xml:space="preserve">12. Scelte concordate e punti da ricordare</w:t>
+      </w:r>
+    </w:p>
+    <w:p>
+      <w:pPr>
+        <w:pStyle w:val="Compact"/>
+        <w:numPr>
+          <w:ilvl w:val="0"/>
+          <w:numId w:val="1011"/>
+        </w:numPr>
+      </w:pPr>
+      <w:r>
+        <w:t xml:space="preserve">Gli</w:t>
+      </w:r>
+      <w:r>
+        <w:t xml:space="preserve"> </w:t>
+      </w:r>
+      <w:r>
+        <w:rPr>
+          <w:b/>
+          <w:bCs/>
+        </w:rPr>
+        <w:t xml:space="preserve">admin del centro vedono e chiudono tutti i ticket del centro</w:t>
+      </w:r>
+      <w:r>
+        <w:t xml:space="preserve"> </w:t>
+      </w:r>
+      <w:r>
+        <w:t xml:space="preserve">(decisione del cliente). Il diritto si assegna ai gruppi Admins di ogni centro.</w:t>
+      </w:r>
+    </w:p>
+    <w:p>
+      <w:pPr>
+        <w:pStyle w:val="Compact"/>
+        <w:numPr>
+          <w:ilvl w:val="0"/>
+          <w:numId w:val="1011"/>
+        </w:numPr>
+      </w:pPr>
+      <w:r>
+        <w:rPr>
+          <w:b/>
+          <w:bCs/>
+        </w:rPr>
+        <w:t xml:space="preserve">Farmacovigilanza</w:t>
+      </w:r>
+      <w:r>
+        <w:t xml:space="preserve"> </w:t>
+      </w:r>
+      <w:r>
+        <w:t xml:space="preserve">può chiudere i ticket.</w:t>
+      </w:r>
+    </w:p>
+    <w:p>
+      <w:pPr>
+        <w:pStyle w:val="Compact"/>
+        <w:numPr>
+          <w:ilvl w:val="0"/>
+          <w:numId w:val="1011"/>
+        </w:numPr>
+      </w:pPr>
+      <w:r>
+        <w:t xml:space="preserve">Un</w:t>
+      </w:r>
+      <w:r>
+        <w:t xml:space="preserve"> </w:t>
+      </w:r>
+      <w:r>
+        <w:rPr>
+          <w:b/>
+          <w:bCs/>
+        </w:rPr>
+        <w:t xml:space="preserve">ticket «in attesa»</w:t>
+      </w:r>
+      <w:r>
+        <w:t xml:space="preserve"> </w:t>
+      </w:r>
+      <w:r>
+        <w:t xml:space="preserve">continua a bloccare la conferma; le notifiche e-mail le gestisce il sistema di ticketing.</w:t>
+      </w:r>
+    </w:p>
+    <w:p>
+      <w:pPr>
+        <w:pStyle w:val="Compact"/>
+        <w:numPr>
+          <w:ilvl w:val="0"/>
+          <w:numId w:val="1011"/>
+        </w:numPr>
+      </w:pPr>
+      <w:r>
+        <w:t xml:space="preserve">Il blocco è</w:t>
+      </w:r>
+      <w:r>
+        <w:t xml:space="preserve"> </w:t>
+      </w:r>
+      <w:r>
+        <w:rPr>
+          <w:b/>
+          <w:bCs/>
+        </w:rPr>
+        <w:t xml:space="preserve">globale</w:t>
+      </w:r>
+      <w:r>
+        <w:t xml:space="preserve"> </w:t>
+      </w:r>
+      <w:r>
+        <w:t xml:space="preserve">(non per singolo studio).</w:t>
+      </w:r>
+    </w:p>
+    <w:p>
+      <w:pPr>
+        <w:pStyle w:val="Compact"/>
+        <w:numPr>
+          <w:ilvl w:val="0"/>
+          <w:numId w:val="1011"/>
+        </w:numPr>
+      </w:pPr>
+      <w:r>
+        <w:t xml:space="preserve">Un ticket aperto o riaperto</w:t>
+      </w:r>
+      <w:r>
+        <w:t xml:space="preserve"> </w:t>
+      </w:r>
+      <w:r>
+        <w:rPr>
+          <w:b/>
+          <w:bCs/>
+        </w:rPr>
+        <w:t xml:space="preserve">direttamente nel sistema di ticketing</w:t>
+      </w:r>
+      <w:r>
+        <w:t xml:space="preserve"> </w:t>
+      </w:r>
+      <w:r>
+        <w:t xml:space="preserve">non riporta da confermare una CRF già confermata, perché la piattaforma non se ne accorge; se fatto dalla piattaforma sì.</w:t>
+      </w:r>
+    </w:p>
+    <w:p>
+      <w:pPr>
+        <w:pStyle w:val="Compact"/>
+        <w:numPr>
+          <w:ilvl w:val="0"/>
+          <w:numId w:val="1011"/>
+        </w:numPr>
+      </w:pPr>
+      <w:r>
+        <w:t xml:space="preserve">Un ticket creato</w:t>
+      </w:r>
+      <w:r>
+        <w:t xml:space="preserve"> </w:t>
+      </w:r>
+      <w:r>
+        <w:rPr>
+          <w:b/>
+          <w:bCs/>
+        </w:rPr>
+        <w:t xml:space="preserve">direttamente nel sistema di ticketing</w:t>
+      </w:r>
+      <w:r>
+        <w:t xml:space="preserve"> </w:t>
+      </w:r>
+      <w:r>
+        <w:t xml:space="preserve">senza i riferimenti a paziente, ciclo e CRF non è visto dal blocco.</w:t>
+      </w:r>
+    </w:p>
+    <w:p>
+      <w:pPr>
+        <w:pStyle w:val="Compact"/>
+        <w:numPr>
+          <w:ilvl w:val="0"/>
+          <w:numId w:val="1011"/>
+        </w:numPr>
+      </w:pPr>
+      <w:r>
+        <w:t xml:space="preserve">I ticket chiusi</w:t>
+      </w:r>
+      <w:r>
+        <w:t xml:space="preserve"> </w:t>
+      </w:r>
+      <w:r>
+        <w:rPr>
+          <w:b/>
+          <w:bCs/>
+        </w:rPr>
+        <w:t xml:space="preserve">prima</w:t>
+      </w:r>
+      <w:r>
+        <w:t xml:space="preserve"> </w:t>
+      </w:r>
+      <w:r>
+        <w:t xml:space="preserve">del 24 ottobre 2026 risultano «chiusi senza convalida» e vanno convalidati dal pannello.</w:t>
+      </w:r>
+    </w:p>
+    <w:p>
+      <w:pPr>
+        <w:pStyle w:val="Compact"/>
+        <w:numPr>
+          <w:ilvl w:val="0"/>
+          <w:numId w:val="1011"/>
+        </w:numPr>
+      </w:pPr>
+      <w:r>
         <w:t xml:space="preserve">Restano da definire con il cliente: chi è «l’assistenza» nel messaggio di manutenzione, le modalità di revisione periodica delle deroghe, la conservazione dei ticket chiusi e l’eventuale antivirus sugli allegati.</w:t>
       </w:r>
     </w:p>
-    <w:bookmarkEnd w:id="20"/>
+    <w:bookmarkEnd w:id="25"/>
     <w:sectPr>
       <w:footnotePr>
         <w:numRestart w:val="eachSect"/>
@@ -2511,12 +3586,75 @@
     </w:lvlOverride>
   </w:num>
   <w:num w:numId="1006">
+    <w:abstractNumId w:val="99411"/>
+    <w:lvlOverride w:ilvl="0">
+      <w:startOverride w:val="1"/>
+    </w:lvlOverride>
+    <w:lvlOverride w:ilvl="1">
+      <w:startOverride w:val="1"/>
+    </w:lvlOverride>
+    <w:lvlOverride w:ilvl="2">
+      <w:startOverride w:val="1"/>
+    </w:lvlOverride>
+    <w:lvlOverride w:ilvl="3">
+      <w:startOverride w:val="1"/>
+    </w:lvlOverride>
+    <w:lvlOverride w:ilvl="4">
+      <w:startOverride w:val="1"/>
+    </w:lvlOverride>
+    <w:lvlOverride w:ilvl="5">
+      <w:startOverride w:val="1"/>
+    </w:lvlOverride>
+    <w:lvlOverride w:ilvl="6">
+      <w:startOverride w:val="1"/>
+    </w:lvlOverride>
+    <w:lvlOverride w:ilvl="7">
+      <w:startOverride w:val="1"/>
+    </w:lvlOverride>
+    <w:lvlOverride w:ilvl="8">
+      <w:startOverride w:val="1"/>
+    </w:lvlOverride>
+  </w:num>
+  <w:num w:numId="1007">
+    <w:abstractNumId w:val="99411"/>
+    <w:lvlOverride w:ilvl="0">
+      <w:startOverride w:val="1"/>
+    </w:lvlOverride>
+    <w:lvlOverride w:ilvl="1">
+      <w:startOverride w:val="1"/>
+    </w:lvlOverride>
+    <w:lvlOverride w:ilvl="2">
+      <w:startOverride w:val="1"/>
+    </w:lvlOverride>
+    <w:lvlOverride w:ilvl="3">
+      <w:startOverride w:val="1"/>
+    </w:lvlOverride>
+    <w:lvlOverride w:ilvl="4">
+      <w:startOverride w:val="1"/>
+    </w:lvlOverride>
+    <w:lvlOverride w:ilvl="5">
+      <w:startOverride w:val="1"/>
+    </w:lvlOverride>
+    <w:lvlOverride w:ilvl="6">
+      <w:startOverride w:val="1"/>
+    </w:lvlOverride>
+    <w:lvlOverride w:ilvl="7">
+      <w:startOverride w:val="1"/>
+    </w:lvlOverride>
+    <w:lvlOverride w:ilvl="8">
+      <w:startOverride w:val="1"/>
+    </w:lvlOverride>
+  </w:num>
+  <w:num w:numId="1008">
     <w:abstractNumId w:val="991"/>
   </w:num>
-  <w:num w:numId="1007">
+  <w:num w:numId="1009">
     <w:abstractNumId w:val="991"/>
   </w:num>
-  <w:num w:numId="1008">
+  <w:num w:numId="1010">
+    <w:abstractNumId w:val="991"/>
+  </w:num>
+  <w:num w:numId="1011">
     <w:abstractNumId w:val="991"/>
   </w:num>
 </w:numbering>

</xml_diff>

<commit_message>
docs: audit e log dei ticket aggiornati, documento cliente rigenerato
Co-Authored-By: Claude Sonnet 5.5 <noreply@anthropic.com>
Claude-Session: https://claude.ai/code/session_01W5dnSnBCBBsCVaL4WkEJHL
</commit_message>
<xml_diff>
--- a/docs/superpowers/specs/2026-10-25-ticket-crf-documento-funzionale-cliente.docx
+++ b/docs/superpowers/specs/2026-10-25-ticket-crf-documento-funzionale-cliente.docx
@@ -2820,7 +2820,10 @@
         <w:t xml:space="preserve">registrata in audit</w:t>
       </w:r>
       <w:r>
-        <w:t xml:space="preserve">: chi l’ha fatta, quando, da quale indirizzo, su quale ticket e con quale esito, anche quando l’accesso viene negato. Per la deroga si registra anche la motivazione; il testo di una chiusura resta nella conversazione del ticket.</w:t>
+        <w:t xml:space="preserve"> </w:t>
+      </w:r>
+      <w:r>
+        <w:t xml:space="preserve">come evento a sé, con chi l’ha fatta, quando, da quale indirizzo, su quale ticket, su quale paziente e CRF, con quale esito; per chiusure, riaperture, convalide e deroghe anche la motivazione. Anche gli accessi negati e le conferme bloccate dai ticket (compreso il completamento da link) sono registrati. Se Zammad rifiuta la scrittura a nome dell’utente e la piattaforma la esegue con l’identità di servizio, ne resta traccia separata. Le consultazioni dei ticket di un paziente si ritrovano dall’audit.</w:t>
       </w:r>
     </w:p>
     <w:p>

</xml_diff>

<commit_message>
docs: «Conferma CRF» visibile solo a chi puo' confermare
Co-Authored-By: Claude Sonnet 5.5 <noreply@anthropic.com>
Claude-Session: https://claude.ai/code/session_01W5dnSnBCBBsCVaL4WkEJHL
</commit_message>
<xml_diff>
--- a/docs/superpowers/specs/2026-10-25-ticket-crf-documento-funzionale-cliente.docx
+++ b/docs/superpowers/specs/2026-10-25-ticket-crf-documento-funzionale-cliente.docx
@@ -2236,7 +2236,20 @@
         <w:t xml:space="preserve"> </w:t>
       </w:r>
       <w:r>
-        <w:t xml:space="preserve">è</w:t>
+        <w:t xml:space="preserve">lo</w:t>
+      </w:r>
+      <w:r>
+        <w:t xml:space="preserve"> </w:t>
+      </w:r>
+      <w:r>
+        <w:rPr>
+          <w:b/>
+          <w:bCs/>
+        </w:rPr>
+        <w:t xml:space="preserve">vedono solo i gruppi che hanno il diritto di conferma</w:t>
+      </w:r>
+      <w:r>
+        <w:t xml:space="preserve">: per gli altri gruppi non compare affatto (nemmeno grigio), e non vedono neppure l’avviso di conferma bloccata. Per chi lo vede, è</w:t>
       </w:r>
       <w:r>
         <w:t xml:space="preserve"> </w:t>

</xml_diff>

<commit_message>
docs: voce Ticket sulle CRF nel menu e documento funzionale con lo schema dell'architettura
Co-Authored-By: Claude Sonnet 5.5 <noreply@anthropic.com>
Claude-Session: https://claude.ai/code/session_014axR6CJanoKHGFA8RuSGoR
</commit_message>
<xml_diff>
--- a/docs/superpowers/specs/2026-10-25-ticket-crf-documento-funzionale-cliente.docx
+++ b/docs/superpowers/specs/2026-10-25-ticket-crf-documento-funzionale-cliente.docx
@@ -26,7 +26,7 @@
         <w:t xml:space="preserve">25 ottobre 2026</w:t>
       </w:r>
     </w:p>
-    <w:bookmarkStart w:id="9" w:name="scopo"/>
+    <w:bookmarkStart w:id="13" w:name="scopo"/>
     <w:p>
       <w:pPr>
         <w:pStyle w:val="Heading1"/>
@@ -98,8 +98,191 @@
         <w:t xml:space="preserve">Questo documento descrive come funzionano i ticket tra i diversi gruppi di utenti e nei diversi tipi di ticket, cosa vede e cosa può fare ciascuno, e quali prove sono state eseguite.</w:t>
       </w:r>
     </w:p>
-    <w:bookmarkEnd w:id="9"/>
-    <w:bookmarkStart w:id="11" w:name="le-tipologie-di-ticket"/>
+    <w:bookmarkStart w:id="12" w:name="architettura-in-breve"/>
+    <w:p>
+      <w:pPr>
+        <w:pStyle w:val="Heading2"/>
+      </w:pPr>
+      <w:r>
+        <w:t xml:space="preserve">1.1 Architettura in breve</w:t>
+      </w:r>
+    </w:p>
+    <w:p>
+      <w:pPr>
+        <w:pStyle w:val="FirstParagraph"/>
+      </w:pPr>
+      <w:r>
+        <w:t xml:space="preserve">Lo schema è in fondo al paragrafo.</w:t>
+      </w:r>
+    </w:p>
+    <w:p>
+      <w:pPr>
+        <w:pStyle w:val="Compact"/>
+        <w:numPr>
+          <w:ilvl w:val="0"/>
+          <w:numId w:val="1001"/>
+        </w:numPr>
+      </w:pPr>
+      <w:r>
+        <w:rPr>
+          <w:b/>
+          <w:bCs/>
+        </w:rPr>
+        <w:t xml:space="preserve">I testi dei ticket stanno solo in Zammad.</w:t>
+      </w:r>
+      <w:r>
+        <w:t xml:space="preserve"> </w:t>
+      </w:r>
+      <w:r>
+        <w:t xml:space="preserve">La piattaforma non ne tiene copia: tra i servizi circolano solo numero e stato dei ticket.</w:t>
+      </w:r>
+    </w:p>
+    <w:p>
+      <w:pPr>
+        <w:pStyle w:val="Compact"/>
+        <w:numPr>
+          <w:ilvl w:val="0"/>
+          <w:numId w:val="1001"/>
+        </w:numPr>
+      </w:pPr>
+      <w:r>
+        <w:rPr>
+          <w:b/>
+          <w:bCs/>
+        </w:rPr>
+        <w:t xml:space="preserve">Un solo servizio parla con Zammad</w:t>
+      </w:r>
+      <w:r>
+        <w:t xml:space="preserve"> </w:t>
+      </w:r>
+      <w:r>
+        <w:t xml:space="preserve">(Servizio Ticket). Verifica a ogni richiesta chi può vedere il paziente e il ticket; la dashboard non applica regole proprie.</w:t>
+      </w:r>
+    </w:p>
+    <w:p>
+      <w:pPr>
+        <w:pStyle w:val="Compact"/>
+        <w:numPr>
+          <w:ilvl w:val="0"/>
+          <w:numId w:val="1001"/>
+        </w:numPr>
+      </w:pPr>
+      <w:r>
+        <w:rPr>
+          <w:b/>
+          <w:bCs/>
+        </w:rPr>
+        <w:t xml:space="preserve">Il blocco della conferma</w:t>
+      </w:r>
+      <w:r>
+        <w:t xml:space="preserve"> </w:t>
+      </w:r>
+      <w:r>
+        <w:t xml:space="preserve">è nel Servizio Studio clinico, che chiede al Servizio Ticket se ci sono ticket aperti sulla CRF.</w:t>
+      </w:r>
+    </w:p>
+    <w:p>
+      <w:pPr>
+        <w:pStyle w:val="Compact"/>
+        <w:numPr>
+          <w:ilvl w:val="0"/>
+          <w:numId w:val="1001"/>
+        </w:numPr>
+      </w:pPr>
+      <w:r>
+        <w:rPr>
+          <w:b/>
+          <w:bCs/>
+        </w:rPr>
+        <w:t xml:space="preserve">Sull’archivio clinico (FHIR)</w:t>
+      </w:r>
+      <w:r>
+        <w:t xml:space="preserve"> </w:t>
+      </w:r>
+      <w:r>
+        <w:t xml:space="preserve">i ticket leggono paziente, centro, ciclo e questionario. L’unica risorsa clinica modificata è la compilazione del questionario: se la CRF era già confermata, aprire o riaprire un ticket la riporta «da confermare». Ogni azione sui ticket crea un evento nel registro di audit.</w:t>
+      </w:r>
+    </w:p>
+    <w:p>
+      <w:pPr>
+        <w:pStyle w:val="Compact"/>
+        <w:numPr>
+          <w:ilvl w:val="0"/>
+          <w:numId w:val="1001"/>
+        </w:numPr>
+      </w:pPr>
+      <w:r>
+        <w:rPr>
+          <w:b/>
+          <w:bCs/>
+        </w:rPr>
+        <w:t xml:space="preserve">Utenti, gruppi e permessi</w:t>
+      </w:r>
+      <w:r>
+        <w:t xml:space="preserve"> </w:t>
+      </w:r>
+      <w:r>
+        <w:t xml:space="preserve">vengono da Keycloak e sono allineati periodicamente a Zammad.</w:t>
+      </w:r>
+    </w:p>
+    <w:p>
+      <w:pPr>
+        <w:pStyle w:val="CaptionedFigure"/>
+      </w:pPr>
+      <w:r>
+        <w:drawing>
+          <wp:inline>
+            <wp:extent cx="5334000" cy="3413760"/>
+            <wp:effectExtent b="0" l="0" r="0" t="0"/>
+            <wp:docPr descr="Architettura dei ticket sulle CRF" title="" id="10" name="Picture"/>
+            <a:graphic>
+              <a:graphicData uri="http://schemas.openxmlformats.org/drawingml/2006/picture">
+                <pic:pic>
+                  <pic:nvPicPr>
+                    <pic:cNvPr descr="img/ticket-crf-architettura.png" id="11" name="Picture"/>
+                    <pic:cNvPicPr>
+                      <a:picLocks noChangeArrowheads="1" noChangeAspect="1"/>
+                    </pic:cNvPicPr>
+                  </pic:nvPicPr>
+                  <pic:blipFill>
+                    <a:blip r:embed="rId9"/>
+                    <a:stretch>
+                      <a:fillRect/>
+                    </a:stretch>
+                  </pic:blipFill>
+                  <pic:spPr bwMode="auto">
+                    <a:xfrm>
+                      <a:off x="0" y="0"/>
+                      <a:ext cx="5334000" cy="3413760"/>
+                    </a:xfrm>
+                    <a:prstGeom prst="rect">
+                      <a:avLst/>
+                    </a:prstGeom>
+                    <a:noFill/>
+                    <a:ln w="9525">
+                      <a:noFill/>
+                      <a:headEnd/>
+                      <a:tailEnd/>
+                    </a:ln>
+                  </pic:spPr>
+                </pic:pic>
+              </a:graphicData>
+            </a:graphic>
+          </wp:inline>
+        </w:drawing>
+      </w:r>
+    </w:p>
+    <w:p>
+      <w:pPr>
+        <w:pStyle w:val="ImageCaption"/>
+      </w:pPr>
+      <w:r>
+        <w:t xml:space="preserve">Architettura dei ticket sulle CRF</w:t>
+      </w:r>
+    </w:p>
+    <w:bookmarkEnd w:id="12"/>
+    <w:bookmarkEnd w:id="13"/>
+    <w:bookmarkStart w:id="15" w:name="le-tipologie-di-ticket"/>
     <w:p>
       <w:pPr>
         <w:pStyle w:val="Heading1"/>
@@ -492,7 +675,7 @@
         <w:t xml:space="preserve">(compresi i diari): non hanno ticket né il pulsante «Conferma CRF».</w:t>
       </w:r>
     </w:p>
-    <w:bookmarkStart w:id="10" w:name="stati-di-un-ticket"/>
+    <w:bookmarkStart w:id="14" w:name="stati-di-un-ticket"/>
     <w:p>
       <w:pPr>
         <w:pStyle w:val="Heading2"/>
@@ -506,7 +689,7 @@
         <w:pStyle w:val="Compact"/>
         <w:numPr>
           <w:ilvl w:val="0"/>
-          <w:numId w:val="1001"/>
+          <w:numId w:val="1002"/>
         </w:numPr>
       </w:pPr>
       <w:r>
@@ -541,7 +724,7 @@
         <w:pStyle w:val="Compact"/>
         <w:numPr>
           <w:ilvl w:val="0"/>
-          <w:numId w:val="1001"/>
+          <w:numId w:val="1002"/>
         </w:numPr>
       </w:pPr>
       <w:r>
@@ -576,7 +759,7 @@
         <w:pStyle w:val="Compact"/>
         <w:numPr>
           <w:ilvl w:val="0"/>
-          <w:numId w:val="1001"/>
+          <w:numId w:val="1002"/>
         </w:numPr>
       </w:pPr>
       <w:r>
@@ -593,9 +776,9 @@
         <w:t xml:space="preserve">ad un altro ticket: non blocca.</w:t>
       </w:r>
     </w:p>
-    <w:bookmarkEnd w:id="10"/>
-    <w:bookmarkEnd w:id="11"/>
-    <w:bookmarkStart w:id="12" w:name="gruppi-e-ruoli"/>
+    <w:bookmarkEnd w:id="14"/>
+    <w:bookmarkEnd w:id="15"/>
+    <w:bookmarkStart w:id="16" w:name="gruppi-e-ruoli"/>
     <w:p>
       <w:pPr>
         <w:pStyle w:val="Heading1"/>
@@ -980,8 +1163,8 @@
         <w:t xml:space="preserve">se il suo gruppo non ha quel diritto.</w:t>
       </w:r>
     </w:p>
-    <w:bookmarkEnd w:id="12"/>
-    <w:bookmarkStart w:id="14" w:name="chi-vede-un-ticket-di-crf"/>
+    <w:bookmarkEnd w:id="16"/>
+    <w:bookmarkStart w:id="18" w:name="chi-vede-un-ticket-di-crf"/>
     <w:p>
       <w:pPr>
         <w:pStyle w:val="Heading1"/>
@@ -1012,93 +1195,6 @@
       </w:r>
       <w:r>
         <w:t xml:space="preserve">le condizioni:</w:t>
-      </w:r>
-    </w:p>
-    <w:p>
-      <w:pPr>
-        <w:pStyle w:val="Compact"/>
-        <w:numPr>
-          <w:ilvl w:val="0"/>
-          <w:numId w:val="1002"/>
-        </w:numPr>
-      </w:pPr>
-      <w:r>
-        <w:t xml:space="preserve">l’utente</w:t>
-      </w:r>
-      <w:r>
-        <w:t xml:space="preserve"> </w:t>
-      </w:r>
-      <w:r>
-        <w:rPr>
-          <w:b/>
-          <w:bCs/>
-        </w:rPr>
-        <w:t xml:space="preserve">vede il paziente</w:t>
-      </w:r>
-      <w:r>
-        <w:t xml:space="preserve"> </w:t>
-      </w:r>
-      <w:r>
-        <w:t xml:space="preserve">nella piattaforma (nel suo centro/contesto);</w:t>
-      </w:r>
-    </w:p>
-    <w:p>
-      <w:pPr>
-        <w:pStyle w:val="Compact"/>
-        <w:numPr>
-          <w:ilvl w:val="0"/>
-          <w:numId w:val="1002"/>
-        </w:numPr>
-      </w:pPr>
-      <w:r>
-        <w:t xml:space="preserve">l’utente</w:t>
-      </w:r>
-      <w:r>
-        <w:t xml:space="preserve"> </w:t>
-      </w:r>
-      <w:r>
-        <w:rPr>
-          <w:b/>
-          <w:bCs/>
-        </w:rPr>
-        <w:t xml:space="preserve">ha a che fare col ticket</w:t>
-      </w:r>
-      <w:r>
-        <w:t xml:space="preserve">: l’ha aperto lui, oppure appartiene al</w:t>
-      </w:r>
-      <w:r>
-        <w:t xml:space="preserve"> </w:t>
-      </w:r>
-      <w:r>
-        <w:rPr>
-          <w:b/>
-          <w:bCs/>
-        </w:rPr>
-        <w:t xml:space="preserve">gruppo a cui il ticket è assegnato</w:t>
-      </w:r>
-      <w:r>
-        <w:t xml:space="preserve">, oppure è</w:t>
-      </w:r>
-      <w:r>
-        <w:t xml:space="preserve"> </w:t>
-      </w:r>
-      <w:r>
-        <w:rPr>
-          <w:b/>
-          <w:bCs/>
-        </w:rPr>
-        <w:t xml:space="preserve">admin del centro</w:t>
-      </w:r>
-      <w:r>
-        <w:t xml:space="preserve">.</w:t>
-      </w:r>
-    </w:p>
-    <w:p>
-      <w:pPr>
-        <w:pStyle w:val="FirstParagraph"/>
-      </w:pPr>
-      <w:r>
-        <w:t xml:space="preserve">Conseguenze:</w:t>
       </w:r>
     </w:p>
     <w:p>
@@ -1110,23 +1206,23 @@
         </w:numPr>
       </w:pPr>
       <w:r>
-        <w:t xml:space="preserve">Un ticket assegnato a Farmacovigilanza è visto da Farmacovigilanza, da chi lo ha aperto e dagli admin del centro.</w:t>
-      </w:r>
-      <w:r>
-        <w:t xml:space="preserve"> </w:t>
-      </w:r>
-      <w:r>
-        <w:rPr>
-          <w:b/>
-          <w:bCs/>
-        </w:rPr>
-        <w:t xml:space="preserve">Non</w:t>
-      </w:r>
-      <w:r>
-        <w:t xml:space="preserve"> </w:t>
-      </w:r>
-      <w:r>
-        <w:t xml:space="preserve">è visto dagli altri sperimentatori, anche se vedono lo stesso paziente.</w:t>
+        <w:t xml:space="preserve">l’utente</w:t>
+      </w:r>
+      <w:r>
+        <w:t xml:space="preserve"> </w:t>
+      </w:r>
+      <w:r>
+        <w:rPr>
+          <w:b/>
+          <w:bCs/>
+        </w:rPr>
+        <w:t xml:space="preserve">vede il paziente</w:t>
+      </w:r>
+      <w:r>
+        <w:t xml:space="preserve"> </w:t>
+      </w:r>
+      <w:r>
+        <w:t xml:space="preserve">nella piattaforma (nel suo centro/contesto);</w:t>
       </w:r>
     </w:p>
     <w:p>
@@ -1138,41 +1234,54 @@
         </w:numPr>
       </w:pPr>
       <w:r>
-        <w:t xml:space="preserve">Chi non lo vede non può nemmeno rispondere, chiudere o riaprire.</w:t>
-      </w:r>
-    </w:p>
-    <w:p>
-      <w:pPr>
-        <w:pStyle w:val="Compact"/>
-        <w:numPr>
-          <w:ilvl w:val="0"/>
-          <w:numId w:val="1003"/>
-        </w:numPr>
-      </w:pPr>
-      <w:r>
-        <w:t xml:space="preserve">Il</w:t>
-      </w:r>
-      <w:r>
-        <w:t xml:space="preserve"> </w:t>
-      </w:r>
-      <w:r>
-        <w:rPr>
-          <w:b/>
-          <w:bCs/>
-        </w:rPr>
-        <w:t xml:space="preserve">blocco della conferma vale per tutti</w:t>
-      </w:r>
-      <w:r>
-        <w:t xml:space="preserve">: se una CRF ha un ticket aperto, nessuno la conferma, anche chi non vede il ticket. A chi non lo vede il sistema comunica solo che ci sono ticket aperti (numero e stato), senza titolo né testo.</w:t>
-      </w:r>
-    </w:p>
-    <w:bookmarkStart w:id="13" w:name="assegnazione-a-uno-o-più-gruppi"/>
-    <w:p>
-      <w:pPr>
-        <w:pStyle w:val="Heading2"/>
-      </w:pPr>
-      <w:r>
-        <w:t xml:space="preserve">Assegnazione a uno o più gruppi</w:t>
+        <w:t xml:space="preserve">l’utente</w:t>
+      </w:r>
+      <w:r>
+        <w:t xml:space="preserve"> </w:t>
+      </w:r>
+      <w:r>
+        <w:rPr>
+          <w:b/>
+          <w:bCs/>
+        </w:rPr>
+        <w:t xml:space="preserve">ha a che fare col ticket</w:t>
+      </w:r>
+      <w:r>
+        <w:t xml:space="preserve">: l’ha aperto lui, oppure appartiene al</w:t>
+      </w:r>
+      <w:r>
+        <w:t xml:space="preserve"> </w:t>
+      </w:r>
+      <w:r>
+        <w:rPr>
+          <w:b/>
+          <w:bCs/>
+        </w:rPr>
+        <w:t xml:space="preserve">gruppo a cui il ticket è assegnato</w:t>
+      </w:r>
+      <w:r>
+        <w:t xml:space="preserve">, oppure è</w:t>
+      </w:r>
+      <w:r>
+        <w:t xml:space="preserve"> </w:t>
+      </w:r>
+      <w:r>
+        <w:rPr>
+          <w:b/>
+          <w:bCs/>
+        </w:rPr>
+        <w:t xml:space="preserve">admin del centro</w:t>
+      </w:r>
+      <w:r>
+        <w:t xml:space="preserve">.</w:t>
+      </w:r>
+    </w:p>
+    <w:p>
+      <w:pPr>
+        <w:pStyle w:val="FirstParagraph"/>
+      </w:pPr>
+      <w:r>
+        <w:t xml:space="preserve">Conseguenze:</w:t>
       </w:r>
     </w:p>
     <w:p>
@@ -1184,36 +1293,23 @@
         </w:numPr>
       </w:pPr>
       <w:r>
-        <w:t xml:space="preserve">Ogni ticket di CRF è assegnato a</w:t>
-      </w:r>
-      <w:r>
-        <w:t xml:space="preserve"> </w:t>
-      </w:r>
-      <w:r>
-        <w:rPr>
-          <w:b/>
-          <w:bCs/>
-        </w:rPr>
-        <w:t xml:space="preserve">un solo gruppo</w:t>
-      </w:r>
-      <w:r>
-        <w:t xml:space="preserve">, da scegliere tra i gruppi</w:t>
-      </w:r>
-      <w:r>
-        <w:t xml:space="preserve"> </w:t>
-      </w:r>
-      <w:r>
-        <w:rPr>
-          <w:b/>
-          <w:bCs/>
-        </w:rPr>
-        <w:t xml:space="preserve">del centro del paziente</w:t>
-      </w:r>
-      <w:r>
-        <w:t xml:space="preserve"> </w:t>
-      </w:r>
-      <w:r>
-        <w:t xml:space="preserve">nei quali l’utente può aprire ticket.</w:t>
+        <w:t xml:space="preserve">Un ticket assegnato a Farmacovigilanza è visto da Farmacovigilanza, da chi lo ha aperto e dagli admin del centro.</w:t>
+      </w:r>
+      <w:r>
+        <w:t xml:space="preserve"> </w:t>
+      </w:r>
+      <w:r>
+        <w:rPr>
+          <w:b/>
+          <w:bCs/>
+        </w:rPr>
+        <w:t xml:space="preserve">Non</w:t>
+      </w:r>
+      <w:r>
+        <w:t xml:space="preserve"> </w:t>
+      </w:r>
+      <w:r>
+        <w:t xml:space="preserve">è visto dagli altri sperimentatori, anche se vedono lo stesso paziente.</w:t>
       </w:r>
     </w:p>
     <w:p>
@@ -1225,47 +1321,41 @@
         </w:numPr>
       </w:pPr>
       <w:r>
-        <w:t xml:space="preserve">Per coinvolgere</w:t>
-      </w:r>
-      <w:r>
-        <w:t xml:space="preserve"> </w:t>
-      </w:r>
-      <w:r>
-        <w:rPr>
-          <w:b/>
-          <w:bCs/>
-        </w:rPr>
-        <w:t xml:space="preserve">due gruppi</w:t>
-      </w:r>
-      <w:r>
-        <w:t xml:space="preserve"> </w:t>
-      </w:r>
-      <w:r>
-        <w:t xml:space="preserve">sulla stessa CRF si aprono</w:t>
-      </w:r>
-      <w:r>
-        <w:t xml:space="preserve"> </w:t>
-      </w:r>
-      <w:r>
-        <w:rPr>
-          <w:b/>
-          <w:bCs/>
-        </w:rPr>
-        <w:t xml:space="preserve">due ticket</w:t>
-      </w:r>
-      <w:r>
-        <w:t xml:space="preserve">, uno per gruppo. Ognuno vede solo il proprio; l’admin del centro li vede entrambi; la CRF resta bloccata finché non sono chiusi tutti e due.</w:t>
-      </w:r>
-    </w:p>
-    <w:bookmarkEnd w:id="13"/>
-    <w:bookmarkEnd w:id="14"/>
-    <w:bookmarkStart w:id="15" w:name="ciclo-di-vita-di-un-ticket-di-crf"/>
-    <w:p>
-      <w:pPr>
-        <w:pStyle w:val="Heading1"/>
-      </w:pPr>
-      <w:r>
-        <w:t xml:space="preserve">5. Ciclo di vita di un ticket di CRF</w:t>
+        <w:t xml:space="preserve">Chi non lo vede non può nemmeno rispondere, chiudere o riaprire.</w:t>
+      </w:r>
+    </w:p>
+    <w:p>
+      <w:pPr>
+        <w:pStyle w:val="Compact"/>
+        <w:numPr>
+          <w:ilvl w:val="0"/>
+          <w:numId w:val="1004"/>
+        </w:numPr>
+      </w:pPr>
+      <w:r>
+        <w:t xml:space="preserve">Il</w:t>
+      </w:r>
+      <w:r>
+        <w:t xml:space="preserve"> </w:t>
+      </w:r>
+      <w:r>
+        <w:rPr>
+          <w:b/>
+          <w:bCs/>
+        </w:rPr>
+        <w:t xml:space="preserve">blocco della conferma vale per tutti</w:t>
+      </w:r>
+      <w:r>
+        <w:t xml:space="preserve">: se una CRF ha un ticket aperto, nessuno la conferma, anche chi non vede il ticket. A chi non lo vede il sistema comunica solo che ci sono ticket aperti (numero e stato), senza titolo né testo.</w:t>
+      </w:r>
+    </w:p>
+    <w:bookmarkStart w:id="17" w:name="assegnazione-a-uno-o-più-gruppi"/>
+    <w:p>
+      <w:pPr>
+        <w:pStyle w:val="Heading2"/>
+      </w:pPr>
+      <w:r>
+        <w:t xml:space="preserve">Assegnazione a uno o più gruppi</w:t>
       </w:r>
     </w:p>
     <w:p>
@@ -1277,49 +1367,36 @@
         </w:numPr>
       </w:pPr>
       <w:r>
-        <w:rPr>
-          <w:b/>
-          <w:bCs/>
-        </w:rPr>
-        <w:t xml:space="preserve">Apertura.</w:t>
-      </w:r>
-      <w:r>
-        <w:t xml:space="preserve"> </w:t>
-      </w:r>
-      <w:r>
-        <w:t xml:space="preserve">Un utente apre il ticket dal pulsante</w:t>
-      </w:r>
-      <w:r>
-        <w:t xml:space="preserve"> </w:t>
-      </w:r>
-      <w:r>
-        <w:rPr>
-          <w:i/>
-          <w:iCs/>
-        </w:rPr>
-        <w:t xml:space="preserve">Ticket</w:t>
-      </w:r>
-      <w:r>
-        <w:t xml:space="preserve"> </w:t>
-      </w:r>
-      <w:r>
-        <w:t xml:space="preserve">della CRF: sceglie il gruppo destinatario, la priorità, scrive titolo e messaggio. Se la CRF era già confermata,</w:t>
-      </w:r>
-      <w:r>
-        <w:t xml:space="preserve"> </w:t>
-      </w:r>
-      <w:r>
-        <w:rPr>
-          <w:b/>
-          <w:bCs/>
-        </w:rPr>
-        <w:t xml:space="preserve">torna «da confermare»</w:t>
-      </w:r>
-      <w:r>
-        <w:t xml:space="preserve"> </w:t>
-      </w:r>
-      <w:r>
-        <w:t xml:space="preserve">(e viene registrato in audit).</w:t>
+        <w:t xml:space="preserve">Ogni ticket di CRF è assegnato a</w:t>
+      </w:r>
+      <w:r>
+        <w:t xml:space="preserve"> </w:t>
+      </w:r>
+      <w:r>
+        <w:rPr>
+          <w:b/>
+          <w:bCs/>
+        </w:rPr>
+        <w:t xml:space="preserve">un solo gruppo</w:t>
+      </w:r>
+      <w:r>
+        <w:t xml:space="preserve">, da scegliere tra i gruppi</w:t>
+      </w:r>
+      <w:r>
+        <w:t xml:space="preserve"> </w:t>
+      </w:r>
+      <w:r>
+        <w:rPr>
+          <w:b/>
+          <w:bCs/>
+        </w:rPr>
+        <w:t xml:space="preserve">del centro del paziente</w:t>
+      </w:r>
+      <w:r>
+        <w:t xml:space="preserve"> </w:t>
+      </w:r>
+      <w:r>
+        <w:t xml:space="preserve">nei quali l’utente può aprire ticket.</w:t>
       </w:r>
     </w:p>
     <w:p>
@@ -1331,286 +1408,47 @@
         </w:numPr>
       </w:pPr>
       <w:r>
-        <w:rPr>
-          <w:b/>
-          <w:bCs/>
-        </w:rPr>
-        <w:t xml:space="preserve">Lavorazione.</w:t>
-      </w:r>
-      <w:r>
-        <w:t xml:space="preserve"> </w:t>
-      </w:r>
-      <w:r>
-        <w:t xml:space="preserve">Il gruppo destinatario legge il ticket e risponde dal pannello; chi ha aperto il ticket vede le risposte. Lo sperimentatore può correggere la CRF e scrivere «attività svolta».</w:t>
-      </w:r>
-    </w:p>
-    <w:p>
-      <w:pPr>
-        <w:pStyle w:val="Compact"/>
-        <w:numPr>
-          <w:ilvl w:val="0"/>
-          <w:numId w:val="1005"/>
-        </w:numPr>
-      </w:pPr>
-      <w:r>
-        <w:rPr>
-          <w:b/>
-          <w:bCs/>
-        </w:rPr>
-        <w:t xml:space="preserve">Chiusura.</w:t>
-      </w:r>
-      <w:r>
-        <w:t xml:space="preserve"> </w:t>
-      </w:r>
-      <w:r>
-        <w:t xml:space="preserve">Chi ha il diritto di chiusura (Farmacovigilanza, admin del centro) chiude il ticket scrivendo una</w:t>
-      </w:r>
-      <w:r>
-        <w:t xml:space="preserve"> </w:t>
-      </w:r>
-      <w:r>
-        <w:rPr>
-          <w:b/>
-          <w:bCs/>
-        </w:rPr>
-        <w:t xml:space="preserve">motivazione</w:t>
-      </w:r>
-      <w:r>
-        <w:t xml:space="preserve"> </w:t>
-      </w:r>
-      <w:r>
-        <w:t xml:space="preserve">(almeno 5 caratteri) che resta nella conversazione. La piattaforma registra sul ticket un</w:t>
-      </w:r>
-      <w:r>
-        <w:t xml:space="preserve"> </w:t>
-      </w:r>
-      <w:r>
-        <w:rPr>
-          <w:b/>
-          <w:bCs/>
-        </w:rPr>
-        <w:t xml:space="preserve">segno di chiusura firmato</w:t>
-      </w:r>
-      <w:r>
-        <w:t xml:space="preserve">.</w:t>
-      </w:r>
-    </w:p>
-    <w:p>
-      <w:pPr>
-        <w:pStyle w:val="Compact"/>
-        <w:numPr>
-          <w:ilvl w:val="0"/>
-          <w:numId w:val="1005"/>
-        </w:numPr>
-      </w:pPr>
-      <w:r>
-        <w:rPr>
-          <w:b/>
-          <w:bCs/>
-        </w:rPr>
-        <w:t xml:space="preserve">Riapertura.</w:t>
-      </w:r>
-      <w:r>
-        <w:t xml:space="preserve"> </w:t>
-      </w:r>
-      <w:r>
-        <w:t xml:space="preserve">Chi ha il diritto di chiusura può riaprire il ticket; la CRF già confermata torna da confermare.</w:t>
-      </w:r>
-    </w:p>
-    <w:p>
-      <w:pPr>
-        <w:pStyle w:val="Compact"/>
-        <w:numPr>
-          <w:ilvl w:val="0"/>
-          <w:numId w:val="1005"/>
-        </w:numPr>
-      </w:pPr>
-      <w:r>
-        <w:rPr>
-          <w:b/>
-          <w:bCs/>
-        </w:rPr>
-        <w:t xml:space="preserve">Conferma della CRF.</w:t>
-      </w:r>
-      <w:r>
-        <w:t xml:space="preserve"> </w:t>
-      </w:r>
-      <w:r>
-        <w:t xml:space="preserve">Con tutti i ticket chiusi, chi ha il diritto di conferma conferma la CRF.</w:t>
-      </w:r>
-    </w:p>
-    <w:p>
-      <w:pPr>
-        <w:pStyle w:val="FirstParagraph"/>
-      </w:pPr>
-      <w:r>
-        <w:rPr>
-          <w:b/>
-          <w:bCs/>
-        </w:rPr>
-        <w:t xml:space="preserve">Chiusura fatta direttamente nel sistema di ticketing.</w:t>
-      </w:r>
-      <w:r>
-        <w:t xml:space="preserve"> </w:t>
-      </w:r>
-      <w:r>
-        <w:t xml:space="preserve">Se qualcuno chiude un ticket</w:t>
-      </w:r>
-      <w:r>
-        <w:t xml:space="preserve"> </w:t>
-      </w:r>
-      <w:r>
-        <w:rPr>
-          <w:b/>
-          <w:bCs/>
-        </w:rPr>
-        <w:t xml:space="preserve">fuori dalla piattaforma</w:t>
-      </w:r>
-      <w:r>
-        <w:t xml:space="preserve"> </w:t>
-      </w:r>
-      <w:r>
-        <w:t xml:space="preserve">(o con un’automazione), il ticket</w:t>
-      </w:r>
-      <w:r>
-        <w:t xml:space="preserve"> </w:t>
-      </w:r>
-      <w:r>
-        <w:rPr>
-          <w:b/>
-          <w:bCs/>
-        </w:rPr>
-        <w:t xml:space="preserve">continua a bloccare</w:t>
-      </w:r>
-      <w:r>
-        <w:t xml:space="preserve"> </w:t>
-      </w:r>
-      <w:r>
-        <w:t xml:space="preserve">la CRF e nel pannello compare «Chiuso senza convalida». Chi ha il diritto di chiusura può</w:t>
-      </w:r>
-      <w:r>
-        <w:t xml:space="preserve"> </w:t>
-      </w:r>
-      <w:r>
-        <w:rPr>
-          <w:b/>
-          <w:bCs/>
-        </w:rPr>
-        <w:t xml:space="preserve">convalidare</w:t>
-      </w:r>
-      <w:r>
-        <w:t xml:space="preserve"> </w:t>
-      </w:r>
-      <w:r>
-        <w:t xml:space="preserve">quella chiusura dal pannello con una motivazione. Il segno di chiusura è firmato dalla piattaforma: non si può simulare scrivendolo a mano.</w:t>
-      </w:r>
-    </w:p>
-    <w:bookmarkEnd w:id="15"/>
-    <w:bookmarkStart w:id="19" w:name="chiudere-un-ticket-e-confermare-una-crf"/>
+        <w:t xml:space="preserve">Per coinvolgere</w:t>
+      </w:r>
+      <w:r>
+        <w:t xml:space="preserve"> </w:t>
+      </w:r>
+      <w:r>
+        <w:rPr>
+          <w:b/>
+          <w:bCs/>
+        </w:rPr>
+        <w:t xml:space="preserve">due gruppi</w:t>
+      </w:r>
+      <w:r>
+        <w:t xml:space="preserve"> </w:t>
+      </w:r>
+      <w:r>
+        <w:t xml:space="preserve">sulla stessa CRF si aprono</w:t>
+      </w:r>
+      <w:r>
+        <w:t xml:space="preserve"> </w:t>
+      </w:r>
+      <w:r>
+        <w:rPr>
+          <w:b/>
+          <w:bCs/>
+        </w:rPr>
+        <w:t xml:space="preserve">due ticket</w:t>
+      </w:r>
+      <w:r>
+        <w:t xml:space="preserve">, uno per gruppo. Ognuno vede solo il proprio; l’admin del centro li vede entrambi; la CRF resta bloccata finché non sono chiusi tutti e due.</w:t>
+      </w:r>
+    </w:p>
+    <w:bookmarkEnd w:id="17"/>
+    <w:bookmarkEnd w:id="18"/>
+    <w:bookmarkStart w:id="19" w:name="ciclo-di-vita-di-un-ticket-di-crf"/>
     <w:p>
       <w:pPr>
         <w:pStyle w:val="Heading1"/>
       </w:pPr>
       <w:r>
-        <w:t xml:space="preserve">6. Chiudere un ticket e confermare una CRF</w:t>
-      </w:r>
-    </w:p>
-    <w:p>
-      <w:pPr>
-        <w:pStyle w:val="FirstParagraph"/>
-      </w:pPr>
-      <w:r>
-        <w:t xml:space="preserve">Sono</w:t>
-      </w:r>
-      <w:r>
-        <w:t xml:space="preserve"> </w:t>
-      </w:r>
-      <w:r>
-        <w:rPr>
-          <w:b/>
-          <w:bCs/>
-        </w:rPr>
-        <w:t xml:space="preserve">due azioni distinte</w:t>
-      </w:r>
-      <w:r>
-        <w:t xml:space="preserve">, con regole proprie, che possono essere fatte da persone diverse: prima si chiude il ticket, poi si conferma la CRF.</w:t>
-      </w:r>
-    </w:p>
-    <w:p>
-      <w:pPr>
-        <w:pStyle w:val="SourceCode"/>
-      </w:pPr>
-      <w:r>
-        <w:rPr>
-          <w:rStyle w:val="VerbatimChar"/>
-        </w:rPr>
-        <w:t xml:space="preserve">ticket aperto  →  risposta del gruppo  →  chiusura del ticket</w:t>
-      </w:r>
-      <w:r>
-        <w:br/>
-      </w:r>
-      <w:r>
-        <w:rPr>
-          <w:rStyle w:val="VerbatimChar"/>
-        </w:rPr>
-        <w:t xml:space="preserve">                                               ↓</w:t>
-      </w:r>
-      <w:r>
-        <w:br/>
-      </w:r>
-      <w:r>
-        <w:rPr>
-          <w:rStyle w:val="VerbatimChar"/>
-        </w:rPr>
-        <w:t xml:space="preserve">                         ticket chiuso con il segno firmato della piattaforma</w:t>
-      </w:r>
-      <w:r>
-        <w:br/>
-      </w:r>
-      <w:r>
-        <w:rPr>
-          <w:rStyle w:val="VerbatimChar"/>
-        </w:rPr>
-        <w:t xml:space="preserve">                                               ↓</w:t>
-      </w:r>
-      <w:r>
-        <w:br/>
-      </w:r>
-      <w:r>
-        <w:rPr>
-          <w:rStyle w:val="VerbatimChar"/>
-        </w:rPr>
-        <w:t xml:space="preserve">                              conferma della CRF</w:t>
-      </w:r>
-    </w:p>
-    <w:bookmarkStart w:id="16" w:name="chiudere-un-ticket"/>
-    <w:p>
-      <w:pPr>
-        <w:pStyle w:val="Heading2"/>
-      </w:pPr>
-      <w:r>
-        <w:t xml:space="preserve">6.1 Chiudere un ticket</w:t>
-      </w:r>
-    </w:p>
-    <w:p>
-      <w:pPr>
-        <w:pStyle w:val="FirstParagraph"/>
-      </w:pPr>
-      <w:r>
-        <w:t xml:space="preserve">Servono</w:t>
-      </w:r>
-      <w:r>
-        <w:t xml:space="preserve"> </w:t>
-      </w:r>
-      <w:r>
-        <w:rPr>
-          <w:b/>
-          <w:bCs/>
-        </w:rPr>
-        <w:t xml:space="preserve">tre condizioni insieme</w:t>
-      </w:r>
-      <w:r>
-        <w:t xml:space="preserve">:</w:t>
+        <w:t xml:space="preserve">5. Ciclo di vita di un ticket di CRF</w:t>
       </w:r>
     </w:p>
     <w:p>
@@ -1626,13 +1464,45 @@
           <w:b/>
           <w:bCs/>
         </w:rPr>
-        <w:t xml:space="preserve">Il diritto di chiusura</w:t>
-      </w:r>
-      <w:r>
-        <w:t xml:space="preserve"> </w:t>
-      </w:r>
-      <w:r>
-        <w:t xml:space="preserve">nel proprio gruppo (assegnato ai gruppi autorizzati; su staging: Admins del centro e Farmacovigilanza).</w:t>
+        <w:t xml:space="preserve">Apertura.</w:t>
+      </w:r>
+      <w:r>
+        <w:t xml:space="preserve"> </w:t>
+      </w:r>
+      <w:r>
+        <w:t xml:space="preserve">Un utente apre il ticket dal pulsante</w:t>
+      </w:r>
+      <w:r>
+        <w:t xml:space="preserve"> </w:t>
+      </w:r>
+      <w:r>
+        <w:rPr>
+          <w:i/>
+          <w:iCs/>
+        </w:rPr>
+        <w:t xml:space="preserve">Ticket</w:t>
+      </w:r>
+      <w:r>
+        <w:t xml:space="preserve"> </w:t>
+      </w:r>
+      <w:r>
+        <w:t xml:space="preserve">della CRF: sceglie il gruppo destinatario, la priorità, scrive titolo e messaggio. Se la CRF era già confermata,</w:t>
+      </w:r>
+      <w:r>
+        <w:t xml:space="preserve"> </w:t>
+      </w:r>
+      <w:r>
+        <w:rPr>
+          <w:b/>
+          <w:bCs/>
+        </w:rPr>
+        <w:t xml:space="preserve">torna «da confermare»</w:t>
+      </w:r>
+      <w:r>
+        <w:t xml:space="preserve"> </w:t>
+      </w:r>
+      <w:r>
+        <w:t xml:space="preserve">(e viene registrato in audit).</w:t>
       </w:r>
     </w:p>
     <w:p>
@@ -1648,10 +1518,13 @@
           <w:b/>
           <w:bCs/>
         </w:rPr>
-        <w:t xml:space="preserve">Poter intervenire sul ticket</w:t>
-      </w:r>
-      <w:r>
-        <w:t xml:space="preserve">: averlo aperto, oppure appartenere al gruppo a cui è assegnato con diritto di modifica, oppure essere admin del centro. Chi può solo leggere il ticket non può chiuderlo.</w:t>
+        <w:t xml:space="preserve">Lavorazione.</w:t>
+      </w:r>
+      <w:r>
+        <w:t xml:space="preserve"> </w:t>
+      </w:r>
+      <w:r>
+        <w:t xml:space="preserve">Il gruppo destinatario legge il ticket e risponde dal pannello; chi ha aperto il ticket vede le risposte. Lo sperimentatore può correggere la CRF e scrivere «attività svolta».</w:t>
       </w:r>
     </w:p>
     <w:p>
@@ -1667,13 +1540,86 @@
           <w:b/>
           <w:bCs/>
         </w:rPr>
-        <w:t xml:space="preserve">Una motivazione</w:t>
-      </w:r>
-      <w:r>
-        <w:t xml:space="preserve"> </w:t>
-      </w:r>
-      <w:r>
-        <w:t xml:space="preserve">di almeno 5 caratteri, che resta nella conversazione.</w:t>
+        <w:t xml:space="preserve">Chiusura.</w:t>
+      </w:r>
+      <w:r>
+        <w:t xml:space="preserve"> </w:t>
+      </w:r>
+      <w:r>
+        <w:t xml:space="preserve">Chi ha il diritto di chiusura (Farmacovigilanza, admin del centro) chiude il ticket scrivendo una</w:t>
+      </w:r>
+      <w:r>
+        <w:t xml:space="preserve"> </w:t>
+      </w:r>
+      <w:r>
+        <w:rPr>
+          <w:b/>
+          <w:bCs/>
+        </w:rPr>
+        <w:t xml:space="preserve">motivazione</w:t>
+      </w:r>
+      <w:r>
+        <w:t xml:space="preserve"> </w:t>
+      </w:r>
+      <w:r>
+        <w:t xml:space="preserve">(almeno 5 caratteri) che resta nella conversazione. La piattaforma registra sul ticket un</w:t>
+      </w:r>
+      <w:r>
+        <w:t xml:space="preserve"> </w:t>
+      </w:r>
+      <w:r>
+        <w:rPr>
+          <w:b/>
+          <w:bCs/>
+        </w:rPr>
+        <w:t xml:space="preserve">segno di chiusura firmato</w:t>
+      </w:r>
+      <w:r>
+        <w:t xml:space="preserve">.</w:t>
+      </w:r>
+    </w:p>
+    <w:p>
+      <w:pPr>
+        <w:pStyle w:val="Compact"/>
+        <w:numPr>
+          <w:ilvl w:val="0"/>
+          <w:numId w:val="1006"/>
+        </w:numPr>
+      </w:pPr>
+      <w:r>
+        <w:rPr>
+          <w:b/>
+          <w:bCs/>
+        </w:rPr>
+        <w:t xml:space="preserve">Riapertura.</w:t>
+      </w:r>
+      <w:r>
+        <w:t xml:space="preserve"> </w:t>
+      </w:r>
+      <w:r>
+        <w:t xml:space="preserve">Chi ha il diritto di chiusura può riaprire il ticket; la CRF già confermata torna da confermare.</w:t>
+      </w:r>
+    </w:p>
+    <w:p>
+      <w:pPr>
+        <w:pStyle w:val="Compact"/>
+        <w:numPr>
+          <w:ilvl w:val="0"/>
+          <w:numId w:val="1006"/>
+        </w:numPr>
+      </w:pPr>
+      <w:r>
+        <w:rPr>
+          <w:b/>
+          <w:bCs/>
+        </w:rPr>
+        <w:t xml:space="preserve">Conferma della CRF.</w:t>
+      </w:r>
+      <w:r>
+        <w:t xml:space="preserve"> </w:t>
+      </w:r>
+      <w:r>
+        <w:t xml:space="preserve">Con tutti i ticket chiusi, chi ha il diritto di conferma conferma la CRF.</w:t>
       </w:r>
     </w:p>
     <w:p>
@@ -1681,30 +1627,152 @@
         <w:pStyle w:val="FirstParagraph"/>
       </w:pPr>
       <w:r>
-        <w:t xml:space="preserve">Chi non ha il diritto di chiusura (per esempio uno sperimentatore, anche se ha aperto lui il ticket) riceve un rifiuto. La chiusura vale per la CRF</w:t>
-      </w:r>
-      <w:r>
-        <w:t xml:space="preserve"> </w:t>
-      </w:r>
-      <w:r>
-        <w:rPr>
-          <w:b/>
-          <w:bCs/>
-        </w:rPr>
-        <w:t xml:space="preserve">solo se passa dalla piattaforma</w:t>
-      </w:r>
-      <w:r>
-        <w:t xml:space="preserve">: viene scritto sul ticket un segno di chiusura firmato. Una chiusura fatta direttamente nel sistema di ticketing non basta (vedi paragrafo 5).</w:t>
-      </w:r>
-    </w:p>
-    <w:bookmarkEnd w:id="16"/>
-    <w:bookmarkStart w:id="17" w:name="confermare-una-crf"/>
+        <w:rPr>
+          <w:b/>
+          <w:bCs/>
+        </w:rPr>
+        <w:t xml:space="preserve">Chiusura fatta direttamente nel sistema di ticketing.</w:t>
+      </w:r>
+      <w:r>
+        <w:t xml:space="preserve"> </w:t>
+      </w:r>
+      <w:r>
+        <w:t xml:space="preserve">Se qualcuno chiude un ticket</w:t>
+      </w:r>
+      <w:r>
+        <w:t xml:space="preserve"> </w:t>
+      </w:r>
+      <w:r>
+        <w:rPr>
+          <w:b/>
+          <w:bCs/>
+        </w:rPr>
+        <w:t xml:space="preserve">fuori dalla piattaforma</w:t>
+      </w:r>
+      <w:r>
+        <w:t xml:space="preserve"> </w:t>
+      </w:r>
+      <w:r>
+        <w:t xml:space="preserve">(o con un’automazione), il ticket</w:t>
+      </w:r>
+      <w:r>
+        <w:t xml:space="preserve"> </w:t>
+      </w:r>
+      <w:r>
+        <w:rPr>
+          <w:b/>
+          <w:bCs/>
+        </w:rPr>
+        <w:t xml:space="preserve">continua a bloccare</w:t>
+      </w:r>
+      <w:r>
+        <w:t xml:space="preserve"> </w:t>
+      </w:r>
+      <w:r>
+        <w:t xml:space="preserve">la CRF e nel pannello compare «Chiuso senza convalida». Chi ha il diritto di chiusura può</w:t>
+      </w:r>
+      <w:r>
+        <w:t xml:space="preserve"> </w:t>
+      </w:r>
+      <w:r>
+        <w:rPr>
+          <w:b/>
+          <w:bCs/>
+        </w:rPr>
+        <w:t xml:space="preserve">convalidare</w:t>
+      </w:r>
+      <w:r>
+        <w:t xml:space="preserve"> </w:t>
+      </w:r>
+      <w:r>
+        <w:t xml:space="preserve">quella chiusura dal pannello con una motivazione. Il segno di chiusura è firmato dalla piattaforma: non si può simulare scrivendolo a mano.</w:t>
+      </w:r>
+    </w:p>
+    <w:bookmarkEnd w:id="19"/>
+    <w:bookmarkStart w:id="23" w:name="chiudere-un-ticket-e-confermare-una-crf"/>
+    <w:p>
+      <w:pPr>
+        <w:pStyle w:val="Heading1"/>
+      </w:pPr>
+      <w:r>
+        <w:t xml:space="preserve">6. Chiudere un ticket e confermare una CRF</w:t>
+      </w:r>
+    </w:p>
+    <w:p>
+      <w:pPr>
+        <w:pStyle w:val="FirstParagraph"/>
+      </w:pPr>
+      <w:r>
+        <w:t xml:space="preserve">Sono</w:t>
+      </w:r>
+      <w:r>
+        <w:t xml:space="preserve"> </w:t>
+      </w:r>
+      <w:r>
+        <w:rPr>
+          <w:b/>
+          <w:bCs/>
+        </w:rPr>
+        <w:t xml:space="preserve">due azioni distinte</w:t>
+      </w:r>
+      <w:r>
+        <w:t xml:space="preserve">, con regole proprie, che possono essere fatte da persone diverse: prima si chiude il ticket, poi si conferma la CRF.</w:t>
+      </w:r>
+    </w:p>
+    <w:p>
+      <w:pPr>
+        <w:pStyle w:val="SourceCode"/>
+      </w:pPr>
+      <w:r>
+        <w:rPr>
+          <w:rStyle w:val="VerbatimChar"/>
+        </w:rPr>
+        <w:t xml:space="preserve">ticket aperto  →  risposta del gruppo  →  chiusura del ticket</w:t>
+      </w:r>
+      <w:r>
+        <w:br/>
+      </w:r>
+      <w:r>
+        <w:rPr>
+          <w:rStyle w:val="VerbatimChar"/>
+        </w:rPr>
+        <w:t xml:space="preserve">                                               ↓</w:t>
+      </w:r>
+      <w:r>
+        <w:br/>
+      </w:r>
+      <w:r>
+        <w:rPr>
+          <w:rStyle w:val="VerbatimChar"/>
+        </w:rPr>
+        <w:t xml:space="preserve">                         ticket chiuso con il segno firmato della piattaforma</w:t>
+      </w:r>
+      <w:r>
+        <w:br/>
+      </w:r>
+      <w:r>
+        <w:rPr>
+          <w:rStyle w:val="VerbatimChar"/>
+        </w:rPr>
+        <w:t xml:space="preserve">                                               ↓</w:t>
+      </w:r>
+      <w:r>
+        <w:br/>
+      </w:r>
+      <w:r>
+        <w:rPr>
+          <w:rStyle w:val="VerbatimChar"/>
+        </w:rPr>
+        <w:t xml:space="preserve">                              conferma della CRF</w:t>
+      </w:r>
+    </w:p>
+    <w:bookmarkStart w:id="20" w:name="chiudere-un-ticket"/>
     <w:p>
       <w:pPr>
         <w:pStyle w:val="Heading2"/>
       </w:pPr>
       <w:r>
-        <w:t xml:space="preserve">6.2 Confermare una CRF</w:t>
+        <w:t xml:space="preserve">6.1 Chiudere un ticket</w:t>
       </w:r>
     </w:p>
     <w:p>
@@ -1722,10 +1790,10 @@
           <w:b/>
           <w:bCs/>
         </w:rPr>
-        <w:t xml:space="preserve">due condizioni</w:t>
-      </w:r>
-      <w:r>
-        <w:t xml:space="preserve">, controllate in quest’ordine:</w:t>
+        <w:t xml:space="preserve">tre condizioni insieme</w:t>
+      </w:r>
+      <w:r>
+        <w:t xml:space="preserve">:</w:t>
       </w:r>
     </w:p>
     <w:p>
@@ -1741,13 +1809,13 @@
           <w:b/>
           <w:bCs/>
         </w:rPr>
-        <w:t xml:space="preserve">Il diritto di conferma</w:t>
-      </w:r>
-      <w:r>
-        <w:t xml:space="preserve"> </w:t>
-      </w:r>
-      <w:r>
-        <w:t xml:space="preserve">nel proprio gruppo. Se manca, la conferma è rifiutata (su staging il diritto ce l’hanno gli Admins del centro e Farmacovigilanza; gli Sperimentatori no).</w:t>
+        <w:t xml:space="preserve">Il diritto di chiusura</w:t>
+      </w:r>
+      <w:r>
+        <w:t xml:space="preserve"> </w:t>
+      </w:r>
+      <w:r>
+        <w:t xml:space="preserve">nel proprio gruppo (assegnato ai gruppi autorizzati; su staging: Admins del centro e Farmacovigilanza).</w:t>
       </w:r>
     </w:p>
     <w:p>
@@ -1756,6 +1824,121 @@
         <w:numPr>
           <w:ilvl w:val="0"/>
           <w:numId w:val="1007"/>
+        </w:numPr>
+      </w:pPr>
+      <w:r>
+        <w:rPr>
+          <w:b/>
+          <w:bCs/>
+        </w:rPr>
+        <w:t xml:space="preserve">Poter intervenire sul ticket</w:t>
+      </w:r>
+      <w:r>
+        <w:t xml:space="preserve">: averlo aperto, oppure appartenere al gruppo a cui è assegnato con diritto di modifica, oppure essere admin del centro. Chi può solo leggere il ticket non può chiuderlo.</w:t>
+      </w:r>
+    </w:p>
+    <w:p>
+      <w:pPr>
+        <w:pStyle w:val="Compact"/>
+        <w:numPr>
+          <w:ilvl w:val="0"/>
+          <w:numId w:val="1007"/>
+        </w:numPr>
+      </w:pPr>
+      <w:r>
+        <w:rPr>
+          <w:b/>
+          <w:bCs/>
+        </w:rPr>
+        <w:t xml:space="preserve">Una motivazione</w:t>
+      </w:r>
+      <w:r>
+        <w:t xml:space="preserve"> </w:t>
+      </w:r>
+      <w:r>
+        <w:t xml:space="preserve">di almeno 5 caratteri, che resta nella conversazione.</w:t>
+      </w:r>
+    </w:p>
+    <w:p>
+      <w:pPr>
+        <w:pStyle w:val="FirstParagraph"/>
+      </w:pPr>
+      <w:r>
+        <w:t xml:space="preserve">Chi non ha il diritto di chiusura (per esempio uno sperimentatore, anche se ha aperto lui il ticket) riceve un rifiuto. La chiusura vale per la CRF</w:t>
+      </w:r>
+      <w:r>
+        <w:t xml:space="preserve"> </w:t>
+      </w:r>
+      <w:r>
+        <w:rPr>
+          <w:b/>
+          <w:bCs/>
+        </w:rPr>
+        <w:t xml:space="preserve">solo se passa dalla piattaforma</w:t>
+      </w:r>
+      <w:r>
+        <w:t xml:space="preserve">: viene scritto sul ticket un segno di chiusura firmato. Una chiusura fatta direttamente nel sistema di ticketing non basta (vedi paragrafo 5).</w:t>
+      </w:r>
+    </w:p>
+    <w:bookmarkEnd w:id="20"/>
+    <w:bookmarkStart w:id="21" w:name="confermare-una-crf"/>
+    <w:p>
+      <w:pPr>
+        <w:pStyle w:val="Heading2"/>
+      </w:pPr>
+      <w:r>
+        <w:t xml:space="preserve">6.2 Confermare una CRF</w:t>
+      </w:r>
+    </w:p>
+    <w:p>
+      <w:pPr>
+        <w:pStyle w:val="FirstParagraph"/>
+      </w:pPr>
+      <w:r>
+        <w:t xml:space="preserve">Servono</w:t>
+      </w:r>
+      <w:r>
+        <w:t xml:space="preserve"> </w:t>
+      </w:r>
+      <w:r>
+        <w:rPr>
+          <w:b/>
+          <w:bCs/>
+        </w:rPr>
+        <w:t xml:space="preserve">due condizioni</w:t>
+      </w:r>
+      <w:r>
+        <w:t xml:space="preserve">, controllate in quest’ordine:</w:t>
+      </w:r>
+    </w:p>
+    <w:p>
+      <w:pPr>
+        <w:pStyle w:val="Compact"/>
+        <w:numPr>
+          <w:ilvl w:val="0"/>
+          <w:numId w:val="1008"/>
+        </w:numPr>
+      </w:pPr>
+      <w:r>
+        <w:rPr>
+          <w:b/>
+          <w:bCs/>
+        </w:rPr>
+        <w:t xml:space="preserve">Il diritto di conferma</w:t>
+      </w:r>
+      <w:r>
+        <w:t xml:space="preserve"> </w:t>
+      </w:r>
+      <w:r>
+        <w:t xml:space="preserve">nel proprio gruppo. Se manca, la conferma è rifiutata (su staging il diritto ce l’hanno gli Admins del centro e Farmacovigilanza; gli Sperimentatori no).</w:t>
+      </w:r>
+    </w:p>
+    <w:p>
+      <w:pPr>
+        <w:pStyle w:val="Compact"/>
+        <w:numPr>
+          <w:ilvl w:val="0"/>
+          <w:numId w:val="1008"/>
         </w:numPr>
       </w:pPr>
       <w:r>
@@ -1984,8 +2167,8 @@
         <w:t xml:space="preserve">, anche per chi non vede il ticket: lo decide il server. Se il sistema di ticketing non risponde, la conferma non è possibile (si preferisce fermarsi piuttosto che confermare alla cieca).</w:t>
       </w:r>
     </w:p>
-    <w:bookmarkEnd w:id="17"/>
-    <w:bookmarkStart w:id="18" w:name="riepilogo-per-gruppo-staging"/>
+    <w:bookmarkEnd w:id="21"/>
+    <w:bookmarkStart w:id="22" w:name="riepilogo-per-gruppo-staging"/>
     <w:p>
       <w:pPr>
         <w:pStyle w:val="Heading2"/>
@@ -2219,320 +2402,15 @@
         <w:t xml:space="preserve">può confermare anche con ticket aperti (paragrafo 7).</w:t>
       </w:r>
     </w:p>
-    <w:bookmarkEnd w:id="18"/>
-    <w:bookmarkEnd w:id="19"/>
-    <w:bookmarkStart w:id="20" w:name="il-blocco-della-conferma-e-la-deroga"/>
+    <w:bookmarkEnd w:id="22"/>
+    <w:bookmarkEnd w:id="23"/>
+    <w:bookmarkStart w:id="24" w:name="il-blocco-della-conferma-e-la-deroga"/>
     <w:p>
       <w:pPr>
         <w:pStyle w:val="Heading1"/>
       </w:pPr>
       <w:r>
         <w:t xml:space="preserve">7. Il blocco della conferma e la deroga</w:t>
-      </w:r>
-    </w:p>
-    <w:p>
-      <w:pPr>
-        <w:pStyle w:val="Compact"/>
-        <w:numPr>
-          <w:ilvl w:val="0"/>
-          <w:numId w:val="1008"/>
-        </w:numPr>
-      </w:pPr>
-      <w:r>
-        <w:t xml:space="preserve">Il pulsante</w:t>
-      </w:r>
-      <w:r>
-        <w:t xml:space="preserve"> </w:t>
-      </w:r>
-      <w:r>
-        <w:rPr>
-          <w:b/>
-          <w:bCs/>
-        </w:rPr>
-        <w:t xml:space="preserve">Conferma CRF</w:t>
-      </w:r>
-      <w:r>
-        <w:t xml:space="preserve"> </w:t>
-      </w:r>
-      <w:r>
-        <w:t xml:space="preserve">lo</w:t>
-      </w:r>
-      <w:r>
-        <w:t xml:space="preserve"> </w:t>
-      </w:r>
-      <w:r>
-        <w:rPr>
-          <w:b/>
-          <w:bCs/>
-        </w:rPr>
-        <w:t xml:space="preserve">vedono solo i gruppi che hanno il diritto di conferma</w:t>
-      </w:r>
-      <w:r>
-        <w:t xml:space="preserve">: per gli altri gruppi non compare affatto (nemmeno grigio), e non vedono neppure l’avviso di conferma bloccata. Per chi lo vede, è</w:t>
-      </w:r>
-      <w:r>
-        <w:t xml:space="preserve"> </w:t>
-      </w:r>
-      <w:r>
-        <w:rPr>
-          <w:b/>
-          <w:bCs/>
-        </w:rPr>
-        <w:t xml:space="preserve">disabilitato</w:t>
-      </w:r>
-      <w:r>
-        <w:t xml:space="preserve"> </w:t>
-      </w:r>
-      <w:r>
-        <w:t xml:space="preserve">ogni volta che la conferma non è possibile: ci sono ticket non chiusi, oppure il sistema di ticketing non risponde, oppure la CRF si sta ancora salvando o importando. Sopra i pulsanti un avviso giallo spiega quanti ticket bloccano e quali. Chi ha il diritto di deroga vede accanto un secondo pulsante,</w:t>
-      </w:r>
-      <w:r>
-        <w:t xml:space="preserve"> </w:t>
-      </w:r>
-      <w:r>
-        <w:rPr>
-          <w:b/>
-          <w:bCs/>
-        </w:rPr>
-        <w:t xml:space="preserve">«Conferma con deroga…»</w:t>
-      </w:r>
-      <w:r>
-        <w:t xml:space="preserve">.</w:t>
-      </w:r>
-    </w:p>
-    <w:p>
-      <w:pPr>
-        <w:pStyle w:val="Compact"/>
-        <w:numPr>
-          <w:ilvl w:val="0"/>
-          <w:numId w:val="1008"/>
-        </w:numPr>
-      </w:pPr>
-      <w:r>
-        <w:t xml:space="preserve">Le regole di chi può chiudere e confermare sono nel paragrafo 6. Con il blocco attivo, il pulsante</w:t>
-      </w:r>
-      <w:r>
-        <w:t xml:space="preserve"> </w:t>
-      </w:r>
-      <w:r>
-        <w:rPr>
-          <w:b/>
-          <w:bCs/>
-        </w:rPr>
-        <w:t xml:space="preserve">Conferma CRF</w:t>
-      </w:r>
-      <w:r>
-        <w:t xml:space="preserve"> </w:t>
-      </w:r>
-      <w:r>
-        <w:t xml:space="preserve">non funziona se la CRF ha ticket non chiusi: il sistema spiega quanti sono.</w:t>
-      </w:r>
-    </w:p>
-    <w:p>
-      <w:pPr>
-        <w:pStyle w:val="Compact"/>
-        <w:numPr>
-          <w:ilvl w:val="0"/>
-          <w:numId w:val="1008"/>
-        </w:numPr>
-      </w:pPr>
-      <w:r>
-        <w:t xml:space="preserve">Se il sistema di ticketing</w:t>
-      </w:r>
-      <w:r>
-        <w:t xml:space="preserve"> </w:t>
-      </w:r>
-      <w:r>
-        <w:rPr>
-          <w:b/>
-          <w:bCs/>
-        </w:rPr>
-        <w:t xml:space="preserve">non risponde</w:t>
-      </w:r>
-      <w:r>
-        <w:t xml:space="preserve">, la conferma è impossibile (per prudenza), salvo diversa scelta di configurazione.</w:t>
-      </w:r>
-    </w:p>
-    <w:p>
-      <w:pPr>
-        <w:pStyle w:val="Compact"/>
-        <w:numPr>
-          <w:ilvl w:val="0"/>
-          <w:numId w:val="1008"/>
-        </w:numPr>
-      </w:pPr>
-      <w:r>
-        <w:t xml:space="preserve">La</w:t>
-      </w:r>
-      <w:r>
-        <w:t xml:space="preserve"> </w:t>
-      </w:r>
-      <w:r>
-        <w:rPr>
-          <w:b/>
-          <w:bCs/>
-        </w:rPr>
-        <w:t xml:space="preserve">deroga</w:t>
-      </w:r>
-      <w:r>
-        <w:t xml:space="preserve"> </w:t>
-      </w:r>
-      <w:r>
-        <w:t xml:space="preserve">consente a pochi responsabili di confermare comunque, con una</w:t>
-      </w:r>
-      <w:r>
-        <w:t xml:space="preserve"> </w:t>
-      </w:r>
-      <w:r>
-        <w:rPr>
-          <w:b/>
-          <w:bCs/>
-        </w:rPr>
-        <w:t xml:space="preserve">motivazione obbligatoria (10–500 caratteri)</w:t>
-      </w:r>
-      <w:r>
-        <w:t xml:space="preserve">. Ogni deroga è registrata in audit con motivazione, utente e ticket coinvolti; se l’audit non si registra, la deroga viene rifiutata. La motivazione non deve contenere dati identificativi del paziente.</w:t>
-      </w:r>
-    </w:p>
-    <w:p>
-      <w:pPr>
-        <w:pStyle w:val="Compact"/>
-        <w:numPr>
-          <w:ilvl w:val="0"/>
-          <w:numId w:val="1008"/>
-        </w:numPr>
-      </w:pPr>
-      <w:r>
-        <w:t xml:space="preserve">Il blocco vale anche per il completamento di una CRF da</w:t>
-      </w:r>
-      <w:r>
-        <w:t xml:space="preserve"> </w:t>
-      </w:r>
-      <w:r>
-        <w:rPr>
-          <w:b/>
-          <w:bCs/>
-        </w:rPr>
-        <w:t xml:space="preserve">link di compilazione</w:t>
-      </w:r>
-      <w:r>
-        <w:t xml:space="preserve"> </w:t>
-      </w:r>
-      <w:r>
-        <w:t xml:space="preserve">e per l’</w:t>
-      </w:r>
-      <w:r>
-        <w:rPr>
-          <w:b/>
-          <w:bCs/>
-        </w:rPr>
-        <w:t xml:space="preserve">import</w:t>
-      </w:r>
-      <w:r>
-        <w:t xml:space="preserve"> </w:t>
-      </w:r>
-      <w:r>
-        <w:t xml:space="preserve">di CRF già completate (queste ultime richiedono il diritto di conferma).</w:t>
-      </w:r>
-    </w:p>
-    <w:bookmarkEnd w:id="20"/>
-    <w:bookmarkStart w:id="21" w:name="esempi-provati-su-staging"/>
-    <w:p>
-      <w:pPr>
-        <w:pStyle w:val="Heading1"/>
-      </w:pPr>
-      <w:r>
-        <w:t xml:space="preserve">8. Esempi (provati su staging)</w:t>
-      </w:r>
-    </w:p>
-    <w:p>
-      <w:pPr>
-        <w:pStyle w:val="FirstParagraph"/>
-      </w:pPr>
-      <w:r>
-        <w:rPr>
-          <w:b/>
-          <w:bCs/>
-        </w:rPr>
-        <w:t xml:space="preserve">Esempio A — lo sperimentatore apre a Farmacovigilanza, che chiude.</w:t>
-      </w:r>
-      <w:r>
-        <w:t xml:space="preserve"> </w:t>
-      </w:r>
-      <w:r>
-        <w:t xml:space="preserve">Lo sperimentatore apre un ticket sulla CRF assegnandolo a Farmacovigilanza. La CRF è subito bloccata. Farmacovigilanza lo vede, risponde e lo chiude con una motivazione. Lo sperimentatore legge l’intera conversazione, non può chiudere il ticket lui stesso. A ticket chiuso la CRF si conferma.</w:t>
-      </w:r>
-    </w:p>
-    <w:p>
-      <w:pPr>
-        <w:pStyle w:val="BodyText"/>
-      </w:pPr>
-      <w:r>
-        <w:rPr>
-          <w:b/>
-          <w:bCs/>
-        </w:rPr>
-        <w:t xml:space="preserve">Esempio B — risponde e chiude anche l’admin del centro.</w:t>
-      </w:r>
-      <w:r>
-        <w:t xml:space="preserve"> </w:t>
-      </w:r>
-      <w:r>
-        <w:t xml:space="preserve">Stesso inizio. Dopo la risposta di Farmacovigilanza, l’admin del centro (che vede tutti i ticket del centro) legge la conversazione, aggiunge una risposta e chiude il ticket. La conversazione completa è visibile a tutti i soggetti coinvolti; l’admin conferma la CRF.</w:t>
-      </w:r>
-    </w:p>
-    <w:p>
-      <w:pPr>
-        <w:pStyle w:val="BodyText"/>
-      </w:pPr>
-      <w:r>
-        <w:rPr>
-          <w:b/>
-          <w:bCs/>
-        </w:rPr>
-        <w:t xml:space="preserve">Esempio C — due gruppi sulla stessa CRF.</w:t>
-      </w:r>
-      <w:r>
-        <w:t xml:space="preserve"> </w:t>
-      </w:r>
-      <w:r>
-        <w:t xml:space="preserve">L’admin apre due ticket sulla stessa CRF, uno a Sperimentatori e uno a Farmacovigilanza. Ogni gruppo vede solo il proprio ticket; l’admin li vede entrambi; la conferma resta bloccata finché tutti e due non sono chiusi.</w:t>
-      </w:r>
-    </w:p>
-    <w:p>
-      <w:pPr>
-        <w:pStyle w:val="BodyText"/>
-      </w:pPr>
-      <w:r>
-        <w:rPr>
-          <w:b/>
-          <w:bCs/>
-        </w:rPr>
-        <w:t xml:space="preserve">Esempio D — un utente di un altro gruppo.</w:t>
-      </w:r>
-      <w:r>
-        <w:t xml:space="preserve"> </w:t>
-      </w:r>
-      <w:r>
-        <w:t xml:space="preserve">Un utente di Farmacovigilanza non vede un ticket assegnato a Sperimentatori (anche se vede lo stesso paziente) e non può rispondere. Vede però che la conferma della CRF è bloccata da un ticket aperto.</w:t>
-      </w:r>
-    </w:p>
-    <w:bookmarkEnd w:id="21"/>
-    <w:bookmarkStart w:id="22" w:name="le-schermate"/>
-    <w:p>
-      <w:pPr>
-        <w:pStyle w:val="Heading1"/>
-      </w:pPr>
-      <w:r>
-        <w:t xml:space="preserve">9. Le schermate</w:t>
-      </w:r>
-    </w:p>
-    <w:p>
-      <w:pPr>
-        <w:pStyle w:val="FirstParagraph"/>
-      </w:pPr>
-      <w:r>
-        <w:t xml:space="preserve">L’interfaccia si adatta al dispositivo: computer, tablet e telefono.</w:t>
       </w:r>
     </w:p>
     <w:p>
@@ -2544,82 +2422,65 @@
         </w:numPr>
       </w:pPr>
       <w:r>
-        <w:rPr>
-          <w:b/>
-          <w:bCs/>
-        </w:rPr>
-        <w:t xml:space="preserve">Pannello ticket nella CRF.</w:t>
-      </w:r>
-      <w:r>
-        <w:t xml:space="preserve"> </w:t>
-      </w:r>
-      <w:r>
-        <w:t xml:space="preserve">Si apre dal pulsante</w:t>
-      </w:r>
-      <w:r>
-        <w:t xml:space="preserve"> </w:t>
-      </w:r>
-      <w:r>
-        <w:rPr>
-          <w:i/>
-          <w:iCs/>
-        </w:rPr>
-        <w:t xml:space="preserve">Ticket</w:t>
-      </w:r>
-      <w:r>
-        <w:t xml:space="preserve"> </w:t>
-      </w:r>
-      <w:r>
-        <w:t xml:space="preserve">e mostra a sinistra i filtri (</w:t>
-      </w:r>
-      <w:r>
-        <w:rPr>
-          <w:b/>
-          <w:bCs/>
-        </w:rPr>
-        <w:t xml:space="preserve">Aperti</w:t>
-      </w:r>
-      <w:r>
-        <w:t xml:space="preserve">,</w:t>
-      </w:r>
-      <w:r>
-        <w:t xml:space="preserve"> </w:t>
-      </w:r>
-      <w:r>
-        <w:rPr>
-          <w:b/>
-          <w:bCs/>
-        </w:rPr>
-        <w:t xml:space="preserve">Tutti</w:t>
-      </w:r>
-      <w:r>
-        <w:t xml:space="preserve">,</w:t>
-      </w:r>
-      <w:r>
-        <w:t xml:space="preserve"> </w:t>
-      </w:r>
-      <w:r>
-        <w:rPr>
-          <w:b/>
-          <w:bCs/>
-        </w:rPr>
-        <w:t xml:space="preserve">Da convalidare</w:t>
-      </w:r>
-      <w:r>
-        <w:t xml:space="preserve">) con i conteggi, e sotto la conversazione del ticket scelto. Un pallino segnala i ticket con messaggi nuovi. Per ogni ticket si vede a che punto è:</w:t>
-      </w:r>
-      <w:r>
-        <w:t xml:space="preserve"> </w:t>
-      </w:r>
-      <w:r>
-        <w:rPr>
-          <w:b/>
-          <w:bCs/>
-        </w:rPr>
-        <w:t xml:space="preserve">Aperto → Preso in carico → Chiuso</w:t>
-      </w:r>
-      <w:r>
-        <w:t xml:space="preserve">. In basso si scrive la risposta e, per chi ha il diritto, si chiude il ticket con una motivazione. Sul telefono elenco e conversazione sono due pagine, con la freccia per tornare indietro.</w:t>
+        <w:t xml:space="preserve">Il pulsante</w:t>
+      </w:r>
+      <w:r>
+        <w:t xml:space="preserve"> </w:t>
+      </w:r>
+      <w:r>
+        <w:rPr>
+          <w:b/>
+          <w:bCs/>
+        </w:rPr>
+        <w:t xml:space="preserve">Conferma CRF</w:t>
+      </w:r>
+      <w:r>
+        <w:t xml:space="preserve"> </w:t>
+      </w:r>
+      <w:r>
+        <w:t xml:space="preserve">lo</w:t>
+      </w:r>
+      <w:r>
+        <w:t xml:space="preserve"> </w:t>
+      </w:r>
+      <w:r>
+        <w:rPr>
+          <w:b/>
+          <w:bCs/>
+        </w:rPr>
+        <w:t xml:space="preserve">vedono solo i gruppi che hanno il diritto di conferma</w:t>
+      </w:r>
+      <w:r>
+        <w:t xml:space="preserve">: per gli altri gruppi non compare affatto (nemmeno grigio), e non vedono neppure l’avviso di conferma bloccata. Per chi lo vede, è</w:t>
+      </w:r>
+      <w:r>
+        <w:t xml:space="preserve"> </w:t>
+      </w:r>
+      <w:r>
+        <w:rPr>
+          <w:b/>
+          <w:bCs/>
+        </w:rPr>
+        <w:t xml:space="preserve">disabilitato</w:t>
+      </w:r>
+      <w:r>
+        <w:t xml:space="preserve"> </w:t>
+      </w:r>
+      <w:r>
+        <w:t xml:space="preserve">ogni volta che la conferma non è possibile: ci sono ticket non chiusi, oppure il sistema di ticketing non risponde, oppure la CRF si sta ancora salvando o importando. Sopra i pulsanti un avviso giallo spiega quanti ticket bloccano e quali. Chi ha il diritto di deroga vede accanto un secondo pulsante,</w:t>
+      </w:r>
+      <w:r>
+        <w:t xml:space="preserve"> </w:t>
+      </w:r>
+      <w:r>
+        <w:rPr>
+          <w:b/>
+          <w:bCs/>
+        </w:rPr>
+        <w:t xml:space="preserve">«Conferma con deroga…»</w:t>
+      </w:r>
+      <w:r>
+        <w:t xml:space="preserve">.</w:t>
       </w:r>
     </w:p>
     <w:p>
@@ -2631,17 +2492,23 @@
         </w:numPr>
       </w:pPr>
       <w:r>
-        <w:rPr>
-          <w:b/>
-          <w:bCs/>
-        </w:rPr>
-        <w:t xml:space="preserve">Avviso «Conferma bloccata».</w:t>
-      </w:r>
-      <w:r>
-        <w:t xml:space="preserve"> </w:t>
-      </w:r>
-      <w:r>
-        <w:t xml:space="preserve">Sopra i pulsanti della CRF un riquadro giallo dice quanti ticket aperti impediscono la conferma e quali sono.</w:t>
+        <w:t xml:space="preserve">Le regole di chi può chiudere e confermare sono nel paragrafo 6. Con il blocco attivo, il pulsante</w:t>
+      </w:r>
+      <w:r>
+        <w:t xml:space="preserve"> </w:t>
+      </w:r>
+      <w:r>
+        <w:rPr>
+          <w:b/>
+          <w:bCs/>
+        </w:rPr>
+        <w:t xml:space="preserve">Conferma CRF</w:t>
+      </w:r>
+      <w:r>
+        <w:t xml:space="preserve"> </w:t>
+      </w:r>
+      <w:r>
+        <w:t xml:space="preserve">non funziona se la CRF ha ticket non chiusi: il sistema spiega quanti sono.</w:t>
       </w:r>
     </w:p>
     <w:p>
@@ -2653,17 +2520,20 @@
         </w:numPr>
       </w:pPr>
       <w:r>
-        <w:rPr>
-          <w:b/>
-          <w:bCs/>
-        </w:rPr>
-        <w:t xml:space="preserve">Nuovo ticket.</w:t>
-      </w:r>
-      <w:r>
-        <w:t xml:space="preserve"> </w:t>
-      </w:r>
-      <w:r>
-        <w:t xml:space="preserve">Una sola finestra in tre passi: a quale gruppo inviarlo, la priorità, e cosa succede (con scorciatoie come «Dato incongruente» o «Chiarimento»). Ricorda in testa paziente, ciclo e CRF, e avvisa che la CRF resta non confermabile finché il ticket non è chiuso.</w:t>
+        <w:t xml:space="preserve">Se il sistema di ticketing</w:t>
+      </w:r>
+      <w:r>
+        <w:t xml:space="preserve"> </w:t>
+      </w:r>
+      <w:r>
+        <w:rPr>
+          <w:b/>
+          <w:bCs/>
+        </w:rPr>
+        <w:t xml:space="preserve">non risponde</w:t>
+      </w:r>
+      <w:r>
+        <w:t xml:space="preserve">, la conferma è impossibile (per prudenza), salvo diversa scelta di configurazione.</w:t>
       </w:r>
     </w:p>
     <w:p>
@@ -2675,92 +2545,36 @@
         </w:numPr>
       </w:pPr>
       <w:r>
-        <w:rPr>
-          <w:b/>
-          <w:bCs/>
-        </w:rPr>
-        <w:t xml:space="preserve">I miei ticket.</w:t>
-      </w:r>
-      <w:r>
-        <w:t xml:space="preserve"> </w:t>
-      </w:r>
-      <w:r>
-        <w:t xml:space="preserve">Elenco di tutti i ticket dell’utente con filtri (</w:t>
-      </w:r>
-      <w:r>
-        <w:rPr>
-          <w:b/>
-          <w:bCs/>
-        </w:rPr>
-        <w:t xml:space="preserve">Aperti</w:t>
-      </w:r>
-      <w:r>
-        <w:t xml:space="preserve">,</w:t>
-      </w:r>
-      <w:r>
-        <w:t xml:space="preserve"> </w:t>
-      </w:r>
-      <w:r>
-        <w:rPr>
-          <w:b/>
-          <w:bCs/>
-        </w:rPr>
-        <w:t xml:space="preserve">Assegnati a me</w:t>
-      </w:r>
-      <w:r>
-        <w:t xml:space="preserve">,</w:t>
-      </w:r>
-      <w:r>
-        <w:t xml:space="preserve"> </w:t>
-      </w:r>
-      <w:r>
-        <w:rPr>
-          <w:b/>
-          <w:bCs/>
-        </w:rPr>
-        <w:t xml:space="preserve">Aperti da me</w:t>
-      </w:r>
-      <w:r>
-        <w:t xml:space="preserve">,</w:t>
-      </w:r>
-      <w:r>
-        <w:t xml:space="preserve"> </w:t>
-      </w:r>
-      <w:r>
-        <w:rPr>
-          <w:b/>
-          <w:bCs/>
-        </w:rPr>
-        <w:t xml:space="preserve">Da convalidare</w:t>
-      </w:r>
-      <w:r>
-        <w:t xml:space="preserve">,</w:t>
-      </w:r>
-      <w:r>
-        <w:t xml:space="preserve"> </w:t>
-      </w:r>
-      <w:r>
-        <w:rPr>
-          <w:b/>
-          <w:bCs/>
-        </w:rPr>
-        <w:t xml:space="preserve">Chiusi</w:t>
-      </w:r>
-      <w:r>
-        <w:t xml:space="preserve">) e ricerca. Su schermi larghi a destra c’è l’anteprima con gli ultimi messaggi e il pulsante</w:t>
-      </w:r>
-      <w:r>
-        <w:t xml:space="preserve"> </w:t>
-      </w:r>
-      <w:r>
-        <w:rPr>
-          <w:b/>
-          <w:bCs/>
-        </w:rPr>
-        <w:t xml:space="preserve">Apri la CRF</w:t>
-      </w:r>
-      <w:r>
-        <w:t xml:space="preserve">.</w:t>
+        <w:t xml:space="preserve">La</w:t>
+      </w:r>
+      <w:r>
+        <w:t xml:space="preserve"> </w:t>
+      </w:r>
+      <w:r>
+        <w:rPr>
+          <w:b/>
+          <w:bCs/>
+        </w:rPr>
+        <w:t xml:space="preserve">deroga</w:t>
+      </w:r>
+      <w:r>
+        <w:t xml:space="preserve"> </w:t>
+      </w:r>
+      <w:r>
+        <w:t xml:space="preserve">consente a pochi responsabili di confermare comunque, con una</w:t>
+      </w:r>
+      <w:r>
+        <w:t xml:space="preserve"> </w:t>
+      </w:r>
+      <w:r>
+        <w:rPr>
+          <w:b/>
+          <w:bCs/>
+        </w:rPr>
+        <w:t xml:space="preserve">motivazione obbligatoria (10–500 caratteri)</w:t>
+      </w:r>
+      <w:r>
+        <w:t xml:space="preserve">. Ogni deroga è registrata in audit con motivazione, utente e ticket coinvolti; se l’audit non si registra, la deroga viene rifiutata. La motivazione non deve contenere dati identificativi del paziente.</w:t>
       </w:r>
     </w:p>
     <w:p>
@@ -2772,62 +2586,136 @@
         </w:numPr>
       </w:pPr>
       <w:r>
-        <w:rPr>
-          <w:b/>
-          <w:bCs/>
-        </w:rPr>
-        <w:t xml:space="preserve">Home del paziente.</w:t>
-      </w:r>
-      <w:r>
-        <w:t xml:space="preserve"> </w:t>
-      </w:r>
-      <w:r>
-        <w:t xml:space="preserve">In alto la fascia</w:t>
-      </w:r>
-      <w:r>
-        <w:t xml:space="preserve"> </w:t>
-      </w:r>
-      <w:r>
-        <w:rPr>
-          <w:b/>
-          <w:bCs/>
-        </w:rPr>
-        <w:t xml:space="preserve">Ticket da seguire</w:t>
-      </w:r>
-      <w:r>
-        <w:t xml:space="preserve">, con una carta per ogni ticket aperto e il pulsante per andare alla CRF.</w:t>
-      </w:r>
-    </w:p>
-    <w:p>
-      <w:pPr>
-        <w:pStyle w:val="Compact"/>
-        <w:numPr>
-          <w:ilvl w:val="0"/>
-          <w:numId w:val="1009"/>
-        </w:numPr>
-      </w:pPr>
-      <w:r>
-        <w:rPr>
-          <w:b/>
-          <w:bCs/>
-        </w:rPr>
-        <w:t xml:space="preserve">News di studio.</w:t>
-      </w:r>
-      <w:r>
-        <w:t xml:space="preserve"> </w:t>
-      </w:r>
-      <w:r>
-        <w:t xml:space="preserve">Una finestra con la comunicazione più recente aperta, con scadenza, priorità ed eventuali allegati.</w:t>
-      </w:r>
-    </w:p>
-    <w:bookmarkEnd w:id="22"/>
-    <w:bookmarkStart w:id="23" w:name="tracciabilità-e-sicurezza"/>
+        <w:t xml:space="preserve">Il blocco vale anche per il completamento di una CRF da</w:t>
+      </w:r>
+      <w:r>
+        <w:t xml:space="preserve"> </w:t>
+      </w:r>
+      <w:r>
+        <w:rPr>
+          <w:b/>
+          <w:bCs/>
+        </w:rPr>
+        <w:t xml:space="preserve">link di compilazione</w:t>
+      </w:r>
+      <w:r>
+        <w:t xml:space="preserve"> </w:t>
+      </w:r>
+      <w:r>
+        <w:t xml:space="preserve">e per l’</w:t>
+      </w:r>
+      <w:r>
+        <w:rPr>
+          <w:b/>
+          <w:bCs/>
+        </w:rPr>
+        <w:t xml:space="preserve">import</w:t>
+      </w:r>
+      <w:r>
+        <w:t xml:space="preserve"> </w:t>
+      </w:r>
+      <w:r>
+        <w:t xml:space="preserve">di CRF già completate (queste ultime richiedono il diritto di conferma).</w:t>
+      </w:r>
+    </w:p>
+    <w:bookmarkEnd w:id="24"/>
+    <w:bookmarkStart w:id="25" w:name="esempi-provati-su-staging"/>
     <w:p>
       <w:pPr>
         <w:pStyle w:val="Heading1"/>
       </w:pPr>
       <w:r>
-        <w:t xml:space="preserve">10. Tracciabilità e sicurezza</w:t>
+        <w:t xml:space="preserve">8. Esempi (provati su staging)</w:t>
+      </w:r>
+    </w:p>
+    <w:p>
+      <w:pPr>
+        <w:pStyle w:val="FirstParagraph"/>
+      </w:pPr>
+      <w:r>
+        <w:rPr>
+          <w:b/>
+          <w:bCs/>
+        </w:rPr>
+        <w:t xml:space="preserve">Esempio A — lo sperimentatore apre a Farmacovigilanza, che chiude.</w:t>
+      </w:r>
+      <w:r>
+        <w:t xml:space="preserve"> </w:t>
+      </w:r>
+      <w:r>
+        <w:t xml:space="preserve">Lo sperimentatore apre un ticket sulla CRF assegnandolo a Farmacovigilanza. La CRF è subito bloccata. Farmacovigilanza lo vede, risponde e lo chiude con una motivazione. Lo sperimentatore legge l’intera conversazione, non può chiudere il ticket lui stesso. A ticket chiuso la CRF si conferma.</w:t>
+      </w:r>
+    </w:p>
+    <w:p>
+      <w:pPr>
+        <w:pStyle w:val="BodyText"/>
+      </w:pPr>
+      <w:r>
+        <w:rPr>
+          <w:b/>
+          <w:bCs/>
+        </w:rPr>
+        <w:t xml:space="preserve">Esempio B — risponde e chiude anche l’admin del centro.</w:t>
+      </w:r>
+      <w:r>
+        <w:t xml:space="preserve"> </w:t>
+      </w:r>
+      <w:r>
+        <w:t xml:space="preserve">Stesso inizio. Dopo la risposta di Farmacovigilanza, l’admin del centro (che vede tutti i ticket del centro) legge la conversazione, aggiunge una risposta e chiude il ticket. La conversazione completa è visibile a tutti i soggetti coinvolti; l’admin conferma la CRF.</w:t>
+      </w:r>
+    </w:p>
+    <w:p>
+      <w:pPr>
+        <w:pStyle w:val="BodyText"/>
+      </w:pPr>
+      <w:r>
+        <w:rPr>
+          <w:b/>
+          <w:bCs/>
+        </w:rPr>
+        <w:t xml:space="preserve">Esempio C — due gruppi sulla stessa CRF.</w:t>
+      </w:r>
+      <w:r>
+        <w:t xml:space="preserve"> </w:t>
+      </w:r>
+      <w:r>
+        <w:t xml:space="preserve">L’admin apre due ticket sulla stessa CRF, uno a Sperimentatori e uno a Farmacovigilanza. Ogni gruppo vede solo il proprio ticket; l’admin li vede entrambi; la conferma resta bloccata finché tutti e due non sono chiusi.</w:t>
+      </w:r>
+    </w:p>
+    <w:p>
+      <w:pPr>
+        <w:pStyle w:val="BodyText"/>
+      </w:pPr>
+      <w:r>
+        <w:rPr>
+          <w:b/>
+          <w:bCs/>
+        </w:rPr>
+        <w:t xml:space="preserve">Esempio D — un utente di un altro gruppo.</w:t>
+      </w:r>
+      <w:r>
+        <w:t xml:space="preserve"> </w:t>
+      </w:r>
+      <w:r>
+        <w:t xml:space="preserve">Un utente di Farmacovigilanza non vede un ticket assegnato a Sperimentatori (anche se vede lo stesso paziente) e non può rispondere. Vede però che la conferma della CRF è bloccata da un ticket aperto.</w:t>
+      </w:r>
+    </w:p>
+    <w:bookmarkEnd w:id="25"/>
+    <w:bookmarkStart w:id="26" w:name="le-schermate"/>
+    <w:p>
+      <w:pPr>
+        <w:pStyle w:val="Heading1"/>
+      </w:pPr>
+      <w:r>
+        <w:t xml:space="preserve">9. Le schermate</w:t>
+      </w:r>
+    </w:p>
+    <w:p>
+      <w:pPr>
+        <w:pStyle w:val="FirstParagraph"/>
+      </w:pPr>
+      <w:r>
+        <w:t xml:space="preserve">L’interfaccia si adatta al dispositivo: computer, tablet e telefono.</w:t>
       </w:r>
     </w:p>
     <w:p>
@@ -2839,23 +2727,82 @@
         </w:numPr>
       </w:pPr>
       <w:r>
-        <w:t xml:space="preserve">Ogni apertura, risposta, chiusura, riapertura, convalida e deroga è</w:t>
-      </w:r>
-      <w:r>
-        <w:t xml:space="preserve"> </w:t>
-      </w:r>
-      <w:r>
-        <w:rPr>
-          <w:b/>
-          <w:bCs/>
-        </w:rPr>
-        <w:t xml:space="preserve">registrata in audit</w:t>
-      </w:r>
-      <w:r>
-        <w:t xml:space="preserve"> </w:t>
-      </w:r>
-      <w:r>
-        <w:t xml:space="preserve">come evento a sé, con chi l’ha fatta, quando, da quale indirizzo, su quale ticket, su quale paziente e CRF, con quale esito; per chiusure, riaperture, convalide e deroghe anche la motivazione. Anche gli accessi negati e le conferme bloccate dai ticket (compreso il completamento da link) sono registrati. Se Zammad rifiuta la scrittura a nome dell’utente e la piattaforma la esegue con l’identità di servizio, ne resta traccia separata. Le consultazioni dei ticket di un paziente si ritrovano dall’audit.</w:t>
+        <w:rPr>
+          <w:b/>
+          <w:bCs/>
+        </w:rPr>
+        <w:t xml:space="preserve">Pannello ticket nella CRF.</w:t>
+      </w:r>
+      <w:r>
+        <w:t xml:space="preserve"> </w:t>
+      </w:r>
+      <w:r>
+        <w:t xml:space="preserve">Si apre dal pulsante</w:t>
+      </w:r>
+      <w:r>
+        <w:t xml:space="preserve"> </w:t>
+      </w:r>
+      <w:r>
+        <w:rPr>
+          <w:i/>
+          <w:iCs/>
+        </w:rPr>
+        <w:t xml:space="preserve">Ticket</w:t>
+      </w:r>
+      <w:r>
+        <w:t xml:space="preserve"> </w:t>
+      </w:r>
+      <w:r>
+        <w:t xml:space="preserve">e mostra a sinistra i filtri (</w:t>
+      </w:r>
+      <w:r>
+        <w:rPr>
+          <w:b/>
+          <w:bCs/>
+        </w:rPr>
+        <w:t xml:space="preserve">Aperti</w:t>
+      </w:r>
+      <w:r>
+        <w:t xml:space="preserve">,</w:t>
+      </w:r>
+      <w:r>
+        <w:t xml:space="preserve"> </w:t>
+      </w:r>
+      <w:r>
+        <w:rPr>
+          <w:b/>
+          <w:bCs/>
+        </w:rPr>
+        <w:t xml:space="preserve">Tutti</w:t>
+      </w:r>
+      <w:r>
+        <w:t xml:space="preserve">,</w:t>
+      </w:r>
+      <w:r>
+        <w:t xml:space="preserve"> </w:t>
+      </w:r>
+      <w:r>
+        <w:rPr>
+          <w:b/>
+          <w:bCs/>
+        </w:rPr>
+        <w:t xml:space="preserve">Da convalidare</w:t>
+      </w:r>
+      <w:r>
+        <w:t xml:space="preserve">) con i conteggi, e sotto la conversazione del ticket scelto. Un pallino segnala i ticket con messaggi nuovi. Per ogni ticket si vede a che punto è:</w:t>
+      </w:r>
+      <w:r>
+        <w:t xml:space="preserve"> </w:t>
+      </w:r>
+      <w:r>
+        <w:rPr>
+          <w:b/>
+          <w:bCs/>
+        </w:rPr>
+        <w:t xml:space="preserve">Aperto → Preso in carico → Chiuso</w:t>
+      </w:r>
+      <w:r>
+        <w:t xml:space="preserve">. In basso si scrive la risposta e, per chi ha il diritto, si chiude il ticket con una motivazione. Sul telefono elenco e conversazione sono due pagine, con la freccia per tornare indietro.</w:t>
       </w:r>
     </w:p>
     <w:p>
@@ -2867,7 +2814,17 @@
         </w:numPr>
       </w:pPr>
       <w:r>
-        <w:t xml:space="preserve">Il testo dei ticket resta nel sistema di ticketing: la piattaforma non ne tiene copia e, per il blocco, scambia solo numero e stato dei ticket.</w:t>
+        <w:rPr>
+          <w:b/>
+          <w:bCs/>
+        </w:rPr>
+        <w:t xml:space="preserve">Avviso «Conferma bloccata».</w:t>
+      </w:r>
+      <w:r>
+        <w:t xml:space="preserve"> </w:t>
+      </w:r>
+      <w:r>
+        <w:t xml:space="preserve">Sopra i pulsanti della CRF un riquadro giallo dice quanti ticket aperti impediscono la conferma e quali sono.</w:t>
       </w:r>
     </w:p>
     <w:p>
@@ -2879,7 +2836,17 @@
         </w:numPr>
       </w:pPr>
       <w:r>
-        <w:t xml:space="preserve">Le conversazioni sono mostrate come solo testo (niente HTML, script o indirizzi e-mail).</w:t>
+        <w:rPr>
+          <w:b/>
+          <w:bCs/>
+        </w:rPr>
+        <w:t xml:space="preserve">Nuovo ticket.</w:t>
+      </w:r>
+      <w:r>
+        <w:t xml:space="preserve"> </w:t>
+      </w:r>
+      <w:r>
+        <w:t xml:space="preserve">Una sola finestra in tre passi: a quale gruppo inviarlo, la priorità, e cosa succede (con scorciatoie come «Dato incongruente» o «Chiarimento»). Ricorda in testa paziente, ciclo e CRF, e avvisa che la CRF resta non confermabile finché il ticket non è chiuso.</w:t>
       </w:r>
     </w:p>
     <w:p>
@@ -2891,7 +2858,92 @@
         </w:numPr>
       </w:pPr>
       <w:r>
-        <w:t xml:space="preserve">I diritti di visibilità sono verificati dal server a ogni richiesta; se un controllo non è possibile, l’accesso è negato.</w:t>
+        <w:rPr>
+          <w:b/>
+          <w:bCs/>
+        </w:rPr>
+        <w:t xml:space="preserve">I miei ticket.</w:t>
+      </w:r>
+      <w:r>
+        <w:t xml:space="preserve"> </w:t>
+      </w:r>
+      <w:r>
+        <w:t xml:space="preserve">Elenco di tutti i ticket dell’utente con filtri (</w:t>
+      </w:r>
+      <w:r>
+        <w:rPr>
+          <w:b/>
+          <w:bCs/>
+        </w:rPr>
+        <w:t xml:space="preserve">Aperti</w:t>
+      </w:r>
+      <w:r>
+        <w:t xml:space="preserve">,</w:t>
+      </w:r>
+      <w:r>
+        <w:t xml:space="preserve"> </w:t>
+      </w:r>
+      <w:r>
+        <w:rPr>
+          <w:b/>
+          <w:bCs/>
+        </w:rPr>
+        <w:t xml:space="preserve">Assegnati a me</w:t>
+      </w:r>
+      <w:r>
+        <w:t xml:space="preserve">,</w:t>
+      </w:r>
+      <w:r>
+        <w:t xml:space="preserve"> </w:t>
+      </w:r>
+      <w:r>
+        <w:rPr>
+          <w:b/>
+          <w:bCs/>
+        </w:rPr>
+        <w:t xml:space="preserve">Aperti da me</w:t>
+      </w:r>
+      <w:r>
+        <w:t xml:space="preserve">,</w:t>
+      </w:r>
+      <w:r>
+        <w:t xml:space="preserve"> </w:t>
+      </w:r>
+      <w:r>
+        <w:rPr>
+          <w:b/>
+          <w:bCs/>
+        </w:rPr>
+        <w:t xml:space="preserve">Da convalidare</w:t>
+      </w:r>
+      <w:r>
+        <w:t xml:space="preserve">,</w:t>
+      </w:r>
+      <w:r>
+        <w:t xml:space="preserve"> </w:t>
+      </w:r>
+      <w:r>
+        <w:rPr>
+          <w:b/>
+          <w:bCs/>
+        </w:rPr>
+        <w:t xml:space="preserve">Chiusi</w:t>
+      </w:r>
+      <w:r>
+        <w:t xml:space="preserve">) e ricerca. Su schermi larghi a destra c’è l’anteprima con gli ultimi messaggi e il pulsante</w:t>
+      </w:r>
+      <w:r>
+        <w:t xml:space="preserve"> </w:t>
+      </w:r>
+      <w:r>
+        <w:rPr>
+          <w:b/>
+          <w:bCs/>
+        </w:rPr>
+        <w:t xml:space="preserve">Apri la CRF</w:t>
+      </w:r>
+      <w:r>
+        <w:t xml:space="preserve">.</w:t>
       </w:r>
     </w:p>
     <w:p>
@@ -2903,6 +2955,137 @@
         </w:numPr>
       </w:pPr>
       <w:r>
+        <w:rPr>
+          <w:b/>
+          <w:bCs/>
+        </w:rPr>
+        <w:t xml:space="preserve">Home del paziente.</w:t>
+      </w:r>
+      <w:r>
+        <w:t xml:space="preserve"> </w:t>
+      </w:r>
+      <w:r>
+        <w:t xml:space="preserve">In alto la fascia</w:t>
+      </w:r>
+      <w:r>
+        <w:t xml:space="preserve"> </w:t>
+      </w:r>
+      <w:r>
+        <w:rPr>
+          <w:b/>
+          <w:bCs/>
+        </w:rPr>
+        <w:t xml:space="preserve">Ticket da seguire</w:t>
+      </w:r>
+      <w:r>
+        <w:t xml:space="preserve">, con una carta per ogni ticket aperto e il pulsante per andare alla CRF.</w:t>
+      </w:r>
+    </w:p>
+    <w:p>
+      <w:pPr>
+        <w:pStyle w:val="Compact"/>
+        <w:numPr>
+          <w:ilvl w:val="0"/>
+          <w:numId w:val="1010"/>
+        </w:numPr>
+      </w:pPr>
+      <w:r>
+        <w:rPr>
+          <w:b/>
+          <w:bCs/>
+        </w:rPr>
+        <w:t xml:space="preserve">News di studio.</w:t>
+      </w:r>
+      <w:r>
+        <w:t xml:space="preserve"> </w:t>
+      </w:r>
+      <w:r>
+        <w:t xml:space="preserve">Una finestra con la comunicazione più recente aperta, con scadenza, priorità ed eventuali allegati.</w:t>
+      </w:r>
+    </w:p>
+    <w:bookmarkEnd w:id="26"/>
+    <w:bookmarkStart w:id="27" w:name="tracciabilità-e-sicurezza"/>
+    <w:p>
+      <w:pPr>
+        <w:pStyle w:val="Heading1"/>
+      </w:pPr>
+      <w:r>
+        <w:t xml:space="preserve">10. Tracciabilità e sicurezza</w:t>
+      </w:r>
+    </w:p>
+    <w:p>
+      <w:pPr>
+        <w:pStyle w:val="Compact"/>
+        <w:numPr>
+          <w:ilvl w:val="0"/>
+          <w:numId w:val="1011"/>
+        </w:numPr>
+      </w:pPr>
+      <w:r>
+        <w:t xml:space="preserve">Ogni apertura, risposta, chiusura, riapertura, convalida e deroga è</w:t>
+      </w:r>
+      <w:r>
+        <w:t xml:space="preserve"> </w:t>
+      </w:r>
+      <w:r>
+        <w:rPr>
+          <w:b/>
+          <w:bCs/>
+        </w:rPr>
+        <w:t xml:space="preserve">registrata in audit</w:t>
+      </w:r>
+      <w:r>
+        <w:t xml:space="preserve"> </w:t>
+      </w:r>
+      <w:r>
+        <w:t xml:space="preserve">come evento a sé, con chi l’ha fatta, quando, da quale indirizzo, su quale ticket, su quale paziente e CRF, con quale esito; per chiusure, riaperture, convalide e deroghe anche la motivazione. Anche gli accessi negati e le conferme bloccate dai ticket (compreso il completamento da link) sono registrati. Se Zammad rifiuta la scrittura a nome dell’utente e la piattaforma la esegue con l’identità di servizio, ne resta traccia separata. Le consultazioni dei ticket di un paziente si ritrovano dall’audit.</w:t>
+      </w:r>
+    </w:p>
+    <w:p>
+      <w:pPr>
+        <w:pStyle w:val="Compact"/>
+        <w:numPr>
+          <w:ilvl w:val="0"/>
+          <w:numId w:val="1011"/>
+        </w:numPr>
+      </w:pPr>
+      <w:r>
+        <w:t xml:space="preserve">Il testo dei ticket resta nel sistema di ticketing: la piattaforma non ne tiene copia e, per il blocco, scambia solo numero e stato dei ticket.</w:t>
+      </w:r>
+    </w:p>
+    <w:p>
+      <w:pPr>
+        <w:pStyle w:val="Compact"/>
+        <w:numPr>
+          <w:ilvl w:val="0"/>
+          <w:numId w:val="1011"/>
+        </w:numPr>
+      </w:pPr>
+      <w:r>
+        <w:t xml:space="preserve">Le conversazioni sono mostrate come solo testo (niente HTML, script o indirizzi e-mail).</w:t>
+      </w:r>
+    </w:p>
+    <w:p>
+      <w:pPr>
+        <w:pStyle w:val="Compact"/>
+        <w:numPr>
+          <w:ilvl w:val="0"/>
+          <w:numId w:val="1011"/>
+        </w:numPr>
+      </w:pPr>
+      <w:r>
+        <w:t xml:space="preserve">I diritti di visibilità sono verificati dal server a ogni richiesta; se un controllo non è possibile, l’accesso è negato.</w:t>
+      </w:r>
+    </w:p>
+    <w:p>
+      <w:pPr>
+        <w:pStyle w:val="Compact"/>
+        <w:numPr>
+          <w:ilvl w:val="0"/>
+          <w:numId w:val="1011"/>
+        </w:numPr>
+      </w:pPr>
+      <w:r>
         <w:t xml:space="preserve">Gli allegati (solo news di studio) sono verificati per tipo, contenuto e dimensione.</w:t>
       </w:r>
       <w:r>
@@ -2916,8 +3099,8 @@
         <w:t xml:space="preserve">Non è attivo un antivirus sugli allegati.</w:t>
       </w:r>
     </w:p>
-    <w:bookmarkEnd w:id="23"/>
-    <w:bookmarkStart w:id="24" w:name="X3e39e6f22f3c8c14cee439c9d9349ed4bc17387"/>
+    <w:bookmarkEnd w:id="27"/>
+    <w:bookmarkStart w:id="28" w:name="X3e39e6f22f3c8c14cee439c9d9349ed4bc17387"/>
     <w:p>
       <w:pPr>
         <w:pStyle w:val="Heading1"/>
@@ -3037,8 +3220,8 @@
         </w:tc>
       </w:tr>
     </w:tbl>
-    <w:bookmarkEnd w:id="24"/>
-    <w:bookmarkStart w:id="25" w:name="scelte-concordate-e-punti-da-ricordare"/>
+    <w:bookmarkEnd w:id="28"/>
+    <w:bookmarkStart w:id="29" w:name="scelte-concordate-e-punti-da-ricordare"/>
     <w:p>
       <w:pPr>
         <w:pStyle w:val="Heading1"/>
@@ -3052,7 +3235,7 @@
         <w:pStyle w:val="Compact"/>
         <w:numPr>
           <w:ilvl w:val="0"/>
-          <w:numId w:val="1011"/>
+          <w:numId w:val="1012"/>
         </w:numPr>
       </w:pPr>
       <w:r>
@@ -3080,7 +3263,7 @@
         <w:pStyle w:val="Compact"/>
         <w:numPr>
           <w:ilvl w:val="0"/>
-          <w:numId w:val="1011"/>
+          <w:numId w:val="1012"/>
         </w:numPr>
       </w:pPr>
       <w:r>
@@ -3102,7 +3285,7 @@
         <w:pStyle w:val="Compact"/>
         <w:numPr>
           <w:ilvl w:val="0"/>
-          <w:numId w:val="1011"/>
+          <w:numId w:val="1012"/>
         </w:numPr>
       </w:pPr>
       <w:r>
@@ -3130,7 +3313,7 @@
         <w:pStyle w:val="Compact"/>
         <w:numPr>
           <w:ilvl w:val="0"/>
-          <w:numId w:val="1011"/>
+          <w:numId w:val="1012"/>
         </w:numPr>
       </w:pPr>
       <w:r>
@@ -3158,7 +3341,7 @@
         <w:pStyle w:val="Compact"/>
         <w:numPr>
           <w:ilvl w:val="0"/>
-          <w:numId w:val="1011"/>
+          <w:numId w:val="1012"/>
         </w:numPr>
       </w:pPr>
       <w:r>
@@ -3186,7 +3369,7 @@
         <w:pStyle w:val="Compact"/>
         <w:numPr>
           <w:ilvl w:val="0"/>
-          <w:numId w:val="1011"/>
+          <w:numId w:val="1012"/>
         </w:numPr>
       </w:pPr>
       <w:r>
@@ -3214,7 +3397,7 @@
         <w:pStyle w:val="Compact"/>
         <w:numPr>
           <w:ilvl w:val="0"/>
-          <w:numId w:val="1011"/>
+          <w:numId w:val="1012"/>
         </w:numPr>
       </w:pPr>
       <w:r>
@@ -3242,14 +3425,14 @@
         <w:pStyle w:val="Compact"/>
         <w:numPr>
           <w:ilvl w:val="0"/>
-          <w:numId w:val="1011"/>
+          <w:numId w:val="1012"/>
         </w:numPr>
       </w:pPr>
       <w:r>
         <w:t xml:space="preserve">Restano da definire con il cliente: chi è «l’assistenza» nel messaggio di manutenzione, le modalità di revisione periodica delle deroghe, la conservazione dei ticket chiusi e l’eventuale antivirus sugli allegati.</w:t>
       </w:r>
     </w:p>
-    <w:bookmarkEnd w:id="25"/>
+    <w:bookmarkEnd w:id="29"/>
     <w:sectPr>
       <w:footnotePr>
         <w:numRestart w:val="eachSect"/>
@@ -3555,6 +3738,9 @@
     <w:abstractNumId w:val="991"/>
   </w:num>
   <w:num w:numId="1002">
+    <w:abstractNumId w:val="991"/>
+  </w:num>
+  <w:num w:numId="1003">
     <w:abstractNumId w:val="99411"/>
     <w:lvlOverride w:ilvl="0">
       <w:startOverride w:val="1"/>
@@ -3584,41 +3770,11 @@
       <w:startOverride w:val="1"/>
     </w:lvlOverride>
   </w:num>
-  <w:num w:numId="1003">
-    <w:abstractNumId w:val="991"/>
-  </w:num>
   <w:num w:numId="1004">
     <w:abstractNumId w:val="991"/>
   </w:num>
   <w:num w:numId="1005">
-    <w:abstractNumId w:val="99411"/>
-    <w:lvlOverride w:ilvl="0">
-      <w:startOverride w:val="1"/>
-    </w:lvlOverride>
-    <w:lvlOverride w:ilvl="1">
-      <w:startOverride w:val="1"/>
-    </w:lvlOverride>
-    <w:lvlOverride w:ilvl="2">
-      <w:startOverride w:val="1"/>
-    </w:lvlOverride>
-    <w:lvlOverride w:ilvl="3">
-      <w:startOverride w:val="1"/>
-    </w:lvlOverride>
-    <w:lvlOverride w:ilvl="4">
-      <w:startOverride w:val="1"/>
-    </w:lvlOverride>
-    <w:lvlOverride w:ilvl="5">
-      <w:startOverride w:val="1"/>
-    </w:lvlOverride>
-    <w:lvlOverride w:ilvl="6">
-      <w:startOverride w:val="1"/>
-    </w:lvlOverride>
-    <w:lvlOverride w:ilvl="7">
-      <w:startOverride w:val="1"/>
-    </w:lvlOverride>
-    <w:lvlOverride w:ilvl="8">
-      <w:startOverride w:val="1"/>
-    </w:lvlOverride>
+    <w:abstractNumId w:val="991"/>
   </w:num>
   <w:num w:numId="1006">
     <w:abstractNumId w:val="99411"/>
@@ -3681,7 +3837,34 @@
     </w:lvlOverride>
   </w:num>
   <w:num w:numId="1008">
-    <w:abstractNumId w:val="991"/>
+    <w:abstractNumId w:val="99411"/>
+    <w:lvlOverride w:ilvl="0">
+      <w:startOverride w:val="1"/>
+    </w:lvlOverride>
+    <w:lvlOverride w:ilvl="1">
+      <w:startOverride w:val="1"/>
+    </w:lvlOverride>
+    <w:lvlOverride w:ilvl="2">
+      <w:startOverride w:val="1"/>
+    </w:lvlOverride>
+    <w:lvlOverride w:ilvl="3">
+      <w:startOverride w:val="1"/>
+    </w:lvlOverride>
+    <w:lvlOverride w:ilvl="4">
+      <w:startOverride w:val="1"/>
+    </w:lvlOverride>
+    <w:lvlOverride w:ilvl="5">
+      <w:startOverride w:val="1"/>
+    </w:lvlOverride>
+    <w:lvlOverride w:ilvl="6">
+      <w:startOverride w:val="1"/>
+    </w:lvlOverride>
+    <w:lvlOverride w:ilvl="7">
+      <w:startOverride w:val="1"/>
+    </w:lvlOverride>
+    <w:lvlOverride w:ilvl="8">
+      <w:startOverride w:val="1"/>
+    </w:lvlOverride>
   </w:num>
   <w:num w:numId="1009">
     <w:abstractNumId w:val="991"/>
@@ -3690,6 +3873,9 @@
     <w:abstractNumId w:val="991"/>
   </w:num>
   <w:num w:numId="1011">
+    <w:abstractNumId w:val="991"/>
+  </w:num>
+  <w:num w:numId="1012">
     <w:abstractNumId w:val="991"/>
   </w:num>
 </w:numbering>
@@ -4351,7 +4537,7 @@
       <w:color w:themeColor="accent1" w:themeShade="BF" w:val="365F91"/>
     </w:rPr>
   </w:style>
-  <w:style w:type="paragraph" w:customStyle="1" w:styleId="SourceCode">
+  <w:style w:customStyle="1" w:styleId="SourceCode" w:type="paragraph">
     <w:name w:val="Source Code"/>
     <w:basedOn w:val="Normal"/>
     <w:link w:val="VerbatimChar"/>
@@ -4359,7 +4545,7 @@
       <w:wordWrap w:val="off"/>
     </w:pPr>
   </w:style>
-  <w:style w:type="character" w:customStyle="1" w:styleId="KeywordTok">
+  <w:style w:customStyle="1" w:styleId="KeywordTok" w:type="character">
     <w:name w:val="KeywordTok"/>
     <w:basedOn w:val="VerbatimChar"/>
     <w:rPr>
@@ -4367,77 +4553,77 @@
       <w:color w:val="007020"/>
     </w:rPr>
   </w:style>
-  <w:style w:type="character" w:customStyle="1" w:styleId="DataTypeTok">
+  <w:style w:customStyle="1" w:styleId="DataTypeTok" w:type="character">
     <w:name w:val="DataTypeTok"/>
     <w:basedOn w:val="VerbatimChar"/>
     <w:rPr>
       <w:color w:val="902000"/>
     </w:rPr>
   </w:style>
-  <w:style w:type="character" w:customStyle="1" w:styleId="DecValTok">
+  <w:style w:customStyle="1" w:styleId="DecValTok" w:type="character">
     <w:name w:val="DecValTok"/>
     <w:basedOn w:val="VerbatimChar"/>
     <w:rPr>
       <w:color w:val="40a070"/>
     </w:rPr>
   </w:style>
-  <w:style w:type="character" w:customStyle="1" w:styleId="BaseNTok">
+  <w:style w:customStyle="1" w:styleId="BaseNTok" w:type="character">
     <w:name w:val="BaseNTok"/>
     <w:basedOn w:val="VerbatimChar"/>
     <w:rPr>
       <w:color w:val="40a070"/>
     </w:rPr>
   </w:style>
-  <w:style w:type="character" w:customStyle="1" w:styleId="FloatTok">
+  <w:style w:customStyle="1" w:styleId="FloatTok" w:type="character">
     <w:name w:val="FloatTok"/>
     <w:basedOn w:val="VerbatimChar"/>
     <w:rPr>
       <w:color w:val="40a070"/>
     </w:rPr>
   </w:style>
-  <w:style w:type="character" w:customStyle="1" w:styleId="ConstantTok">
+  <w:style w:customStyle="1" w:styleId="ConstantTok" w:type="character">
     <w:name w:val="ConstantTok"/>
     <w:basedOn w:val="VerbatimChar"/>
     <w:rPr>
       <w:color w:val="880000"/>
     </w:rPr>
   </w:style>
-  <w:style w:type="character" w:customStyle="1" w:styleId="CharTok">
+  <w:style w:customStyle="1" w:styleId="CharTok" w:type="character">
     <w:name w:val="CharTok"/>
     <w:basedOn w:val="VerbatimChar"/>
     <w:rPr>
       <w:color w:val="4070a0"/>
     </w:rPr>
   </w:style>
-  <w:style w:type="character" w:customStyle="1" w:styleId="SpecialCharTok">
+  <w:style w:customStyle="1" w:styleId="SpecialCharTok" w:type="character">
     <w:name w:val="SpecialCharTok"/>
     <w:basedOn w:val="VerbatimChar"/>
     <w:rPr>
       <w:color w:val="4070a0"/>
     </w:rPr>
   </w:style>
-  <w:style w:type="character" w:customStyle="1" w:styleId="StringTok">
+  <w:style w:customStyle="1" w:styleId="StringTok" w:type="character">
     <w:name w:val="StringTok"/>
     <w:basedOn w:val="VerbatimChar"/>
     <w:rPr>
       <w:color w:val="4070a0"/>
     </w:rPr>
   </w:style>
-  <w:style w:type="character" w:customStyle="1" w:styleId="VerbatimStringTok">
+  <w:style w:customStyle="1" w:styleId="VerbatimStringTok" w:type="character">
     <w:name w:val="VerbatimStringTok"/>
     <w:basedOn w:val="VerbatimChar"/>
     <w:rPr>
       <w:color w:val="4070a0"/>
     </w:rPr>
   </w:style>
-  <w:style w:type="character" w:customStyle="1" w:styleId="SpecialStringTok">
+  <w:style w:customStyle="1" w:styleId="SpecialStringTok" w:type="character">
     <w:name w:val="SpecialStringTok"/>
     <w:basedOn w:val="VerbatimChar"/>
     <w:rPr>
       <w:color w:val="bb6688"/>
     </w:rPr>
   </w:style>
-  <w:style w:type="character" w:customStyle="1" w:styleId="ImportTok">
+  <w:style w:customStyle="1" w:styleId="ImportTok" w:type="character">
     <w:name w:val="ImportTok"/>
     <w:basedOn w:val="VerbatimChar"/>
     <w:rPr>
@@ -4445,7 +4631,7 @@
       <w:color w:val="008000"/>
     </w:rPr>
   </w:style>
-  <w:style w:type="character" w:customStyle="1" w:styleId="CommentTok">
+  <w:style w:customStyle="1" w:styleId="CommentTok" w:type="character">
     <w:name w:val="CommentTok"/>
     <w:basedOn w:val="VerbatimChar"/>
     <w:rPr>
@@ -4453,7 +4639,7 @@
       <w:color w:val="60a0b0"/>
     </w:rPr>
   </w:style>
-  <w:style w:type="character" w:customStyle="1" w:styleId="DocumentationTok">
+  <w:style w:customStyle="1" w:styleId="DocumentationTok" w:type="character">
     <w:name w:val="DocumentationTok"/>
     <w:basedOn w:val="VerbatimChar"/>
     <w:rPr>
@@ -4461,7 +4647,7 @@
       <w:color w:val="ba2121"/>
     </w:rPr>
   </w:style>
-  <w:style w:type="character" w:customStyle="1" w:styleId="AnnotationTok">
+  <w:style w:customStyle="1" w:styleId="AnnotationTok" w:type="character">
     <w:name w:val="AnnotationTok"/>
     <w:basedOn w:val="VerbatimChar"/>
     <w:rPr>
@@ -4470,7 +4656,7 @@
       <w:color w:val="60a0b0"/>
     </w:rPr>
   </w:style>
-  <w:style w:type="character" w:customStyle="1" w:styleId="CommentVarTok">
+  <w:style w:customStyle="1" w:styleId="CommentVarTok" w:type="character">
     <w:name w:val="CommentVarTok"/>
     <w:basedOn w:val="VerbatimChar"/>
     <w:rPr>
@@ -4479,28 +4665,28 @@
       <w:color w:val="60a0b0"/>
     </w:rPr>
   </w:style>
-  <w:style w:type="character" w:customStyle="1" w:styleId="OtherTok">
+  <w:style w:customStyle="1" w:styleId="OtherTok" w:type="character">
     <w:name w:val="OtherTok"/>
     <w:basedOn w:val="VerbatimChar"/>
     <w:rPr>
       <w:color w:val="007020"/>
     </w:rPr>
   </w:style>
-  <w:style w:type="character" w:customStyle="1" w:styleId="FunctionTok">
+  <w:style w:customStyle="1" w:styleId="FunctionTok" w:type="character">
     <w:name w:val="FunctionTok"/>
     <w:basedOn w:val="VerbatimChar"/>
     <w:rPr>
       <w:color w:val="06287e"/>
     </w:rPr>
   </w:style>
-  <w:style w:type="character" w:customStyle="1" w:styleId="VariableTok">
+  <w:style w:customStyle="1" w:styleId="VariableTok" w:type="character">
     <w:name w:val="VariableTok"/>
     <w:basedOn w:val="VerbatimChar"/>
     <w:rPr>
       <w:color w:val="19177c"/>
     </w:rPr>
   </w:style>
-  <w:style w:type="character" w:customStyle="1" w:styleId="ControlFlowTok">
+  <w:style w:customStyle="1" w:styleId="ControlFlowTok" w:type="character">
     <w:name w:val="ControlFlowTok"/>
     <w:basedOn w:val="VerbatimChar"/>
     <w:rPr>
@@ -4508,45 +4694,45 @@
       <w:color w:val="007020"/>
     </w:rPr>
   </w:style>
-  <w:style w:type="character" w:customStyle="1" w:styleId="OperatorTok">
+  <w:style w:customStyle="1" w:styleId="OperatorTok" w:type="character">
     <w:name w:val="OperatorTok"/>
     <w:basedOn w:val="VerbatimChar"/>
     <w:rPr>
       <w:color w:val="666666"/>
     </w:rPr>
   </w:style>
-  <w:style w:type="character" w:customStyle="1" w:styleId="BuiltInTok">
+  <w:style w:customStyle="1" w:styleId="BuiltInTok" w:type="character">
     <w:name w:val="BuiltInTok"/>
     <w:basedOn w:val="VerbatimChar"/>
     <w:rPr>
       <w:color w:val="008000"/>
     </w:rPr>
   </w:style>
-  <w:style w:type="character" w:customStyle="1" w:styleId="ExtensionTok">
+  <w:style w:customStyle="1" w:styleId="ExtensionTok" w:type="character">
     <w:name w:val="ExtensionTok"/>
     <w:basedOn w:val="VerbatimChar"/>
     <w:rPr/>
   </w:style>
-  <w:style w:type="character" w:customStyle="1" w:styleId="PreprocessorTok">
+  <w:style w:customStyle="1" w:styleId="PreprocessorTok" w:type="character">
     <w:name w:val="PreprocessorTok"/>
     <w:basedOn w:val="VerbatimChar"/>
     <w:rPr>
       <w:color w:val="bc7a00"/>
     </w:rPr>
   </w:style>
-  <w:style w:type="character" w:customStyle="1" w:styleId="AttributeTok">
+  <w:style w:customStyle="1" w:styleId="AttributeTok" w:type="character">
     <w:name w:val="AttributeTok"/>
     <w:basedOn w:val="VerbatimChar"/>
     <w:rPr>
       <w:color w:val="7d9029"/>
     </w:rPr>
   </w:style>
-  <w:style w:type="character" w:customStyle="1" w:styleId="RegionMarkerTok">
+  <w:style w:customStyle="1" w:styleId="RegionMarkerTok" w:type="character">
     <w:name w:val="RegionMarkerTok"/>
     <w:basedOn w:val="VerbatimChar"/>
     <w:rPr/>
   </w:style>
-  <w:style w:type="character" w:customStyle="1" w:styleId="InformationTok">
+  <w:style w:customStyle="1" w:styleId="InformationTok" w:type="character">
     <w:name w:val="InformationTok"/>
     <w:basedOn w:val="VerbatimChar"/>
     <w:rPr>
@@ -4555,7 +4741,7 @@
       <w:color w:val="60a0b0"/>
     </w:rPr>
   </w:style>
-  <w:style w:type="character" w:customStyle="1" w:styleId="WarningTok">
+  <w:style w:customStyle="1" w:styleId="WarningTok" w:type="character">
     <w:name w:val="WarningTok"/>
     <w:basedOn w:val="VerbatimChar"/>
     <w:rPr>
@@ -4564,7 +4750,7 @@
       <w:color w:val="60a0b0"/>
     </w:rPr>
   </w:style>
-  <w:style w:type="character" w:customStyle="1" w:styleId="AlertTok">
+  <w:style w:customStyle="1" w:styleId="AlertTok" w:type="character">
     <w:name w:val="AlertTok"/>
     <w:basedOn w:val="VerbatimChar"/>
     <w:rPr>
@@ -4572,7 +4758,7 @@
       <w:color w:val="ff0000"/>
     </w:rPr>
   </w:style>
-  <w:style w:type="character" w:customStyle="1" w:styleId="ErrorTok">
+  <w:style w:customStyle="1" w:styleId="ErrorTok" w:type="character">
     <w:name w:val="ErrorTok"/>
     <w:basedOn w:val="VerbatimChar"/>
     <w:rPr>
@@ -4580,7 +4766,7 @@
       <w:color w:val="ff0000"/>
     </w:rPr>
   </w:style>
-  <w:style w:type="character" w:customStyle="1" w:styleId="NormalTok">
+  <w:style w:customStyle="1" w:styleId="NormalTok" w:type="character">
     <w:name w:val="NormalTok"/>
     <w:basedOn w:val="VerbatimChar"/>
     <w:rPr/>

</xml_diff>

<commit_message>
docs: Conferma CRF visibile ma disabilitata per chi non puo' confermare; nuova guida utente Conferma delle CRF
Co-Authored-By: Claude Sonnet 5.5 <noreply@anthropic.com>
Claude-Session: https://claude.ai/code/session_014axR6CJanoKHGFA8RuSGoR
</commit_message>
<xml_diff>
--- a/docs/superpowers/specs/2026-10-25-ticket-crf-documento-funzionale-cliente.docx
+++ b/docs/superpowers/specs/2026-10-25-ticket-crf-documento-funzionale-cliente.docx
@@ -26,7 +26,7 @@
         <w:t xml:space="preserve">25 ottobre 2026</w:t>
       </w:r>
     </w:p>
-    <w:bookmarkStart w:id="13" w:name="scopo"/>
+    <w:bookmarkStart w:id="22" w:name="scopo"/>
     <w:p>
       <w:pPr>
         <w:pStyle w:val="Heading1"/>
@@ -98,7 +98,7 @@
         <w:t xml:space="preserve">Questo documento descrive come funzionano i ticket tra i diversi gruppi di utenti e nei diversi tipi di ticket, cosa vede e cosa può fare ciascuno, e quali prove sono state eseguite.</w:t>
       </w:r>
     </w:p>
-    <w:bookmarkStart w:id="12" w:name="architettura-in-breve"/>
+    <w:bookmarkStart w:id="21" w:name="architettura-in-breve"/>
     <w:p>
       <w:pPr>
         <w:pStyle w:val="Heading2"/>
@@ -234,18 +234,18 @@
           <wp:inline>
             <wp:extent cx="5334000" cy="3413760"/>
             <wp:effectExtent b="0" l="0" r="0" t="0"/>
-            <wp:docPr descr="Architettura dei ticket sulle CRF" title="" id="10" name="Picture"/>
+            <wp:docPr descr="Architettura dei ticket sulle CRF" title="" id="19" name="Picture"/>
             <a:graphic>
               <a:graphicData uri="http://schemas.openxmlformats.org/drawingml/2006/picture">
                 <pic:pic>
                   <pic:nvPicPr>
-                    <pic:cNvPr descr="img/ticket-crf-architettura.png" id="11" name="Picture"/>
+                    <pic:cNvPr descr="img/ticket-crf-architettura.png" id="20" name="Picture"/>
                     <pic:cNvPicPr>
                       <a:picLocks noChangeArrowheads="1" noChangeAspect="1"/>
                     </pic:cNvPicPr>
                   </pic:nvPicPr>
                   <pic:blipFill>
-                    <a:blip r:embed="rId9"/>
+                    <a:blip r:embed="rId18"/>
                     <a:stretch>
                       <a:fillRect/>
                     </a:stretch>
@@ -280,9 +280,9 @@
         <w:t xml:space="preserve">Architettura dei ticket sulle CRF</w:t>
       </w:r>
     </w:p>
-    <w:bookmarkEnd w:id="12"/>
-    <w:bookmarkEnd w:id="13"/>
-    <w:bookmarkStart w:id="15" w:name="le-tipologie-di-ticket"/>
+    <w:bookmarkEnd w:id="21"/>
+    <w:bookmarkEnd w:id="22"/>
+    <w:bookmarkStart w:id="24" w:name="le-tipologie-di-ticket"/>
     <w:p>
       <w:pPr>
         <w:pStyle w:val="Heading1"/>
@@ -675,7 +675,7 @@
         <w:t xml:space="preserve">(compresi i diari): non hanno ticket né il pulsante «Conferma CRF».</w:t>
       </w:r>
     </w:p>
-    <w:bookmarkStart w:id="14" w:name="stati-di-un-ticket"/>
+    <w:bookmarkStart w:id="23" w:name="stati-di-un-ticket"/>
     <w:p>
       <w:pPr>
         <w:pStyle w:val="Heading2"/>
@@ -776,9 +776,9 @@
         <w:t xml:space="preserve">ad un altro ticket: non blocca.</w:t>
       </w:r>
     </w:p>
-    <w:bookmarkEnd w:id="14"/>
-    <w:bookmarkEnd w:id="15"/>
-    <w:bookmarkStart w:id="16" w:name="gruppi-e-ruoli"/>
+    <w:bookmarkEnd w:id="23"/>
+    <w:bookmarkEnd w:id="24"/>
+    <w:bookmarkStart w:id="25" w:name="gruppi-e-ruoli"/>
     <w:p>
       <w:pPr>
         <w:pStyle w:val="Heading1"/>
@@ -1163,8 +1163,8 @@
         <w:t xml:space="preserve">se il suo gruppo non ha quel diritto.</w:t>
       </w:r>
     </w:p>
-    <w:bookmarkEnd w:id="16"/>
-    <w:bookmarkStart w:id="18" w:name="chi-vede-un-ticket-di-crf"/>
+    <w:bookmarkEnd w:id="25"/>
+    <w:bookmarkStart w:id="27" w:name="chi-vede-un-ticket-di-crf"/>
     <w:p>
       <w:pPr>
         <w:pStyle w:val="Heading1"/>
@@ -1349,7 +1349,7 @@
         <w:t xml:space="preserve">: se una CRF ha un ticket aperto, nessuno la conferma, anche chi non vede il ticket. A chi non lo vede il sistema comunica solo che ci sono ticket aperti (numero e stato), senza titolo né testo.</w:t>
       </w:r>
     </w:p>
-    <w:bookmarkStart w:id="17" w:name="assegnazione-a-uno-o-più-gruppi"/>
+    <w:bookmarkStart w:id="26" w:name="assegnazione-a-uno-o-più-gruppi"/>
     <w:p>
       <w:pPr>
         <w:pStyle w:val="Heading2"/>
@@ -1440,9 +1440,9 @@
         <w:t xml:space="preserve">, uno per gruppo. Ognuno vede solo il proprio; l’admin del centro li vede entrambi; la CRF resta bloccata finché non sono chiusi tutti e due.</w:t>
       </w:r>
     </w:p>
-    <w:bookmarkEnd w:id="17"/>
-    <w:bookmarkEnd w:id="18"/>
-    <w:bookmarkStart w:id="19" w:name="ciclo-di-vita-di-un-ticket-di-crf"/>
+    <w:bookmarkEnd w:id="26"/>
+    <w:bookmarkEnd w:id="27"/>
+    <w:bookmarkStart w:id="28" w:name="ciclo-di-vita-di-un-ticket-di-crf"/>
     <w:p>
       <w:pPr>
         <w:pStyle w:val="Heading1"/>
@@ -1688,8 +1688,8 @@
         <w:t xml:space="preserve">quella chiusura dal pannello con una motivazione. Il segno di chiusura è firmato dalla piattaforma: non si può simulare scrivendolo a mano.</w:t>
       </w:r>
     </w:p>
-    <w:bookmarkEnd w:id="19"/>
-    <w:bookmarkStart w:id="23" w:name="chiudere-un-ticket-e-confermare-una-crf"/>
+    <w:bookmarkEnd w:id="28"/>
+    <w:bookmarkStart w:id="32" w:name="chiudere-un-ticket-e-confermare-una-crf"/>
     <w:p>
       <w:pPr>
         <w:pStyle w:val="Heading1"/>
@@ -1766,7 +1766,7 @@
         <w:t xml:space="preserve">                              conferma della CRF</w:t>
       </w:r>
     </w:p>
-    <w:bookmarkStart w:id="20" w:name="chiudere-un-ticket"/>
+    <w:bookmarkStart w:id="29" w:name="chiudere-un-ticket"/>
     <w:p>
       <w:pPr>
         <w:pStyle w:val="Heading2"/>
@@ -1880,8 +1880,8 @@
         <w:t xml:space="preserve">: viene scritto sul ticket un segno di chiusura firmato. Una chiusura fatta direttamente nel sistema di ticketing non basta (vedi paragrafo 5).</w:t>
       </w:r>
     </w:p>
-    <w:bookmarkEnd w:id="20"/>
-    <w:bookmarkStart w:id="21" w:name="confermare-una-crf"/>
+    <w:bookmarkEnd w:id="29"/>
+    <w:bookmarkStart w:id="30" w:name="confermare-una-crf"/>
     <w:p>
       <w:pPr>
         <w:pStyle w:val="Heading2"/>
@@ -2167,8 +2167,8 @@
         <w:t xml:space="preserve">, anche per chi non vede il ticket: lo decide il server. Se il sistema di ticketing non risponde, la conferma non è possibile (si preferisce fermarsi piuttosto che confermare alla cieca).</w:t>
       </w:r>
     </w:p>
-    <w:bookmarkEnd w:id="21"/>
-    <w:bookmarkStart w:id="22" w:name="riepilogo-per-gruppo-staging"/>
+    <w:bookmarkEnd w:id="30"/>
+    <w:bookmarkStart w:id="31" w:name="riepilogo-per-gruppo-staging"/>
     <w:p>
       <w:pPr>
         <w:pStyle w:val="Heading2"/>
@@ -2402,9 +2402,9 @@
         <w:t xml:space="preserve">può confermare anche con ticket aperti (paragrafo 7).</w:t>
       </w:r>
     </w:p>
-    <w:bookmarkEnd w:id="22"/>
-    <w:bookmarkEnd w:id="23"/>
-    <w:bookmarkStart w:id="24" w:name="il-blocco-della-conferma-e-la-deroga"/>
+    <w:bookmarkEnd w:id="31"/>
+    <w:bookmarkEnd w:id="32"/>
+    <w:bookmarkStart w:id="33" w:name="il-blocco-della-conferma-e-la-deroga"/>
     <w:p>
       <w:pPr>
         <w:pStyle w:val="Heading1"/>
@@ -2448,10 +2448,39 @@
           <w:b/>
           <w:bCs/>
         </w:rPr>
-        <w:t xml:space="preserve">vedono solo i gruppi che hanno il diritto di conferma</w:t>
-      </w:r>
-      <w:r>
-        <w:t xml:space="preserve">: per gli altri gruppi non compare affatto (nemmeno grigio), e non vedono neppure l’avviso di conferma bloccata. Per chi lo vede, è</w:t>
+        <w:t xml:space="preserve">vedono tutti</w:t>
+      </w:r>
+      <w:r>
+        <w:t xml:space="preserve">, ma può usarlo</w:t>
+      </w:r>
+      <w:r>
+        <w:t xml:space="preserve"> </w:t>
+      </w:r>
+      <w:r>
+        <w:rPr>
+          <w:b/>
+          <w:bCs/>
+        </w:rPr>
+        <w:t xml:space="preserve">solo chi ha il diritto di conferma</w:t>
+      </w:r>
+      <w:r>
+        <w:t xml:space="preserve">: per gli altri è</w:t>
+      </w:r>
+      <w:r>
+        <w:t xml:space="preserve"> </w:t>
+      </w:r>
+      <w:r>
+        <w:rPr>
+          <w:b/>
+          <w:bCs/>
+        </w:rPr>
+        <w:t xml:space="preserve">disabilitato</w:t>
+      </w:r>
+      <w:r>
+        <w:t xml:space="preserve"> </w:t>
+      </w:r>
+      <w:r>
+        <w:t xml:space="preserve">e il motivo compare passando il mouse («Il tuo gruppo non può confermare le CRF»); non vedono l’avviso di conferma bloccata. Per chi ha il diritto, è</w:t>
       </w:r>
       <w:r>
         <w:t xml:space="preserve"> </w:t>
@@ -2618,8 +2647,8 @@
         <w:t xml:space="preserve">di CRF già completate (queste ultime richiedono il diritto di conferma).</w:t>
       </w:r>
     </w:p>
-    <w:bookmarkEnd w:id="24"/>
-    <w:bookmarkStart w:id="25" w:name="esempi-provati-su-staging"/>
+    <w:bookmarkEnd w:id="33"/>
+    <w:bookmarkStart w:id="34" w:name="esempi-provati-su-staging"/>
     <w:p>
       <w:pPr>
         <w:pStyle w:val="Heading1"/>
@@ -2700,8 +2729,8 @@
         <w:t xml:space="preserve">Un utente di Farmacovigilanza non vede un ticket assegnato a Sperimentatori (anche se vede lo stesso paziente) e non può rispondere. Vede però che la conferma della CRF è bloccata da un ticket aperto.</w:t>
       </w:r>
     </w:p>
-    <w:bookmarkEnd w:id="25"/>
-    <w:bookmarkStart w:id="26" w:name="le-schermate"/>
+    <w:bookmarkEnd w:id="34"/>
+    <w:bookmarkStart w:id="35" w:name="le-schermate"/>
     <w:p>
       <w:pPr>
         <w:pStyle w:val="Heading1"/>
@@ -3003,8 +3032,8 @@
         <w:t xml:space="preserve">Una finestra con la comunicazione più recente aperta, con scadenza, priorità ed eventuali allegati.</w:t>
       </w:r>
     </w:p>
-    <w:bookmarkEnd w:id="26"/>
-    <w:bookmarkStart w:id="27" w:name="tracciabilità-e-sicurezza"/>
+    <w:bookmarkEnd w:id="35"/>
+    <w:bookmarkStart w:id="36" w:name="tracciabilità-e-sicurezza"/>
     <w:p>
       <w:pPr>
         <w:pStyle w:val="Heading1"/>
@@ -3099,8 +3128,8 @@
         <w:t xml:space="preserve">Non è attivo un antivirus sugli allegati.</w:t>
       </w:r>
     </w:p>
-    <w:bookmarkEnd w:id="27"/>
-    <w:bookmarkStart w:id="28" w:name="X3e39e6f22f3c8c14cee439c9d9349ed4bc17387"/>
+    <w:bookmarkEnd w:id="36"/>
+    <w:bookmarkStart w:id="37" w:name="X3e39e6f22f3c8c14cee439c9d9349ed4bc17387"/>
     <w:p>
       <w:pPr>
         <w:pStyle w:val="Heading1"/>
@@ -3220,8 +3249,8 @@
         </w:tc>
       </w:tr>
     </w:tbl>
-    <w:bookmarkEnd w:id="28"/>
-    <w:bookmarkStart w:id="29" w:name="scelte-concordate-e-punti-da-ricordare"/>
+    <w:bookmarkEnd w:id="37"/>
+    <w:bookmarkStart w:id="38" w:name="scelte-concordate-e-punti-da-ricordare"/>
     <w:p>
       <w:pPr>
         <w:pStyle w:val="Heading1"/>
@@ -3432,7 +3461,7 @@
         <w:t xml:space="preserve">Restano da definire con il cliente: chi è «l’assistenza» nel messaggio di manutenzione, le modalità di revisione periodica delle deroghe, la conservazione dei ticket chiusi e l’eventuale antivirus sugli allegati.</w:t>
       </w:r>
     </w:p>
-    <w:bookmarkEnd w:id="29"/>
+    <w:bookmarkEnd w:id="38"/>
     <w:sectPr>
       <w:footnotePr>
         <w:numRestart w:val="eachSect"/>

</xml_diff>